<commit_message>
update cert and garant templates
</commit_message>
<xml_diff>
--- a/storage/app/templates/cert_template.docx
+++ b/storage/app/templates/cert_template.docx
@@ -427,23 +427,13 @@
                 <w:lang w:val="ru-RU"/>
               </w:rPr>
             </w:pPr>
-            <w:proofErr w:type="spellStart"/>
             <w:r>
               <w:rPr>
                 <w:b/>
                 <w:sz w:val="20"/>
                 <w:lang w:val="ru-RU"/>
               </w:rPr>
-              <w:t>Счетчики</w:t>
-            </w:r>
-            <w:proofErr w:type="spellEnd"/>
-            <w:r>
-              <w:rPr>
-                <w:b/>
-                <w:sz w:val="20"/>
-                <w:lang w:val="ru-RU"/>
-              </w:rPr>
-              <w:t xml:space="preserve"> холодной и горячей воды </w:t>
+              <w:t xml:space="preserve">Счетчики холодной и горячей воды </w:t>
             </w:r>
             <w:proofErr w:type="spellStart"/>
             <w:r>
@@ -1060,24 +1050,7 @@
           <w:lang w:val="ru-RU"/>
         </w:rPr>
         <w:br/>
-      </w:r>
-      <w:proofErr w:type="spellStart"/>
-      <w:r>
-        <w:rPr>
-          <w:b/>
-          <w:sz w:val="20"/>
-          <w:lang w:val="ru-RU"/>
-        </w:rPr>
-        <w:t>Счетчики</w:t>
-      </w:r>
-      <w:proofErr w:type="spellEnd"/>
-      <w:r>
-        <w:rPr>
-          <w:b/>
-          <w:sz w:val="20"/>
-          <w:lang w:val="ru-RU"/>
-        </w:rPr>
-        <w:t xml:space="preserve"> воды. Методика поверки</w:t>
+        <w:t>Счетчики воды. Методика поверки</w:t>
       </w:r>
     </w:p>
     <w:p>
@@ -2606,6 +2579,9 @@
     <w:p>
       <w:pPr>
         <w:spacing w:before="40" w:after="20"/>
+        <w:rPr>
+          <w:lang w:val="ru-RU"/>
+        </w:rPr>
       </w:pPr>
       <w:r>
         <w:rPr>
@@ -2815,24 +2791,24 @@
     <w:p>
       <w:pPr>
         <w:spacing w:before="40" w:after="20"/>
-      </w:pPr>
-    </w:p>
-    <w:p>
-      <w:pPr>
-        <w:spacing w:before="40" w:after="20"/>
-      </w:pPr>
-    </w:p>
-    <w:p>
-      <w:pPr>
-        <w:spacing w:before="40" w:after="20"/>
+        <w:rPr>
+          <w:lang w:val="ru-RU"/>
+        </w:rPr>
       </w:pPr>
     </w:p>
     <w:p>
       <w:pPr>
         <w:spacing w:before="40" w:after="20"/>
         <w:rPr>
-          <w:sz w:val="20"/>
-          <w:szCs w:val="20"/>
+          <w:lang w:val="ru-RU"/>
+        </w:rPr>
+      </w:pPr>
+    </w:p>
+    <w:p>
+      <w:pPr>
+        <w:spacing w:before="40" w:after="20"/>
+        <w:rPr>
+          <w:lang w:val="ru-RU"/>
         </w:rPr>
       </w:pPr>
     </w:p>
@@ -2845,15 +2821,33 @@
           <w:lang w:val="ru-RU"/>
         </w:rPr>
       </w:pPr>
-      <w:bookmarkStart w:id="0" w:name="_GoBack"/>
-      <w:bookmarkEnd w:id="0"/>
-      <w:r>
+    </w:p>
+    <w:p>
+      <w:pPr>
+        <w:spacing w:before="40" w:after="20"/>
         <w:rPr>
           <w:sz w:val="20"/>
           <w:szCs w:val="20"/>
           <w:lang w:val="ru-RU"/>
         </w:rPr>
-        <w:t>Данный документ не является оригиналом. Оригинал сертификата о поверке будет готов в течение 14 рабочих дней.</w:t>
+      </w:pPr>
+      <w:r>
+        <w:rPr>
+          <w:sz w:val="16"/>
+          <w:szCs w:val="20"/>
+          <w:lang w:val="ru-RU"/>
+        </w:rPr>
+        <w:t>Данный документ не я</w:t>
+      </w:r>
+      <w:bookmarkStart w:id="0" w:name="_GoBack"/>
+      <w:bookmarkEnd w:id="0"/>
+      <w:r>
+        <w:rPr>
+          <w:sz w:val="16"/>
+          <w:szCs w:val="20"/>
+          <w:lang w:val="ru-RU"/>
+        </w:rPr>
+        <w:t>вляется оригиналом. Оригинал сертификата о поверке будет готов в течение 14 рабочих дней.</w:t>
       </w:r>
     </w:p>
     <w:sectPr>
@@ -4177,6 +4171,7 @@
       <w:spacing w:after="0" w:line="240" w:lineRule="auto"/>
     </w:pPr>
     <w:tblPr>
+      <w:tblInd w:w="0" w:type="dxa"/>
       <w:tblBorders>
         <w:top w:val="single" w:sz="4" w:space="0" w:color="auto"/>
         <w:left w:val="single" w:sz="4" w:space="0" w:color="auto"/>
@@ -4185,6 +4180,12 @@
         <w:insideH w:val="single" w:sz="4" w:space="0" w:color="auto"/>
         <w:insideV w:val="single" w:sz="4" w:space="0" w:color="auto"/>
       </w:tblBorders>
+      <w:tblCellMar>
+        <w:top w:w="0" w:type="dxa"/>
+        <w:left w:w="108" w:type="dxa"/>
+        <w:bottom w:w="0" w:type="dxa"/>
+        <w:right w:w="108" w:type="dxa"/>
+      </w:tblCellMar>
     </w:tblPr>
   </w:style>
   <w:style w:type="table" w:styleId="aff1">
@@ -4201,10 +4202,17 @@
     <w:tblPr>
       <w:tblStyleRowBandSize w:val="1"/>
       <w:tblStyleColBandSize w:val="1"/>
+      <w:tblInd w:w="0" w:type="dxa"/>
       <w:tblBorders>
         <w:top w:val="single" w:sz="8" w:space="0" w:color="000000" w:themeColor="text1"/>
         <w:bottom w:val="single" w:sz="8" w:space="0" w:color="000000" w:themeColor="text1"/>
       </w:tblBorders>
+      <w:tblCellMar>
+        <w:top w:w="0" w:type="dxa"/>
+        <w:left w:w="108" w:type="dxa"/>
+        <w:bottom w:w="0" w:type="dxa"/>
+        <w:right w:w="108" w:type="dxa"/>
+      </w:tblCellMar>
     </w:tblPr>
     <w:tblStylePr w:type="firstRow">
       <w:pPr>
@@ -4297,10 +4305,17 @@
     <w:tblPr>
       <w:tblStyleRowBandSize w:val="1"/>
       <w:tblStyleColBandSize w:val="1"/>
+      <w:tblInd w:w="0" w:type="dxa"/>
       <w:tblBorders>
         <w:top w:val="single" w:sz="8" w:space="0" w:color="4F81BD" w:themeColor="accent1"/>
         <w:bottom w:val="single" w:sz="8" w:space="0" w:color="4F81BD" w:themeColor="accent1"/>
       </w:tblBorders>
+      <w:tblCellMar>
+        <w:top w:w="0" w:type="dxa"/>
+        <w:left w:w="108" w:type="dxa"/>
+        <w:bottom w:w="0" w:type="dxa"/>
+        <w:right w:w="108" w:type="dxa"/>
+      </w:tblCellMar>
     </w:tblPr>
     <w:tblStylePr w:type="firstRow">
       <w:pPr>
@@ -4393,10 +4408,17 @@
     <w:tblPr>
       <w:tblStyleRowBandSize w:val="1"/>
       <w:tblStyleColBandSize w:val="1"/>
+      <w:tblInd w:w="0" w:type="dxa"/>
       <w:tblBorders>
         <w:top w:val="single" w:sz="8" w:space="0" w:color="C0504D" w:themeColor="accent2"/>
         <w:bottom w:val="single" w:sz="8" w:space="0" w:color="C0504D" w:themeColor="accent2"/>
       </w:tblBorders>
+      <w:tblCellMar>
+        <w:top w:w="0" w:type="dxa"/>
+        <w:left w:w="108" w:type="dxa"/>
+        <w:bottom w:w="0" w:type="dxa"/>
+        <w:right w:w="108" w:type="dxa"/>
+      </w:tblCellMar>
     </w:tblPr>
     <w:tblStylePr w:type="firstRow">
       <w:pPr>
@@ -4489,10 +4511,17 @@
     <w:tblPr>
       <w:tblStyleRowBandSize w:val="1"/>
       <w:tblStyleColBandSize w:val="1"/>
+      <w:tblInd w:w="0" w:type="dxa"/>
       <w:tblBorders>
         <w:top w:val="single" w:sz="8" w:space="0" w:color="9BBB59" w:themeColor="accent3"/>
         <w:bottom w:val="single" w:sz="8" w:space="0" w:color="9BBB59" w:themeColor="accent3"/>
       </w:tblBorders>
+      <w:tblCellMar>
+        <w:top w:w="0" w:type="dxa"/>
+        <w:left w:w="108" w:type="dxa"/>
+        <w:bottom w:w="0" w:type="dxa"/>
+        <w:right w:w="108" w:type="dxa"/>
+      </w:tblCellMar>
     </w:tblPr>
     <w:tblStylePr w:type="firstRow">
       <w:pPr>
@@ -4585,10 +4614,17 @@
     <w:tblPr>
       <w:tblStyleRowBandSize w:val="1"/>
       <w:tblStyleColBandSize w:val="1"/>
+      <w:tblInd w:w="0" w:type="dxa"/>
       <w:tblBorders>
         <w:top w:val="single" w:sz="8" w:space="0" w:color="8064A2" w:themeColor="accent4"/>
         <w:bottom w:val="single" w:sz="8" w:space="0" w:color="8064A2" w:themeColor="accent4"/>
       </w:tblBorders>
+      <w:tblCellMar>
+        <w:top w:w="0" w:type="dxa"/>
+        <w:left w:w="108" w:type="dxa"/>
+        <w:bottom w:w="0" w:type="dxa"/>
+        <w:right w:w="108" w:type="dxa"/>
+      </w:tblCellMar>
     </w:tblPr>
     <w:tblStylePr w:type="firstRow">
       <w:pPr>
@@ -4681,10 +4717,17 @@
     <w:tblPr>
       <w:tblStyleRowBandSize w:val="1"/>
       <w:tblStyleColBandSize w:val="1"/>
+      <w:tblInd w:w="0" w:type="dxa"/>
       <w:tblBorders>
         <w:top w:val="single" w:sz="8" w:space="0" w:color="4BACC6" w:themeColor="accent5"/>
         <w:bottom w:val="single" w:sz="8" w:space="0" w:color="4BACC6" w:themeColor="accent5"/>
       </w:tblBorders>
+      <w:tblCellMar>
+        <w:top w:w="0" w:type="dxa"/>
+        <w:left w:w="108" w:type="dxa"/>
+        <w:bottom w:w="0" w:type="dxa"/>
+        <w:right w:w="108" w:type="dxa"/>
+      </w:tblCellMar>
     </w:tblPr>
     <w:tblStylePr w:type="firstRow">
       <w:pPr>
@@ -4777,10 +4820,17 @@
     <w:tblPr>
       <w:tblStyleRowBandSize w:val="1"/>
       <w:tblStyleColBandSize w:val="1"/>
+      <w:tblInd w:w="0" w:type="dxa"/>
       <w:tblBorders>
         <w:top w:val="single" w:sz="8" w:space="0" w:color="F79646" w:themeColor="accent6"/>
         <w:bottom w:val="single" w:sz="8" w:space="0" w:color="F79646" w:themeColor="accent6"/>
       </w:tblBorders>
+      <w:tblCellMar>
+        <w:top w:w="0" w:type="dxa"/>
+        <w:left w:w="108" w:type="dxa"/>
+        <w:bottom w:w="0" w:type="dxa"/>
+        <w:right w:w="108" w:type="dxa"/>
+      </w:tblCellMar>
     </w:tblPr>
     <w:tblStylePr w:type="firstRow">
       <w:pPr>
@@ -4870,12 +4920,19 @@
     <w:tblPr>
       <w:tblStyleRowBandSize w:val="1"/>
       <w:tblStyleColBandSize w:val="1"/>
+      <w:tblInd w:w="0" w:type="dxa"/>
       <w:tblBorders>
         <w:top w:val="single" w:sz="8" w:space="0" w:color="000000" w:themeColor="text1"/>
         <w:left w:val="single" w:sz="8" w:space="0" w:color="000000" w:themeColor="text1"/>
         <w:bottom w:val="single" w:sz="8" w:space="0" w:color="000000" w:themeColor="text1"/>
         <w:right w:val="single" w:sz="8" w:space="0" w:color="000000" w:themeColor="text1"/>
       </w:tblBorders>
+      <w:tblCellMar>
+        <w:top w:w="0" w:type="dxa"/>
+        <w:left w:w="108" w:type="dxa"/>
+        <w:bottom w:w="0" w:type="dxa"/>
+        <w:right w:w="108" w:type="dxa"/>
+      </w:tblCellMar>
     </w:tblPr>
     <w:tblStylePr w:type="firstRow">
       <w:pPr>
@@ -4955,12 +5012,19 @@
     <w:tblPr>
       <w:tblStyleRowBandSize w:val="1"/>
       <w:tblStyleColBandSize w:val="1"/>
+      <w:tblInd w:w="0" w:type="dxa"/>
       <w:tblBorders>
         <w:top w:val="single" w:sz="8" w:space="0" w:color="4F81BD" w:themeColor="accent1"/>
         <w:left w:val="single" w:sz="8" w:space="0" w:color="4F81BD" w:themeColor="accent1"/>
         <w:bottom w:val="single" w:sz="8" w:space="0" w:color="4F81BD" w:themeColor="accent1"/>
         <w:right w:val="single" w:sz="8" w:space="0" w:color="4F81BD" w:themeColor="accent1"/>
       </w:tblBorders>
+      <w:tblCellMar>
+        <w:top w:w="0" w:type="dxa"/>
+        <w:left w:w="108" w:type="dxa"/>
+        <w:bottom w:w="0" w:type="dxa"/>
+        <w:right w:w="108" w:type="dxa"/>
+      </w:tblCellMar>
     </w:tblPr>
     <w:tblStylePr w:type="firstRow">
       <w:pPr>
@@ -5040,12 +5104,19 @@
     <w:tblPr>
       <w:tblStyleRowBandSize w:val="1"/>
       <w:tblStyleColBandSize w:val="1"/>
+      <w:tblInd w:w="0" w:type="dxa"/>
       <w:tblBorders>
         <w:top w:val="single" w:sz="8" w:space="0" w:color="C0504D" w:themeColor="accent2"/>
         <w:left w:val="single" w:sz="8" w:space="0" w:color="C0504D" w:themeColor="accent2"/>
         <w:bottom w:val="single" w:sz="8" w:space="0" w:color="C0504D" w:themeColor="accent2"/>
         <w:right w:val="single" w:sz="8" w:space="0" w:color="C0504D" w:themeColor="accent2"/>
       </w:tblBorders>
+      <w:tblCellMar>
+        <w:top w:w="0" w:type="dxa"/>
+        <w:left w:w="108" w:type="dxa"/>
+        <w:bottom w:w="0" w:type="dxa"/>
+        <w:right w:w="108" w:type="dxa"/>
+      </w:tblCellMar>
     </w:tblPr>
     <w:tblStylePr w:type="firstRow">
       <w:pPr>
@@ -5125,12 +5196,19 @@
     <w:tblPr>
       <w:tblStyleRowBandSize w:val="1"/>
       <w:tblStyleColBandSize w:val="1"/>
+      <w:tblInd w:w="0" w:type="dxa"/>
       <w:tblBorders>
         <w:top w:val="single" w:sz="8" w:space="0" w:color="9BBB59" w:themeColor="accent3"/>
         <w:left w:val="single" w:sz="8" w:space="0" w:color="9BBB59" w:themeColor="accent3"/>
         <w:bottom w:val="single" w:sz="8" w:space="0" w:color="9BBB59" w:themeColor="accent3"/>
         <w:right w:val="single" w:sz="8" w:space="0" w:color="9BBB59" w:themeColor="accent3"/>
       </w:tblBorders>
+      <w:tblCellMar>
+        <w:top w:w="0" w:type="dxa"/>
+        <w:left w:w="108" w:type="dxa"/>
+        <w:bottom w:w="0" w:type="dxa"/>
+        <w:right w:w="108" w:type="dxa"/>
+      </w:tblCellMar>
     </w:tblPr>
     <w:tblStylePr w:type="firstRow">
       <w:pPr>
@@ -5210,12 +5288,19 @@
     <w:tblPr>
       <w:tblStyleRowBandSize w:val="1"/>
       <w:tblStyleColBandSize w:val="1"/>
+      <w:tblInd w:w="0" w:type="dxa"/>
       <w:tblBorders>
         <w:top w:val="single" w:sz="8" w:space="0" w:color="8064A2" w:themeColor="accent4"/>
         <w:left w:val="single" w:sz="8" w:space="0" w:color="8064A2" w:themeColor="accent4"/>
         <w:bottom w:val="single" w:sz="8" w:space="0" w:color="8064A2" w:themeColor="accent4"/>
         <w:right w:val="single" w:sz="8" w:space="0" w:color="8064A2" w:themeColor="accent4"/>
       </w:tblBorders>
+      <w:tblCellMar>
+        <w:top w:w="0" w:type="dxa"/>
+        <w:left w:w="108" w:type="dxa"/>
+        <w:bottom w:w="0" w:type="dxa"/>
+        <w:right w:w="108" w:type="dxa"/>
+      </w:tblCellMar>
     </w:tblPr>
     <w:tblStylePr w:type="firstRow">
       <w:pPr>
@@ -5295,12 +5380,19 @@
     <w:tblPr>
       <w:tblStyleRowBandSize w:val="1"/>
       <w:tblStyleColBandSize w:val="1"/>
+      <w:tblInd w:w="0" w:type="dxa"/>
       <w:tblBorders>
         <w:top w:val="single" w:sz="8" w:space="0" w:color="4BACC6" w:themeColor="accent5"/>
         <w:left w:val="single" w:sz="8" w:space="0" w:color="4BACC6" w:themeColor="accent5"/>
         <w:bottom w:val="single" w:sz="8" w:space="0" w:color="4BACC6" w:themeColor="accent5"/>
         <w:right w:val="single" w:sz="8" w:space="0" w:color="4BACC6" w:themeColor="accent5"/>
       </w:tblBorders>
+      <w:tblCellMar>
+        <w:top w:w="0" w:type="dxa"/>
+        <w:left w:w="108" w:type="dxa"/>
+        <w:bottom w:w="0" w:type="dxa"/>
+        <w:right w:w="108" w:type="dxa"/>
+      </w:tblCellMar>
     </w:tblPr>
     <w:tblStylePr w:type="firstRow">
       <w:pPr>
@@ -5380,12 +5472,19 @@
     <w:tblPr>
       <w:tblStyleRowBandSize w:val="1"/>
       <w:tblStyleColBandSize w:val="1"/>
+      <w:tblInd w:w="0" w:type="dxa"/>
       <w:tblBorders>
         <w:top w:val="single" w:sz="8" w:space="0" w:color="F79646" w:themeColor="accent6"/>
         <w:left w:val="single" w:sz="8" w:space="0" w:color="F79646" w:themeColor="accent6"/>
         <w:bottom w:val="single" w:sz="8" w:space="0" w:color="F79646" w:themeColor="accent6"/>
         <w:right w:val="single" w:sz="8" w:space="0" w:color="F79646" w:themeColor="accent6"/>
       </w:tblBorders>
+      <w:tblCellMar>
+        <w:top w:w="0" w:type="dxa"/>
+        <w:left w:w="108" w:type="dxa"/>
+        <w:bottom w:w="0" w:type="dxa"/>
+        <w:right w:w="108" w:type="dxa"/>
+      </w:tblCellMar>
     </w:tblPr>
     <w:tblStylePr w:type="firstRow">
       <w:pPr>
@@ -5465,6 +5564,7 @@
     <w:tblPr>
       <w:tblStyleRowBandSize w:val="1"/>
       <w:tblStyleColBandSize w:val="1"/>
+      <w:tblInd w:w="0" w:type="dxa"/>
       <w:tblBorders>
         <w:top w:val="single" w:sz="8" w:space="0" w:color="000000" w:themeColor="text1"/>
         <w:left w:val="single" w:sz="8" w:space="0" w:color="000000" w:themeColor="text1"/>
@@ -5473,6 +5573,12 @@
         <w:insideH w:val="single" w:sz="8" w:space="0" w:color="000000" w:themeColor="text1"/>
         <w:insideV w:val="single" w:sz="8" w:space="0" w:color="000000" w:themeColor="text1"/>
       </w:tblBorders>
+      <w:tblCellMar>
+        <w:top w:w="0" w:type="dxa"/>
+        <w:left w:w="108" w:type="dxa"/>
+        <w:bottom w:w="0" w:type="dxa"/>
+        <w:right w:w="108" w:type="dxa"/>
+      </w:tblCellMar>
     </w:tblPr>
     <w:tblStylePr w:type="firstRow">
       <w:pPr>
@@ -5588,6 +5694,7 @@
     <w:tblPr>
       <w:tblStyleRowBandSize w:val="1"/>
       <w:tblStyleColBandSize w:val="1"/>
+      <w:tblInd w:w="0" w:type="dxa"/>
       <w:tblBorders>
         <w:top w:val="single" w:sz="8" w:space="0" w:color="4F81BD" w:themeColor="accent1"/>
         <w:left w:val="single" w:sz="8" w:space="0" w:color="4F81BD" w:themeColor="accent1"/>
@@ -5596,6 +5703,12 @@
         <w:insideH w:val="single" w:sz="8" w:space="0" w:color="4F81BD" w:themeColor="accent1"/>
         <w:insideV w:val="single" w:sz="8" w:space="0" w:color="4F81BD" w:themeColor="accent1"/>
       </w:tblBorders>
+      <w:tblCellMar>
+        <w:top w:w="0" w:type="dxa"/>
+        <w:left w:w="108" w:type="dxa"/>
+        <w:bottom w:w="0" w:type="dxa"/>
+        <w:right w:w="108" w:type="dxa"/>
+      </w:tblCellMar>
     </w:tblPr>
     <w:tblStylePr w:type="firstRow">
       <w:pPr>
@@ -5711,6 +5824,7 @@
     <w:tblPr>
       <w:tblStyleRowBandSize w:val="1"/>
       <w:tblStyleColBandSize w:val="1"/>
+      <w:tblInd w:w="0" w:type="dxa"/>
       <w:tblBorders>
         <w:top w:val="single" w:sz="8" w:space="0" w:color="C0504D" w:themeColor="accent2"/>
         <w:left w:val="single" w:sz="8" w:space="0" w:color="C0504D" w:themeColor="accent2"/>
@@ -5719,6 +5833,12 @@
         <w:insideH w:val="single" w:sz="8" w:space="0" w:color="C0504D" w:themeColor="accent2"/>
         <w:insideV w:val="single" w:sz="8" w:space="0" w:color="C0504D" w:themeColor="accent2"/>
       </w:tblBorders>
+      <w:tblCellMar>
+        <w:top w:w="0" w:type="dxa"/>
+        <w:left w:w="108" w:type="dxa"/>
+        <w:bottom w:w="0" w:type="dxa"/>
+        <w:right w:w="108" w:type="dxa"/>
+      </w:tblCellMar>
     </w:tblPr>
     <w:tblStylePr w:type="firstRow">
       <w:pPr>
@@ -5834,6 +5954,7 @@
     <w:tblPr>
       <w:tblStyleRowBandSize w:val="1"/>
       <w:tblStyleColBandSize w:val="1"/>
+      <w:tblInd w:w="0" w:type="dxa"/>
       <w:tblBorders>
         <w:top w:val="single" w:sz="8" w:space="0" w:color="9BBB59" w:themeColor="accent3"/>
         <w:left w:val="single" w:sz="8" w:space="0" w:color="9BBB59" w:themeColor="accent3"/>
@@ -5842,6 +5963,12 @@
         <w:insideH w:val="single" w:sz="8" w:space="0" w:color="9BBB59" w:themeColor="accent3"/>
         <w:insideV w:val="single" w:sz="8" w:space="0" w:color="9BBB59" w:themeColor="accent3"/>
       </w:tblBorders>
+      <w:tblCellMar>
+        <w:top w:w="0" w:type="dxa"/>
+        <w:left w:w="108" w:type="dxa"/>
+        <w:bottom w:w="0" w:type="dxa"/>
+        <w:right w:w="108" w:type="dxa"/>
+      </w:tblCellMar>
     </w:tblPr>
     <w:tblStylePr w:type="firstRow">
       <w:pPr>
@@ -5957,6 +6084,7 @@
     <w:tblPr>
       <w:tblStyleRowBandSize w:val="1"/>
       <w:tblStyleColBandSize w:val="1"/>
+      <w:tblInd w:w="0" w:type="dxa"/>
       <w:tblBorders>
         <w:top w:val="single" w:sz="8" w:space="0" w:color="8064A2" w:themeColor="accent4"/>
         <w:left w:val="single" w:sz="8" w:space="0" w:color="8064A2" w:themeColor="accent4"/>
@@ -5965,6 +6093,12 @@
         <w:insideH w:val="single" w:sz="8" w:space="0" w:color="8064A2" w:themeColor="accent4"/>
         <w:insideV w:val="single" w:sz="8" w:space="0" w:color="8064A2" w:themeColor="accent4"/>
       </w:tblBorders>
+      <w:tblCellMar>
+        <w:top w:w="0" w:type="dxa"/>
+        <w:left w:w="108" w:type="dxa"/>
+        <w:bottom w:w="0" w:type="dxa"/>
+        <w:right w:w="108" w:type="dxa"/>
+      </w:tblCellMar>
     </w:tblPr>
     <w:tblStylePr w:type="firstRow">
       <w:pPr>
@@ -6080,6 +6214,7 @@
     <w:tblPr>
       <w:tblStyleRowBandSize w:val="1"/>
       <w:tblStyleColBandSize w:val="1"/>
+      <w:tblInd w:w="0" w:type="dxa"/>
       <w:tblBorders>
         <w:top w:val="single" w:sz="8" w:space="0" w:color="4BACC6" w:themeColor="accent5"/>
         <w:left w:val="single" w:sz="8" w:space="0" w:color="4BACC6" w:themeColor="accent5"/>
@@ -6088,6 +6223,12 @@
         <w:insideH w:val="single" w:sz="8" w:space="0" w:color="4BACC6" w:themeColor="accent5"/>
         <w:insideV w:val="single" w:sz="8" w:space="0" w:color="4BACC6" w:themeColor="accent5"/>
       </w:tblBorders>
+      <w:tblCellMar>
+        <w:top w:w="0" w:type="dxa"/>
+        <w:left w:w="108" w:type="dxa"/>
+        <w:bottom w:w="0" w:type="dxa"/>
+        <w:right w:w="108" w:type="dxa"/>
+      </w:tblCellMar>
     </w:tblPr>
     <w:tblStylePr w:type="firstRow">
       <w:pPr>
@@ -6203,6 +6344,7 @@
     <w:tblPr>
       <w:tblStyleRowBandSize w:val="1"/>
       <w:tblStyleColBandSize w:val="1"/>
+      <w:tblInd w:w="0" w:type="dxa"/>
       <w:tblBorders>
         <w:top w:val="single" w:sz="8" w:space="0" w:color="F79646" w:themeColor="accent6"/>
         <w:left w:val="single" w:sz="8" w:space="0" w:color="F79646" w:themeColor="accent6"/>
@@ -6211,6 +6353,12 @@
         <w:insideH w:val="single" w:sz="8" w:space="0" w:color="F79646" w:themeColor="accent6"/>
         <w:insideV w:val="single" w:sz="8" w:space="0" w:color="F79646" w:themeColor="accent6"/>
       </w:tblBorders>
+      <w:tblCellMar>
+        <w:top w:w="0" w:type="dxa"/>
+        <w:left w:w="108" w:type="dxa"/>
+        <w:bottom w:w="0" w:type="dxa"/>
+        <w:right w:w="108" w:type="dxa"/>
+      </w:tblCellMar>
     </w:tblPr>
     <w:tblStylePr w:type="firstRow">
       <w:pPr>
@@ -6326,6 +6474,7 @@
     <w:tblPr>
       <w:tblStyleRowBandSize w:val="1"/>
       <w:tblStyleColBandSize w:val="1"/>
+      <w:tblInd w:w="0" w:type="dxa"/>
       <w:tblBorders>
         <w:top w:val="single" w:sz="8" w:space="0" w:color="404040" w:themeColor="text1" w:themeTint="BF"/>
         <w:left w:val="single" w:sz="8" w:space="0" w:color="404040" w:themeColor="text1" w:themeTint="BF"/>
@@ -6333,6 +6482,12 @@
         <w:right w:val="single" w:sz="8" w:space="0" w:color="404040" w:themeColor="text1" w:themeTint="BF"/>
         <w:insideH w:val="single" w:sz="8" w:space="0" w:color="404040" w:themeColor="text1" w:themeTint="BF"/>
       </w:tblBorders>
+      <w:tblCellMar>
+        <w:top w:w="0" w:type="dxa"/>
+        <w:left w:w="108" w:type="dxa"/>
+        <w:bottom w:w="0" w:type="dxa"/>
+        <w:right w:w="108" w:type="dxa"/>
+      </w:tblCellMar>
     </w:tblPr>
     <w:tblStylePr w:type="firstRow">
       <w:pPr>
@@ -6425,6 +6580,7 @@
     <w:tblPr>
       <w:tblStyleRowBandSize w:val="1"/>
       <w:tblStyleColBandSize w:val="1"/>
+      <w:tblInd w:w="0" w:type="dxa"/>
       <w:tblBorders>
         <w:top w:val="single" w:sz="8" w:space="0" w:color="7BA0CD" w:themeColor="accent1" w:themeTint="BF"/>
         <w:left w:val="single" w:sz="8" w:space="0" w:color="7BA0CD" w:themeColor="accent1" w:themeTint="BF"/>
@@ -6432,6 +6588,12 @@
         <w:right w:val="single" w:sz="8" w:space="0" w:color="7BA0CD" w:themeColor="accent1" w:themeTint="BF"/>
         <w:insideH w:val="single" w:sz="8" w:space="0" w:color="7BA0CD" w:themeColor="accent1" w:themeTint="BF"/>
       </w:tblBorders>
+      <w:tblCellMar>
+        <w:top w:w="0" w:type="dxa"/>
+        <w:left w:w="108" w:type="dxa"/>
+        <w:bottom w:w="0" w:type="dxa"/>
+        <w:right w:w="108" w:type="dxa"/>
+      </w:tblCellMar>
     </w:tblPr>
     <w:tblStylePr w:type="firstRow">
       <w:pPr>
@@ -6524,6 +6686,7 @@
     <w:tblPr>
       <w:tblStyleRowBandSize w:val="1"/>
       <w:tblStyleColBandSize w:val="1"/>
+      <w:tblInd w:w="0" w:type="dxa"/>
       <w:tblBorders>
         <w:top w:val="single" w:sz="8" w:space="0" w:color="CF7B79" w:themeColor="accent2" w:themeTint="BF"/>
         <w:left w:val="single" w:sz="8" w:space="0" w:color="CF7B79" w:themeColor="accent2" w:themeTint="BF"/>
@@ -6531,6 +6694,12 @@
         <w:right w:val="single" w:sz="8" w:space="0" w:color="CF7B79" w:themeColor="accent2" w:themeTint="BF"/>
         <w:insideH w:val="single" w:sz="8" w:space="0" w:color="CF7B79" w:themeColor="accent2" w:themeTint="BF"/>
       </w:tblBorders>
+      <w:tblCellMar>
+        <w:top w:w="0" w:type="dxa"/>
+        <w:left w:w="108" w:type="dxa"/>
+        <w:bottom w:w="0" w:type="dxa"/>
+        <w:right w:w="108" w:type="dxa"/>
+      </w:tblCellMar>
     </w:tblPr>
     <w:tblStylePr w:type="firstRow">
       <w:pPr>
@@ -6623,6 +6792,7 @@
     <w:tblPr>
       <w:tblStyleRowBandSize w:val="1"/>
       <w:tblStyleColBandSize w:val="1"/>
+      <w:tblInd w:w="0" w:type="dxa"/>
       <w:tblBorders>
         <w:top w:val="single" w:sz="8" w:space="0" w:color="B3CC82" w:themeColor="accent3" w:themeTint="BF"/>
         <w:left w:val="single" w:sz="8" w:space="0" w:color="B3CC82" w:themeColor="accent3" w:themeTint="BF"/>
@@ -6630,6 +6800,12 @@
         <w:right w:val="single" w:sz="8" w:space="0" w:color="B3CC82" w:themeColor="accent3" w:themeTint="BF"/>
         <w:insideH w:val="single" w:sz="8" w:space="0" w:color="B3CC82" w:themeColor="accent3" w:themeTint="BF"/>
       </w:tblBorders>
+      <w:tblCellMar>
+        <w:top w:w="0" w:type="dxa"/>
+        <w:left w:w="108" w:type="dxa"/>
+        <w:bottom w:w="0" w:type="dxa"/>
+        <w:right w:w="108" w:type="dxa"/>
+      </w:tblCellMar>
     </w:tblPr>
     <w:tblStylePr w:type="firstRow">
       <w:pPr>
@@ -6722,6 +6898,7 @@
     <w:tblPr>
       <w:tblStyleRowBandSize w:val="1"/>
       <w:tblStyleColBandSize w:val="1"/>
+      <w:tblInd w:w="0" w:type="dxa"/>
       <w:tblBorders>
         <w:top w:val="single" w:sz="8" w:space="0" w:color="9F8AB9" w:themeColor="accent4" w:themeTint="BF"/>
         <w:left w:val="single" w:sz="8" w:space="0" w:color="9F8AB9" w:themeColor="accent4" w:themeTint="BF"/>
@@ -6729,6 +6906,12 @@
         <w:right w:val="single" w:sz="8" w:space="0" w:color="9F8AB9" w:themeColor="accent4" w:themeTint="BF"/>
         <w:insideH w:val="single" w:sz="8" w:space="0" w:color="9F8AB9" w:themeColor="accent4" w:themeTint="BF"/>
       </w:tblBorders>
+      <w:tblCellMar>
+        <w:top w:w="0" w:type="dxa"/>
+        <w:left w:w="108" w:type="dxa"/>
+        <w:bottom w:w="0" w:type="dxa"/>
+        <w:right w:w="108" w:type="dxa"/>
+      </w:tblCellMar>
     </w:tblPr>
     <w:tblStylePr w:type="firstRow">
       <w:pPr>
@@ -6821,6 +7004,7 @@
     <w:tblPr>
       <w:tblStyleRowBandSize w:val="1"/>
       <w:tblStyleColBandSize w:val="1"/>
+      <w:tblInd w:w="0" w:type="dxa"/>
       <w:tblBorders>
         <w:top w:val="single" w:sz="8" w:space="0" w:color="78C0D4" w:themeColor="accent5" w:themeTint="BF"/>
         <w:left w:val="single" w:sz="8" w:space="0" w:color="78C0D4" w:themeColor="accent5" w:themeTint="BF"/>
@@ -6828,6 +7012,12 @@
         <w:right w:val="single" w:sz="8" w:space="0" w:color="78C0D4" w:themeColor="accent5" w:themeTint="BF"/>
         <w:insideH w:val="single" w:sz="8" w:space="0" w:color="78C0D4" w:themeColor="accent5" w:themeTint="BF"/>
       </w:tblBorders>
+      <w:tblCellMar>
+        <w:top w:w="0" w:type="dxa"/>
+        <w:left w:w="108" w:type="dxa"/>
+        <w:bottom w:w="0" w:type="dxa"/>
+        <w:right w:w="108" w:type="dxa"/>
+      </w:tblCellMar>
     </w:tblPr>
     <w:tblStylePr w:type="firstRow">
       <w:pPr>
@@ -6920,6 +7110,7 @@
     <w:tblPr>
       <w:tblStyleRowBandSize w:val="1"/>
       <w:tblStyleColBandSize w:val="1"/>
+      <w:tblInd w:w="0" w:type="dxa"/>
       <w:tblBorders>
         <w:top w:val="single" w:sz="8" w:space="0" w:color="F9B074" w:themeColor="accent6" w:themeTint="BF"/>
         <w:left w:val="single" w:sz="8" w:space="0" w:color="F9B074" w:themeColor="accent6" w:themeTint="BF"/>
@@ -6927,6 +7118,12 @@
         <w:right w:val="single" w:sz="8" w:space="0" w:color="F9B074" w:themeColor="accent6" w:themeTint="BF"/>
         <w:insideH w:val="single" w:sz="8" w:space="0" w:color="F9B074" w:themeColor="accent6" w:themeTint="BF"/>
       </w:tblBorders>
+      <w:tblCellMar>
+        <w:top w:w="0" w:type="dxa"/>
+        <w:left w:w="108" w:type="dxa"/>
+        <w:bottom w:w="0" w:type="dxa"/>
+        <w:right w:w="108" w:type="dxa"/>
+      </w:tblCellMar>
     </w:tblPr>
     <w:tblStylePr w:type="firstRow">
       <w:pPr>
@@ -7019,10 +7216,17 @@
     <w:tblPr>
       <w:tblStyleRowBandSize w:val="1"/>
       <w:tblStyleColBandSize w:val="1"/>
+      <w:tblInd w:w="0" w:type="dxa"/>
       <w:tblBorders>
         <w:top w:val="single" w:sz="18" w:space="0" w:color="auto"/>
         <w:bottom w:val="single" w:sz="18" w:space="0" w:color="auto"/>
       </w:tblBorders>
+      <w:tblCellMar>
+        <w:top w:w="0" w:type="dxa"/>
+        <w:left w:w="108" w:type="dxa"/>
+        <w:bottom w:w="0" w:type="dxa"/>
+        <w:right w:w="108" w:type="dxa"/>
+      </w:tblCellMar>
     </w:tblPr>
     <w:tblStylePr w:type="firstRow">
       <w:pPr>
@@ -7161,10 +7365,17 @@
     <w:tblPr>
       <w:tblStyleRowBandSize w:val="1"/>
       <w:tblStyleColBandSize w:val="1"/>
+      <w:tblInd w:w="0" w:type="dxa"/>
       <w:tblBorders>
         <w:top w:val="single" w:sz="18" w:space="0" w:color="auto"/>
         <w:bottom w:val="single" w:sz="18" w:space="0" w:color="auto"/>
       </w:tblBorders>
+      <w:tblCellMar>
+        <w:top w:w="0" w:type="dxa"/>
+        <w:left w:w="108" w:type="dxa"/>
+        <w:bottom w:w="0" w:type="dxa"/>
+        <w:right w:w="108" w:type="dxa"/>
+      </w:tblCellMar>
     </w:tblPr>
     <w:tblStylePr w:type="firstRow">
       <w:pPr>
@@ -7303,10 +7514,17 @@
     <w:tblPr>
       <w:tblStyleRowBandSize w:val="1"/>
       <w:tblStyleColBandSize w:val="1"/>
+      <w:tblInd w:w="0" w:type="dxa"/>
       <w:tblBorders>
         <w:top w:val="single" w:sz="18" w:space="0" w:color="auto"/>
         <w:bottom w:val="single" w:sz="18" w:space="0" w:color="auto"/>
       </w:tblBorders>
+      <w:tblCellMar>
+        <w:top w:w="0" w:type="dxa"/>
+        <w:left w:w="108" w:type="dxa"/>
+        <w:bottom w:w="0" w:type="dxa"/>
+        <w:right w:w="108" w:type="dxa"/>
+      </w:tblCellMar>
     </w:tblPr>
     <w:tblStylePr w:type="firstRow">
       <w:pPr>
@@ -7445,10 +7663,17 @@
     <w:tblPr>
       <w:tblStyleRowBandSize w:val="1"/>
       <w:tblStyleColBandSize w:val="1"/>
+      <w:tblInd w:w="0" w:type="dxa"/>
       <w:tblBorders>
         <w:top w:val="single" w:sz="18" w:space="0" w:color="auto"/>
         <w:bottom w:val="single" w:sz="18" w:space="0" w:color="auto"/>
       </w:tblBorders>
+      <w:tblCellMar>
+        <w:top w:w="0" w:type="dxa"/>
+        <w:left w:w="108" w:type="dxa"/>
+        <w:bottom w:w="0" w:type="dxa"/>
+        <w:right w:w="108" w:type="dxa"/>
+      </w:tblCellMar>
     </w:tblPr>
     <w:tblStylePr w:type="firstRow">
       <w:pPr>
@@ -7587,10 +7812,17 @@
     <w:tblPr>
       <w:tblStyleRowBandSize w:val="1"/>
       <w:tblStyleColBandSize w:val="1"/>
+      <w:tblInd w:w="0" w:type="dxa"/>
       <w:tblBorders>
         <w:top w:val="single" w:sz="18" w:space="0" w:color="auto"/>
         <w:bottom w:val="single" w:sz="18" w:space="0" w:color="auto"/>
       </w:tblBorders>
+      <w:tblCellMar>
+        <w:top w:w="0" w:type="dxa"/>
+        <w:left w:w="108" w:type="dxa"/>
+        <w:bottom w:w="0" w:type="dxa"/>
+        <w:right w:w="108" w:type="dxa"/>
+      </w:tblCellMar>
     </w:tblPr>
     <w:tblStylePr w:type="firstRow">
       <w:pPr>
@@ -7729,10 +7961,17 @@
     <w:tblPr>
       <w:tblStyleRowBandSize w:val="1"/>
       <w:tblStyleColBandSize w:val="1"/>
+      <w:tblInd w:w="0" w:type="dxa"/>
       <w:tblBorders>
         <w:top w:val="single" w:sz="18" w:space="0" w:color="auto"/>
         <w:bottom w:val="single" w:sz="18" w:space="0" w:color="auto"/>
       </w:tblBorders>
+      <w:tblCellMar>
+        <w:top w:w="0" w:type="dxa"/>
+        <w:left w:w="108" w:type="dxa"/>
+        <w:bottom w:w="0" w:type="dxa"/>
+        <w:right w:w="108" w:type="dxa"/>
+      </w:tblCellMar>
     </w:tblPr>
     <w:tblStylePr w:type="firstRow">
       <w:pPr>
@@ -7871,10 +8110,17 @@
     <w:tblPr>
       <w:tblStyleRowBandSize w:val="1"/>
       <w:tblStyleColBandSize w:val="1"/>
+      <w:tblInd w:w="0" w:type="dxa"/>
       <w:tblBorders>
         <w:top w:val="single" w:sz="18" w:space="0" w:color="auto"/>
         <w:bottom w:val="single" w:sz="18" w:space="0" w:color="auto"/>
       </w:tblBorders>
+      <w:tblCellMar>
+        <w:top w:w="0" w:type="dxa"/>
+        <w:left w:w="108" w:type="dxa"/>
+        <w:bottom w:w="0" w:type="dxa"/>
+        <w:right w:w="108" w:type="dxa"/>
+      </w:tblCellMar>
     </w:tblPr>
     <w:tblStylePr w:type="firstRow">
       <w:pPr>
@@ -8016,10 +8262,17 @@
     <w:tblPr>
       <w:tblStyleRowBandSize w:val="1"/>
       <w:tblStyleColBandSize w:val="1"/>
+      <w:tblInd w:w="0" w:type="dxa"/>
       <w:tblBorders>
         <w:top w:val="single" w:sz="8" w:space="0" w:color="000000" w:themeColor="text1"/>
         <w:bottom w:val="single" w:sz="8" w:space="0" w:color="000000" w:themeColor="text1"/>
       </w:tblBorders>
+      <w:tblCellMar>
+        <w:top w:w="0" w:type="dxa"/>
+        <w:left w:w="108" w:type="dxa"/>
+        <w:bottom w:w="0" w:type="dxa"/>
+        <w:right w:w="108" w:type="dxa"/>
+      </w:tblCellMar>
     </w:tblPr>
     <w:tblStylePr w:type="firstRow">
       <w:rPr>
@@ -8093,10 +8346,17 @@
     <w:tblPr>
       <w:tblStyleRowBandSize w:val="1"/>
       <w:tblStyleColBandSize w:val="1"/>
+      <w:tblInd w:w="0" w:type="dxa"/>
       <w:tblBorders>
         <w:top w:val="single" w:sz="8" w:space="0" w:color="4F81BD" w:themeColor="accent1"/>
         <w:bottom w:val="single" w:sz="8" w:space="0" w:color="4F81BD" w:themeColor="accent1"/>
       </w:tblBorders>
+      <w:tblCellMar>
+        <w:top w:w="0" w:type="dxa"/>
+        <w:left w:w="108" w:type="dxa"/>
+        <w:bottom w:w="0" w:type="dxa"/>
+        <w:right w:w="108" w:type="dxa"/>
+      </w:tblCellMar>
     </w:tblPr>
     <w:tblStylePr w:type="firstRow">
       <w:rPr>
@@ -8170,10 +8430,17 @@
     <w:tblPr>
       <w:tblStyleRowBandSize w:val="1"/>
       <w:tblStyleColBandSize w:val="1"/>
+      <w:tblInd w:w="0" w:type="dxa"/>
       <w:tblBorders>
         <w:top w:val="single" w:sz="8" w:space="0" w:color="C0504D" w:themeColor="accent2"/>
         <w:bottom w:val="single" w:sz="8" w:space="0" w:color="C0504D" w:themeColor="accent2"/>
       </w:tblBorders>
+      <w:tblCellMar>
+        <w:top w:w="0" w:type="dxa"/>
+        <w:left w:w="108" w:type="dxa"/>
+        <w:bottom w:w="0" w:type="dxa"/>
+        <w:right w:w="108" w:type="dxa"/>
+      </w:tblCellMar>
     </w:tblPr>
     <w:tblStylePr w:type="firstRow">
       <w:rPr>
@@ -8247,10 +8514,17 @@
     <w:tblPr>
       <w:tblStyleRowBandSize w:val="1"/>
       <w:tblStyleColBandSize w:val="1"/>
+      <w:tblInd w:w="0" w:type="dxa"/>
       <w:tblBorders>
         <w:top w:val="single" w:sz="8" w:space="0" w:color="9BBB59" w:themeColor="accent3"/>
         <w:bottom w:val="single" w:sz="8" w:space="0" w:color="9BBB59" w:themeColor="accent3"/>
       </w:tblBorders>
+      <w:tblCellMar>
+        <w:top w:w="0" w:type="dxa"/>
+        <w:left w:w="108" w:type="dxa"/>
+        <w:bottom w:w="0" w:type="dxa"/>
+        <w:right w:w="108" w:type="dxa"/>
+      </w:tblCellMar>
     </w:tblPr>
     <w:tblStylePr w:type="firstRow">
       <w:rPr>
@@ -8324,10 +8598,17 @@
     <w:tblPr>
       <w:tblStyleRowBandSize w:val="1"/>
       <w:tblStyleColBandSize w:val="1"/>
+      <w:tblInd w:w="0" w:type="dxa"/>
       <w:tblBorders>
         <w:top w:val="single" w:sz="8" w:space="0" w:color="8064A2" w:themeColor="accent4"/>
         <w:bottom w:val="single" w:sz="8" w:space="0" w:color="8064A2" w:themeColor="accent4"/>
       </w:tblBorders>
+      <w:tblCellMar>
+        <w:top w:w="0" w:type="dxa"/>
+        <w:left w:w="108" w:type="dxa"/>
+        <w:bottom w:w="0" w:type="dxa"/>
+        <w:right w:w="108" w:type="dxa"/>
+      </w:tblCellMar>
     </w:tblPr>
     <w:tblStylePr w:type="firstRow">
       <w:rPr>
@@ -8401,10 +8682,17 @@
     <w:tblPr>
       <w:tblStyleRowBandSize w:val="1"/>
       <w:tblStyleColBandSize w:val="1"/>
+      <w:tblInd w:w="0" w:type="dxa"/>
       <w:tblBorders>
         <w:top w:val="single" w:sz="8" w:space="0" w:color="4BACC6" w:themeColor="accent5"/>
         <w:bottom w:val="single" w:sz="8" w:space="0" w:color="4BACC6" w:themeColor="accent5"/>
       </w:tblBorders>
+      <w:tblCellMar>
+        <w:top w:w="0" w:type="dxa"/>
+        <w:left w:w="108" w:type="dxa"/>
+        <w:bottom w:w="0" w:type="dxa"/>
+        <w:right w:w="108" w:type="dxa"/>
+      </w:tblCellMar>
     </w:tblPr>
     <w:tblStylePr w:type="firstRow">
       <w:rPr>
@@ -8478,10 +8766,17 @@
     <w:tblPr>
       <w:tblStyleRowBandSize w:val="1"/>
       <w:tblStyleColBandSize w:val="1"/>
+      <w:tblInd w:w="0" w:type="dxa"/>
       <w:tblBorders>
         <w:top w:val="single" w:sz="8" w:space="0" w:color="F79646" w:themeColor="accent6"/>
         <w:bottom w:val="single" w:sz="8" w:space="0" w:color="F79646" w:themeColor="accent6"/>
       </w:tblBorders>
+      <w:tblCellMar>
+        <w:top w:w="0" w:type="dxa"/>
+        <w:left w:w="108" w:type="dxa"/>
+        <w:bottom w:w="0" w:type="dxa"/>
+        <w:right w:w="108" w:type="dxa"/>
+      </w:tblCellMar>
     </w:tblPr>
     <w:tblStylePr w:type="firstRow">
       <w:rPr>
@@ -8556,12 +8851,19 @@
     <w:tblPr>
       <w:tblStyleRowBandSize w:val="1"/>
       <w:tblStyleColBandSize w:val="1"/>
+      <w:tblInd w:w="0" w:type="dxa"/>
       <w:tblBorders>
         <w:top w:val="single" w:sz="8" w:space="0" w:color="000000" w:themeColor="text1"/>
         <w:left w:val="single" w:sz="8" w:space="0" w:color="000000" w:themeColor="text1"/>
         <w:bottom w:val="single" w:sz="8" w:space="0" w:color="000000" w:themeColor="text1"/>
         <w:right w:val="single" w:sz="8" w:space="0" w:color="000000" w:themeColor="text1"/>
       </w:tblBorders>
+      <w:tblCellMar>
+        <w:top w:w="0" w:type="dxa"/>
+        <w:left w:w="108" w:type="dxa"/>
+        <w:bottom w:w="0" w:type="dxa"/>
+        <w:right w:w="108" w:type="dxa"/>
+      </w:tblCellMar>
     </w:tblPr>
     <w:tblStylePr w:type="firstRow">
       <w:rPr>
@@ -8677,12 +8979,19 @@
     <w:tblPr>
       <w:tblStyleRowBandSize w:val="1"/>
       <w:tblStyleColBandSize w:val="1"/>
+      <w:tblInd w:w="0" w:type="dxa"/>
       <w:tblBorders>
         <w:top w:val="single" w:sz="8" w:space="0" w:color="4F81BD" w:themeColor="accent1"/>
         <w:left w:val="single" w:sz="8" w:space="0" w:color="4F81BD" w:themeColor="accent1"/>
         <w:bottom w:val="single" w:sz="8" w:space="0" w:color="4F81BD" w:themeColor="accent1"/>
         <w:right w:val="single" w:sz="8" w:space="0" w:color="4F81BD" w:themeColor="accent1"/>
       </w:tblBorders>
+      <w:tblCellMar>
+        <w:top w:w="0" w:type="dxa"/>
+        <w:left w:w="108" w:type="dxa"/>
+        <w:bottom w:w="0" w:type="dxa"/>
+        <w:right w:w="108" w:type="dxa"/>
+      </w:tblCellMar>
     </w:tblPr>
     <w:tblStylePr w:type="firstRow">
       <w:rPr>
@@ -8798,12 +9107,19 @@
     <w:tblPr>
       <w:tblStyleRowBandSize w:val="1"/>
       <w:tblStyleColBandSize w:val="1"/>
+      <w:tblInd w:w="0" w:type="dxa"/>
       <w:tblBorders>
         <w:top w:val="single" w:sz="8" w:space="0" w:color="C0504D" w:themeColor="accent2"/>
         <w:left w:val="single" w:sz="8" w:space="0" w:color="C0504D" w:themeColor="accent2"/>
         <w:bottom w:val="single" w:sz="8" w:space="0" w:color="C0504D" w:themeColor="accent2"/>
         <w:right w:val="single" w:sz="8" w:space="0" w:color="C0504D" w:themeColor="accent2"/>
       </w:tblBorders>
+      <w:tblCellMar>
+        <w:top w:w="0" w:type="dxa"/>
+        <w:left w:w="108" w:type="dxa"/>
+        <w:bottom w:w="0" w:type="dxa"/>
+        <w:right w:w="108" w:type="dxa"/>
+      </w:tblCellMar>
     </w:tblPr>
     <w:tblStylePr w:type="firstRow">
       <w:rPr>
@@ -8919,12 +9235,19 @@
     <w:tblPr>
       <w:tblStyleRowBandSize w:val="1"/>
       <w:tblStyleColBandSize w:val="1"/>
+      <w:tblInd w:w="0" w:type="dxa"/>
       <w:tblBorders>
         <w:top w:val="single" w:sz="8" w:space="0" w:color="9BBB59" w:themeColor="accent3"/>
         <w:left w:val="single" w:sz="8" w:space="0" w:color="9BBB59" w:themeColor="accent3"/>
         <w:bottom w:val="single" w:sz="8" w:space="0" w:color="9BBB59" w:themeColor="accent3"/>
         <w:right w:val="single" w:sz="8" w:space="0" w:color="9BBB59" w:themeColor="accent3"/>
       </w:tblBorders>
+      <w:tblCellMar>
+        <w:top w:w="0" w:type="dxa"/>
+        <w:left w:w="108" w:type="dxa"/>
+        <w:bottom w:w="0" w:type="dxa"/>
+        <w:right w:w="108" w:type="dxa"/>
+      </w:tblCellMar>
     </w:tblPr>
     <w:tblStylePr w:type="firstRow">
       <w:rPr>
@@ -9040,12 +9363,19 @@
     <w:tblPr>
       <w:tblStyleRowBandSize w:val="1"/>
       <w:tblStyleColBandSize w:val="1"/>
+      <w:tblInd w:w="0" w:type="dxa"/>
       <w:tblBorders>
         <w:top w:val="single" w:sz="8" w:space="0" w:color="8064A2" w:themeColor="accent4"/>
         <w:left w:val="single" w:sz="8" w:space="0" w:color="8064A2" w:themeColor="accent4"/>
         <w:bottom w:val="single" w:sz="8" w:space="0" w:color="8064A2" w:themeColor="accent4"/>
         <w:right w:val="single" w:sz="8" w:space="0" w:color="8064A2" w:themeColor="accent4"/>
       </w:tblBorders>
+      <w:tblCellMar>
+        <w:top w:w="0" w:type="dxa"/>
+        <w:left w:w="108" w:type="dxa"/>
+        <w:bottom w:w="0" w:type="dxa"/>
+        <w:right w:w="108" w:type="dxa"/>
+      </w:tblCellMar>
     </w:tblPr>
     <w:tblStylePr w:type="firstRow">
       <w:rPr>
@@ -9161,12 +9491,19 @@
     <w:tblPr>
       <w:tblStyleRowBandSize w:val="1"/>
       <w:tblStyleColBandSize w:val="1"/>
+      <w:tblInd w:w="0" w:type="dxa"/>
       <w:tblBorders>
         <w:top w:val="single" w:sz="8" w:space="0" w:color="4BACC6" w:themeColor="accent5"/>
         <w:left w:val="single" w:sz="8" w:space="0" w:color="4BACC6" w:themeColor="accent5"/>
         <w:bottom w:val="single" w:sz="8" w:space="0" w:color="4BACC6" w:themeColor="accent5"/>
         <w:right w:val="single" w:sz="8" w:space="0" w:color="4BACC6" w:themeColor="accent5"/>
       </w:tblBorders>
+      <w:tblCellMar>
+        <w:top w:w="0" w:type="dxa"/>
+        <w:left w:w="108" w:type="dxa"/>
+        <w:bottom w:w="0" w:type="dxa"/>
+        <w:right w:w="108" w:type="dxa"/>
+      </w:tblCellMar>
     </w:tblPr>
     <w:tblStylePr w:type="firstRow">
       <w:rPr>
@@ -9282,12 +9619,19 @@
     <w:tblPr>
       <w:tblStyleRowBandSize w:val="1"/>
       <w:tblStyleColBandSize w:val="1"/>
+      <w:tblInd w:w="0" w:type="dxa"/>
       <w:tblBorders>
         <w:top w:val="single" w:sz="8" w:space="0" w:color="F79646" w:themeColor="accent6"/>
         <w:left w:val="single" w:sz="8" w:space="0" w:color="F79646" w:themeColor="accent6"/>
         <w:bottom w:val="single" w:sz="8" w:space="0" w:color="F79646" w:themeColor="accent6"/>
         <w:right w:val="single" w:sz="8" w:space="0" w:color="F79646" w:themeColor="accent6"/>
       </w:tblBorders>
+      <w:tblCellMar>
+        <w:top w:w="0" w:type="dxa"/>
+        <w:left w:w="108" w:type="dxa"/>
+        <w:bottom w:w="0" w:type="dxa"/>
+        <w:right w:w="108" w:type="dxa"/>
+      </w:tblCellMar>
     </w:tblPr>
     <w:tblStylePr w:type="firstRow">
       <w:rPr>
@@ -9399,6 +9743,7 @@
     <w:tblPr>
       <w:tblStyleRowBandSize w:val="1"/>
       <w:tblStyleColBandSize w:val="1"/>
+      <w:tblInd w:w="0" w:type="dxa"/>
       <w:tblBorders>
         <w:top w:val="single" w:sz="8" w:space="0" w:color="404040" w:themeColor="text1" w:themeTint="BF"/>
         <w:left w:val="single" w:sz="8" w:space="0" w:color="404040" w:themeColor="text1" w:themeTint="BF"/>
@@ -9407,6 +9752,12 @@
         <w:insideH w:val="single" w:sz="8" w:space="0" w:color="404040" w:themeColor="text1" w:themeTint="BF"/>
         <w:insideV w:val="single" w:sz="8" w:space="0" w:color="404040" w:themeColor="text1" w:themeTint="BF"/>
       </w:tblBorders>
+      <w:tblCellMar>
+        <w:top w:w="0" w:type="dxa"/>
+        <w:left w:w="108" w:type="dxa"/>
+        <w:bottom w:w="0" w:type="dxa"/>
+        <w:right w:w="108" w:type="dxa"/>
+      </w:tblCellMar>
     </w:tblPr>
     <w:tcPr>
       <w:shd w:val="clear" w:color="auto" w:fill="C0C0C0" w:themeFill="text1" w:themeFillTint="3F"/>
@@ -9465,6 +9816,7 @@
     <w:tblPr>
       <w:tblStyleRowBandSize w:val="1"/>
       <w:tblStyleColBandSize w:val="1"/>
+      <w:tblInd w:w="0" w:type="dxa"/>
       <w:tblBorders>
         <w:top w:val="single" w:sz="8" w:space="0" w:color="7BA0CD" w:themeColor="accent1" w:themeTint="BF"/>
         <w:left w:val="single" w:sz="8" w:space="0" w:color="7BA0CD" w:themeColor="accent1" w:themeTint="BF"/>
@@ -9473,6 +9825,12 @@
         <w:insideH w:val="single" w:sz="8" w:space="0" w:color="7BA0CD" w:themeColor="accent1" w:themeTint="BF"/>
         <w:insideV w:val="single" w:sz="8" w:space="0" w:color="7BA0CD" w:themeColor="accent1" w:themeTint="BF"/>
       </w:tblBorders>
+      <w:tblCellMar>
+        <w:top w:w="0" w:type="dxa"/>
+        <w:left w:w="108" w:type="dxa"/>
+        <w:bottom w:w="0" w:type="dxa"/>
+        <w:right w:w="108" w:type="dxa"/>
+      </w:tblCellMar>
     </w:tblPr>
     <w:tcPr>
       <w:shd w:val="clear" w:color="auto" w:fill="D3DFEE" w:themeFill="accent1" w:themeFillTint="3F"/>
@@ -9531,6 +9889,7 @@
     <w:tblPr>
       <w:tblStyleRowBandSize w:val="1"/>
       <w:tblStyleColBandSize w:val="1"/>
+      <w:tblInd w:w="0" w:type="dxa"/>
       <w:tblBorders>
         <w:top w:val="single" w:sz="8" w:space="0" w:color="CF7B79" w:themeColor="accent2" w:themeTint="BF"/>
         <w:left w:val="single" w:sz="8" w:space="0" w:color="CF7B79" w:themeColor="accent2" w:themeTint="BF"/>
@@ -9539,6 +9898,12 @@
         <w:insideH w:val="single" w:sz="8" w:space="0" w:color="CF7B79" w:themeColor="accent2" w:themeTint="BF"/>
         <w:insideV w:val="single" w:sz="8" w:space="0" w:color="CF7B79" w:themeColor="accent2" w:themeTint="BF"/>
       </w:tblBorders>
+      <w:tblCellMar>
+        <w:top w:w="0" w:type="dxa"/>
+        <w:left w:w="108" w:type="dxa"/>
+        <w:bottom w:w="0" w:type="dxa"/>
+        <w:right w:w="108" w:type="dxa"/>
+      </w:tblCellMar>
     </w:tblPr>
     <w:tcPr>
       <w:shd w:val="clear" w:color="auto" w:fill="EFD3D2" w:themeFill="accent2" w:themeFillTint="3F"/>
@@ -9597,6 +9962,7 @@
     <w:tblPr>
       <w:tblStyleRowBandSize w:val="1"/>
       <w:tblStyleColBandSize w:val="1"/>
+      <w:tblInd w:w="0" w:type="dxa"/>
       <w:tblBorders>
         <w:top w:val="single" w:sz="8" w:space="0" w:color="B3CC82" w:themeColor="accent3" w:themeTint="BF"/>
         <w:left w:val="single" w:sz="8" w:space="0" w:color="B3CC82" w:themeColor="accent3" w:themeTint="BF"/>
@@ -9605,6 +9971,12 @@
         <w:insideH w:val="single" w:sz="8" w:space="0" w:color="B3CC82" w:themeColor="accent3" w:themeTint="BF"/>
         <w:insideV w:val="single" w:sz="8" w:space="0" w:color="B3CC82" w:themeColor="accent3" w:themeTint="BF"/>
       </w:tblBorders>
+      <w:tblCellMar>
+        <w:top w:w="0" w:type="dxa"/>
+        <w:left w:w="108" w:type="dxa"/>
+        <w:bottom w:w="0" w:type="dxa"/>
+        <w:right w:w="108" w:type="dxa"/>
+      </w:tblCellMar>
     </w:tblPr>
     <w:tcPr>
       <w:shd w:val="clear" w:color="auto" w:fill="E6EED5" w:themeFill="accent3" w:themeFillTint="3F"/>
@@ -9663,6 +10035,7 @@
     <w:tblPr>
       <w:tblStyleRowBandSize w:val="1"/>
       <w:tblStyleColBandSize w:val="1"/>
+      <w:tblInd w:w="0" w:type="dxa"/>
       <w:tblBorders>
         <w:top w:val="single" w:sz="8" w:space="0" w:color="9F8AB9" w:themeColor="accent4" w:themeTint="BF"/>
         <w:left w:val="single" w:sz="8" w:space="0" w:color="9F8AB9" w:themeColor="accent4" w:themeTint="BF"/>
@@ -9671,6 +10044,12 @@
         <w:insideH w:val="single" w:sz="8" w:space="0" w:color="9F8AB9" w:themeColor="accent4" w:themeTint="BF"/>
         <w:insideV w:val="single" w:sz="8" w:space="0" w:color="9F8AB9" w:themeColor="accent4" w:themeTint="BF"/>
       </w:tblBorders>
+      <w:tblCellMar>
+        <w:top w:w="0" w:type="dxa"/>
+        <w:left w:w="108" w:type="dxa"/>
+        <w:bottom w:w="0" w:type="dxa"/>
+        <w:right w:w="108" w:type="dxa"/>
+      </w:tblCellMar>
     </w:tblPr>
     <w:tcPr>
       <w:shd w:val="clear" w:color="auto" w:fill="DFD8E8" w:themeFill="accent4" w:themeFillTint="3F"/>
@@ -9729,6 +10108,7 @@
     <w:tblPr>
       <w:tblStyleRowBandSize w:val="1"/>
       <w:tblStyleColBandSize w:val="1"/>
+      <w:tblInd w:w="0" w:type="dxa"/>
       <w:tblBorders>
         <w:top w:val="single" w:sz="8" w:space="0" w:color="78C0D4" w:themeColor="accent5" w:themeTint="BF"/>
         <w:left w:val="single" w:sz="8" w:space="0" w:color="78C0D4" w:themeColor="accent5" w:themeTint="BF"/>
@@ -9737,6 +10117,12 @@
         <w:insideH w:val="single" w:sz="8" w:space="0" w:color="78C0D4" w:themeColor="accent5" w:themeTint="BF"/>
         <w:insideV w:val="single" w:sz="8" w:space="0" w:color="78C0D4" w:themeColor="accent5" w:themeTint="BF"/>
       </w:tblBorders>
+      <w:tblCellMar>
+        <w:top w:w="0" w:type="dxa"/>
+        <w:left w:w="108" w:type="dxa"/>
+        <w:bottom w:w="0" w:type="dxa"/>
+        <w:right w:w="108" w:type="dxa"/>
+      </w:tblCellMar>
     </w:tblPr>
     <w:tcPr>
       <w:shd w:val="clear" w:color="auto" w:fill="D2EAF1" w:themeFill="accent5" w:themeFillTint="3F"/>
@@ -9795,6 +10181,7 @@
     <w:tblPr>
       <w:tblStyleRowBandSize w:val="1"/>
       <w:tblStyleColBandSize w:val="1"/>
+      <w:tblInd w:w="0" w:type="dxa"/>
       <w:tblBorders>
         <w:top w:val="single" w:sz="8" w:space="0" w:color="F9B074" w:themeColor="accent6" w:themeTint="BF"/>
         <w:left w:val="single" w:sz="8" w:space="0" w:color="F9B074" w:themeColor="accent6" w:themeTint="BF"/>
@@ -9803,6 +10190,12 @@
         <w:insideH w:val="single" w:sz="8" w:space="0" w:color="F9B074" w:themeColor="accent6" w:themeTint="BF"/>
         <w:insideV w:val="single" w:sz="8" w:space="0" w:color="F9B074" w:themeColor="accent6" w:themeTint="BF"/>
       </w:tblBorders>
+      <w:tblCellMar>
+        <w:top w:w="0" w:type="dxa"/>
+        <w:left w:w="108" w:type="dxa"/>
+        <w:bottom w:w="0" w:type="dxa"/>
+        <w:right w:w="108" w:type="dxa"/>
+      </w:tblCellMar>
     </w:tblPr>
     <w:tcPr>
       <w:shd w:val="clear" w:color="auto" w:fill="FDE4D0" w:themeFill="accent6" w:themeFillTint="3F"/>
@@ -9865,6 +10258,7 @@
     <w:tblPr>
       <w:tblStyleRowBandSize w:val="1"/>
       <w:tblStyleColBandSize w:val="1"/>
+      <w:tblInd w:w="0" w:type="dxa"/>
       <w:tblBorders>
         <w:top w:val="single" w:sz="8" w:space="0" w:color="000000" w:themeColor="text1"/>
         <w:left w:val="single" w:sz="8" w:space="0" w:color="000000" w:themeColor="text1"/>
@@ -9873,6 +10267,12 @@
         <w:insideH w:val="single" w:sz="8" w:space="0" w:color="000000" w:themeColor="text1"/>
         <w:insideV w:val="single" w:sz="8" w:space="0" w:color="000000" w:themeColor="text1"/>
       </w:tblBorders>
+      <w:tblCellMar>
+        <w:top w:w="0" w:type="dxa"/>
+        <w:left w:w="108" w:type="dxa"/>
+        <w:bottom w:w="0" w:type="dxa"/>
+        <w:right w:w="108" w:type="dxa"/>
+      </w:tblCellMar>
     </w:tblPr>
     <w:tcPr>
       <w:shd w:val="clear" w:color="auto" w:fill="C0C0C0" w:themeFill="text1" w:themeFillTint="3F"/>
@@ -9983,6 +10383,7 @@
     <w:tblPr>
       <w:tblStyleRowBandSize w:val="1"/>
       <w:tblStyleColBandSize w:val="1"/>
+      <w:tblInd w:w="0" w:type="dxa"/>
       <w:tblBorders>
         <w:top w:val="single" w:sz="8" w:space="0" w:color="4F81BD" w:themeColor="accent1"/>
         <w:left w:val="single" w:sz="8" w:space="0" w:color="4F81BD" w:themeColor="accent1"/>
@@ -9991,6 +10392,12 @@
         <w:insideH w:val="single" w:sz="8" w:space="0" w:color="4F81BD" w:themeColor="accent1"/>
         <w:insideV w:val="single" w:sz="8" w:space="0" w:color="4F81BD" w:themeColor="accent1"/>
       </w:tblBorders>
+      <w:tblCellMar>
+        <w:top w:w="0" w:type="dxa"/>
+        <w:left w:w="108" w:type="dxa"/>
+        <w:bottom w:w="0" w:type="dxa"/>
+        <w:right w:w="108" w:type="dxa"/>
+      </w:tblCellMar>
     </w:tblPr>
     <w:tcPr>
       <w:shd w:val="clear" w:color="auto" w:fill="D3DFEE" w:themeFill="accent1" w:themeFillTint="3F"/>
@@ -10101,6 +10508,7 @@
     <w:tblPr>
       <w:tblStyleRowBandSize w:val="1"/>
       <w:tblStyleColBandSize w:val="1"/>
+      <w:tblInd w:w="0" w:type="dxa"/>
       <w:tblBorders>
         <w:top w:val="single" w:sz="8" w:space="0" w:color="C0504D" w:themeColor="accent2"/>
         <w:left w:val="single" w:sz="8" w:space="0" w:color="C0504D" w:themeColor="accent2"/>
@@ -10109,6 +10517,12 @@
         <w:insideH w:val="single" w:sz="8" w:space="0" w:color="C0504D" w:themeColor="accent2"/>
         <w:insideV w:val="single" w:sz="8" w:space="0" w:color="C0504D" w:themeColor="accent2"/>
       </w:tblBorders>
+      <w:tblCellMar>
+        <w:top w:w="0" w:type="dxa"/>
+        <w:left w:w="108" w:type="dxa"/>
+        <w:bottom w:w="0" w:type="dxa"/>
+        <w:right w:w="108" w:type="dxa"/>
+      </w:tblCellMar>
     </w:tblPr>
     <w:tcPr>
       <w:shd w:val="clear" w:color="auto" w:fill="EFD3D2" w:themeFill="accent2" w:themeFillTint="3F"/>
@@ -10219,6 +10633,7 @@
     <w:tblPr>
       <w:tblStyleRowBandSize w:val="1"/>
       <w:tblStyleColBandSize w:val="1"/>
+      <w:tblInd w:w="0" w:type="dxa"/>
       <w:tblBorders>
         <w:top w:val="single" w:sz="8" w:space="0" w:color="9BBB59" w:themeColor="accent3"/>
         <w:left w:val="single" w:sz="8" w:space="0" w:color="9BBB59" w:themeColor="accent3"/>
@@ -10227,6 +10642,12 @@
         <w:insideH w:val="single" w:sz="8" w:space="0" w:color="9BBB59" w:themeColor="accent3"/>
         <w:insideV w:val="single" w:sz="8" w:space="0" w:color="9BBB59" w:themeColor="accent3"/>
       </w:tblBorders>
+      <w:tblCellMar>
+        <w:top w:w="0" w:type="dxa"/>
+        <w:left w:w="108" w:type="dxa"/>
+        <w:bottom w:w="0" w:type="dxa"/>
+        <w:right w:w="108" w:type="dxa"/>
+      </w:tblCellMar>
     </w:tblPr>
     <w:tcPr>
       <w:shd w:val="clear" w:color="auto" w:fill="E6EED5" w:themeFill="accent3" w:themeFillTint="3F"/>
@@ -10337,6 +10758,7 @@
     <w:tblPr>
       <w:tblStyleRowBandSize w:val="1"/>
       <w:tblStyleColBandSize w:val="1"/>
+      <w:tblInd w:w="0" w:type="dxa"/>
       <w:tblBorders>
         <w:top w:val="single" w:sz="8" w:space="0" w:color="8064A2" w:themeColor="accent4"/>
         <w:left w:val="single" w:sz="8" w:space="0" w:color="8064A2" w:themeColor="accent4"/>
@@ -10345,6 +10767,12 @@
         <w:insideH w:val="single" w:sz="8" w:space="0" w:color="8064A2" w:themeColor="accent4"/>
         <w:insideV w:val="single" w:sz="8" w:space="0" w:color="8064A2" w:themeColor="accent4"/>
       </w:tblBorders>
+      <w:tblCellMar>
+        <w:top w:w="0" w:type="dxa"/>
+        <w:left w:w="108" w:type="dxa"/>
+        <w:bottom w:w="0" w:type="dxa"/>
+        <w:right w:w="108" w:type="dxa"/>
+      </w:tblCellMar>
     </w:tblPr>
     <w:tcPr>
       <w:shd w:val="clear" w:color="auto" w:fill="DFD8E8" w:themeFill="accent4" w:themeFillTint="3F"/>
@@ -10455,6 +10883,7 @@
     <w:tblPr>
       <w:tblStyleRowBandSize w:val="1"/>
       <w:tblStyleColBandSize w:val="1"/>
+      <w:tblInd w:w="0" w:type="dxa"/>
       <w:tblBorders>
         <w:top w:val="single" w:sz="8" w:space="0" w:color="4BACC6" w:themeColor="accent5"/>
         <w:left w:val="single" w:sz="8" w:space="0" w:color="4BACC6" w:themeColor="accent5"/>
@@ -10463,6 +10892,12 @@
         <w:insideH w:val="single" w:sz="8" w:space="0" w:color="4BACC6" w:themeColor="accent5"/>
         <w:insideV w:val="single" w:sz="8" w:space="0" w:color="4BACC6" w:themeColor="accent5"/>
       </w:tblBorders>
+      <w:tblCellMar>
+        <w:top w:w="0" w:type="dxa"/>
+        <w:left w:w="108" w:type="dxa"/>
+        <w:bottom w:w="0" w:type="dxa"/>
+        <w:right w:w="108" w:type="dxa"/>
+      </w:tblCellMar>
     </w:tblPr>
     <w:tcPr>
       <w:shd w:val="clear" w:color="auto" w:fill="D2EAF1" w:themeFill="accent5" w:themeFillTint="3F"/>
@@ -10573,6 +11008,7 @@
     <w:tblPr>
       <w:tblStyleRowBandSize w:val="1"/>
       <w:tblStyleColBandSize w:val="1"/>
+      <w:tblInd w:w="0" w:type="dxa"/>
       <w:tblBorders>
         <w:top w:val="single" w:sz="8" w:space="0" w:color="F79646" w:themeColor="accent6"/>
         <w:left w:val="single" w:sz="8" w:space="0" w:color="F79646" w:themeColor="accent6"/>
@@ -10581,6 +11017,12 @@
         <w:insideH w:val="single" w:sz="8" w:space="0" w:color="F79646" w:themeColor="accent6"/>
         <w:insideV w:val="single" w:sz="8" w:space="0" w:color="F79646" w:themeColor="accent6"/>
       </w:tblBorders>
+      <w:tblCellMar>
+        <w:top w:w="0" w:type="dxa"/>
+        <w:left w:w="108" w:type="dxa"/>
+        <w:bottom w:w="0" w:type="dxa"/>
+        <w:right w:w="108" w:type="dxa"/>
+      </w:tblCellMar>
     </w:tblPr>
     <w:tcPr>
       <w:shd w:val="clear" w:color="auto" w:fill="FDE4D0" w:themeFill="accent6" w:themeFillTint="3F"/>
@@ -10687,6 +11129,7 @@
     <w:tblPr>
       <w:tblStyleRowBandSize w:val="1"/>
       <w:tblStyleColBandSize w:val="1"/>
+      <w:tblInd w:w="0" w:type="dxa"/>
       <w:tblBorders>
         <w:top w:val="single" w:sz="8" w:space="0" w:color="FFFFFF" w:themeColor="background1"/>
         <w:left w:val="single" w:sz="8" w:space="0" w:color="FFFFFF" w:themeColor="background1"/>
@@ -10695,6 +11138,12 @@
         <w:insideH w:val="single" w:sz="6" w:space="0" w:color="FFFFFF" w:themeColor="background1"/>
         <w:insideV w:val="single" w:sz="6" w:space="0" w:color="FFFFFF" w:themeColor="background1"/>
       </w:tblBorders>
+      <w:tblCellMar>
+        <w:top w:w="0" w:type="dxa"/>
+        <w:left w:w="108" w:type="dxa"/>
+        <w:bottom w:w="0" w:type="dxa"/>
+        <w:right w:w="108" w:type="dxa"/>
+      </w:tblCellMar>
     </w:tblPr>
     <w:tcPr>
       <w:shd w:val="clear" w:color="auto" w:fill="C0C0C0" w:themeFill="text1" w:themeFillTint="3F"/>
@@ -10821,6 +11270,7 @@
     <w:tblPr>
       <w:tblStyleRowBandSize w:val="1"/>
       <w:tblStyleColBandSize w:val="1"/>
+      <w:tblInd w:w="0" w:type="dxa"/>
       <w:tblBorders>
         <w:top w:val="single" w:sz="8" w:space="0" w:color="FFFFFF" w:themeColor="background1"/>
         <w:left w:val="single" w:sz="8" w:space="0" w:color="FFFFFF" w:themeColor="background1"/>
@@ -10829,6 +11279,12 @@
         <w:insideH w:val="single" w:sz="6" w:space="0" w:color="FFFFFF" w:themeColor="background1"/>
         <w:insideV w:val="single" w:sz="6" w:space="0" w:color="FFFFFF" w:themeColor="background1"/>
       </w:tblBorders>
+      <w:tblCellMar>
+        <w:top w:w="0" w:type="dxa"/>
+        <w:left w:w="108" w:type="dxa"/>
+        <w:bottom w:w="0" w:type="dxa"/>
+        <w:right w:w="108" w:type="dxa"/>
+      </w:tblCellMar>
     </w:tblPr>
     <w:tcPr>
       <w:shd w:val="clear" w:color="auto" w:fill="D3DFEE" w:themeFill="accent1" w:themeFillTint="3F"/>
@@ -10955,6 +11411,7 @@
     <w:tblPr>
       <w:tblStyleRowBandSize w:val="1"/>
       <w:tblStyleColBandSize w:val="1"/>
+      <w:tblInd w:w="0" w:type="dxa"/>
       <w:tblBorders>
         <w:top w:val="single" w:sz="8" w:space="0" w:color="FFFFFF" w:themeColor="background1"/>
         <w:left w:val="single" w:sz="8" w:space="0" w:color="FFFFFF" w:themeColor="background1"/>
@@ -10963,6 +11420,12 @@
         <w:insideH w:val="single" w:sz="6" w:space="0" w:color="FFFFFF" w:themeColor="background1"/>
         <w:insideV w:val="single" w:sz="6" w:space="0" w:color="FFFFFF" w:themeColor="background1"/>
       </w:tblBorders>
+      <w:tblCellMar>
+        <w:top w:w="0" w:type="dxa"/>
+        <w:left w:w="108" w:type="dxa"/>
+        <w:bottom w:w="0" w:type="dxa"/>
+        <w:right w:w="108" w:type="dxa"/>
+      </w:tblCellMar>
     </w:tblPr>
     <w:tcPr>
       <w:shd w:val="clear" w:color="auto" w:fill="EFD3D2" w:themeFill="accent2" w:themeFillTint="3F"/>
@@ -11089,6 +11552,7 @@
     <w:tblPr>
       <w:tblStyleRowBandSize w:val="1"/>
       <w:tblStyleColBandSize w:val="1"/>
+      <w:tblInd w:w="0" w:type="dxa"/>
       <w:tblBorders>
         <w:top w:val="single" w:sz="8" w:space="0" w:color="FFFFFF" w:themeColor="background1"/>
         <w:left w:val="single" w:sz="8" w:space="0" w:color="FFFFFF" w:themeColor="background1"/>
@@ -11097,6 +11561,12 @@
         <w:insideH w:val="single" w:sz="6" w:space="0" w:color="FFFFFF" w:themeColor="background1"/>
         <w:insideV w:val="single" w:sz="6" w:space="0" w:color="FFFFFF" w:themeColor="background1"/>
       </w:tblBorders>
+      <w:tblCellMar>
+        <w:top w:w="0" w:type="dxa"/>
+        <w:left w:w="108" w:type="dxa"/>
+        <w:bottom w:w="0" w:type="dxa"/>
+        <w:right w:w="108" w:type="dxa"/>
+      </w:tblCellMar>
     </w:tblPr>
     <w:tcPr>
       <w:shd w:val="clear" w:color="auto" w:fill="E6EED5" w:themeFill="accent3" w:themeFillTint="3F"/>
@@ -11223,6 +11693,7 @@
     <w:tblPr>
       <w:tblStyleRowBandSize w:val="1"/>
       <w:tblStyleColBandSize w:val="1"/>
+      <w:tblInd w:w="0" w:type="dxa"/>
       <w:tblBorders>
         <w:top w:val="single" w:sz="8" w:space="0" w:color="FFFFFF" w:themeColor="background1"/>
         <w:left w:val="single" w:sz="8" w:space="0" w:color="FFFFFF" w:themeColor="background1"/>
@@ -11231,6 +11702,12 @@
         <w:insideH w:val="single" w:sz="6" w:space="0" w:color="FFFFFF" w:themeColor="background1"/>
         <w:insideV w:val="single" w:sz="6" w:space="0" w:color="FFFFFF" w:themeColor="background1"/>
       </w:tblBorders>
+      <w:tblCellMar>
+        <w:top w:w="0" w:type="dxa"/>
+        <w:left w:w="108" w:type="dxa"/>
+        <w:bottom w:w="0" w:type="dxa"/>
+        <w:right w:w="108" w:type="dxa"/>
+      </w:tblCellMar>
     </w:tblPr>
     <w:tcPr>
       <w:shd w:val="clear" w:color="auto" w:fill="DFD8E8" w:themeFill="accent4" w:themeFillTint="3F"/>
@@ -11357,6 +11834,7 @@
     <w:tblPr>
       <w:tblStyleRowBandSize w:val="1"/>
       <w:tblStyleColBandSize w:val="1"/>
+      <w:tblInd w:w="0" w:type="dxa"/>
       <w:tblBorders>
         <w:top w:val="single" w:sz="8" w:space="0" w:color="FFFFFF" w:themeColor="background1"/>
         <w:left w:val="single" w:sz="8" w:space="0" w:color="FFFFFF" w:themeColor="background1"/>
@@ -11365,6 +11843,12 @@
         <w:insideH w:val="single" w:sz="6" w:space="0" w:color="FFFFFF" w:themeColor="background1"/>
         <w:insideV w:val="single" w:sz="6" w:space="0" w:color="FFFFFF" w:themeColor="background1"/>
       </w:tblBorders>
+      <w:tblCellMar>
+        <w:top w:w="0" w:type="dxa"/>
+        <w:left w:w="108" w:type="dxa"/>
+        <w:bottom w:w="0" w:type="dxa"/>
+        <w:right w:w="108" w:type="dxa"/>
+      </w:tblCellMar>
     </w:tblPr>
     <w:tcPr>
       <w:shd w:val="clear" w:color="auto" w:fill="D2EAF1" w:themeFill="accent5" w:themeFillTint="3F"/>
@@ -11491,6 +11975,7 @@
     <w:tblPr>
       <w:tblStyleRowBandSize w:val="1"/>
       <w:tblStyleColBandSize w:val="1"/>
+      <w:tblInd w:w="0" w:type="dxa"/>
       <w:tblBorders>
         <w:top w:val="single" w:sz="8" w:space="0" w:color="FFFFFF" w:themeColor="background1"/>
         <w:left w:val="single" w:sz="8" w:space="0" w:color="FFFFFF" w:themeColor="background1"/>
@@ -11499,6 +11984,12 @@
         <w:insideH w:val="single" w:sz="6" w:space="0" w:color="FFFFFF" w:themeColor="background1"/>
         <w:insideV w:val="single" w:sz="6" w:space="0" w:color="FFFFFF" w:themeColor="background1"/>
       </w:tblBorders>
+      <w:tblCellMar>
+        <w:top w:w="0" w:type="dxa"/>
+        <w:left w:w="108" w:type="dxa"/>
+        <w:bottom w:w="0" w:type="dxa"/>
+        <w:right w:w="108" w:type="dxa"/>
+      </w:tblCellMar>
     </w:tblPr>
     <w:tcPr>
       <w:shd w:val="clear" w:color="auto" w:fill="FDE4D0" w:themeFill="accent6" w:themeFillTint="3F"/>
@@ -11628,6 +12119,13 @@
     <w:tblPr>
       <w:tblStyleRowBandSize w:val="1"/>
       <w:tblStyleColBandSize w:val="1"/>
+      <w:tblInd w:w="0" w:type="dxa"/>
+      <w:tblCellMar>
+        <w:top w:w="0" w:type="dxa"/>
+        <w:left w:w="108" w:type="dxa"/>
+        <w:bottom w:w="0" w:type="dxa"/>
+        <w:right w:w="108" w:type="dxa"/>
+      </w:tblCellMar>
     </w:tblPr>
     <w:tcPr>
       <w:shd w:val="clear" w:color="auto" w:fill="000000" w:themeFill="text1"/>
@@ -11735,6 +12233,13 @@
     <w:tblPr>
       <w:tblStyleRowBandSize w:val="1"/>
       <w:tblStyleColBandSize w:val="1"/>
+      <w:tblInd w:w="0" w:type="dxa"/>
+      <w:tblCellMar>
+        <w:top w:w="0" w:type="dxa"/>
+        <w:left w:w="108" w:type="dxa"/>
+        <w:bottom w:w="0" w:type="dxa"/>
+        <w:right w:w="108" w:type="dxa"/>
+      </w:tblCellMar>
     </w:tblPr>
     <w:tcPr>
       <w:shd w:val="clear" w:color="auto" w:fill="4F81BD" w:themeFill="accent1"/>
@@ -11842,6 +12347,13 @@
     <w:tblPr>
       <w:tblStyleRowBandSize w:val="1"/>
       <w:tblStyleColBandSize w:val="1"/>
+      <w:tblInd w:w="0" w:type="dxa"/>
+      <w:tblCellMar>
+        <w:top w:w="0" w:type="dxa"/>
+        <w:left w:w="108" w:type="dxa"/>
+        <w:bottom w:w="0" w:type="dxa"/>
+        <w:right w:w="108" w:type="dxa"/>
+      </w:tblCellMar>
     </w:tblPr>
     <w:tcPr>
       <w:shd w:val="clear" w:color="auto" w:fill="C0504D" w:themeFill="accent2"/>
@@ -11949,6 +12461,13 @@
     <w:tblPr>
       <w:tblStyleRowBandSize w:val="1"/>
       <w:tblStyleColBandSize w:val="1"/>
+      <w:tblInd w:w="0" w:type="dxa"/>
+      <w:tblCellMar>
+        <w:top w:w="0" w:type="dxa"/>
+        <w:left w:w="108" w:type="dxa"/>
+        <w:bottom w:w="0" w:type="dxa"/>
+        <w:right w:w="108" w:type="dxa"/>
+      </w:tblCellMar>
     </w:tblPr>
     <w:tcPr>
       <w:shd w:val="clear" w:color="auto" w:fill="9BBB59" w:themeFill="accent3"/>
@@ -12056,6 +12575,13 @@
     <w:tblPr>
       <w:tblStyleRowBandSize w:val="1"/>
       <w:tblStyleColBandSize w:val="1"/>
+      <w:tblInd w:w="0" w:type="dxa"/>
+      <w:tblCellMar>
+        <w:top w:w="0" w:type="dxa"/>
+        <w:left w:w="108" w:type="dxa"/>
+        <w:bottom w:w="0" w:type="dxa"/>
+        <w:right w:w="108" w:type="dxa"/>
+      </w:tblCellMar>
     </w:tblPr>
     <w:tcPr>
       <w:shd w:val="clear" w:color="auto" w:fill="8064A2" w:themeFill="accent4"/>
@@ -12163,6 +12689,13 @@
     <w:tblPr>
       <w:tblStyleRowBandSize w:val="1"/>
       <w:tblStyleColBandSize w:val="1"/>
+      <w:tblInd w:w="0" w:type="dxa"/>
+      <w:tblCellMar>
+        <w:top w:w="0" w:type="dxa"/>
+        <w:left w:w="108" w:type="dxa"/>
+        <w:bottom w:w="0" w:type="dxa"/>
+        <w:right w:w="108" w:type="dxa"/>
+      </w:tblCellMar>
     </w:tblPr>
     <w:tcPr>
       <w:shd w:val="clear" w:color="auto" w:fill="4BACC6" w:themeFill="accent5"/>
@@ -12270,6 +12803,13 @@
     <w:tblPr>
       <w:tblStyleRowBandSize w:val="1"/>
       <w:tblStyleColBandSize w:val="1"/>
+      <w:tblInd w:w="0" w:type="dxa"/>
+      <w:tblCellMar>
+        <w:top w:w="0" w:type="dxa"/>
+        <w:left w:w="108" w:type="dxa"/>
+        <w:bottom w:w="0" w:type="dxa"/>
+        <w:right w:w="108" w:type="dxa"/>
+      </w:tblCellMar>
     </w:tblPr>
     <w:tcPr>
       <w:shd w:val="clear" w:color="auto" w:fill="F79646" w:themeFill="accent6"/>
@@ -12377,6 +12917,7 @@
     <w:tblPr>
       <w:tblStyleRowBandSize w:val="1"/>
       <w:tblStyleColBandSize w:val="1"/>
+      <w:tblInd w:w="0" w:type="dxa"/>
       <w:tblBorders>
         <w:top w:val="single" w:sz="24" w:space="0" w:color="C0504D" w:themeColor="accent2"/>
         <w:left w:val="single" w:sz="4" w:space="0" w:color="000000" w:themeColor="text1"/>
@@ -12385,6 +12926,12 @@
         <w:insideH w:val="single" w:sz="4" w:space="0" w:color="FFFFFF" w:themeColor="background1"/>
         <w:insideV w:val="single" w:sz="4" w:space="0" w:color="FFFFFF" w:themeColor="background1"/>
       </w:tblBorders>
+      <w:tblCellMar>
+        <w:top w:w="0" w:type="dxa"/>
+        <w:left w:w="108" w:type="dxa"/>
+        <w:bottom w:w="0" w:type="dxa"/>
+        <w:right w:w="108" w:type="dxa"/>
+      </w:tblCellMar>
     </w:tblPr>
     <w:tcPr>
       <w:shd w:val="clear" w:color="auto" w:fill="E6E6E6" w:themeFill="text1" w:themeFillTint="19"/>
@@ -12492,6 +13039,7 @@
     <w:tblPr>
       <w:tblStyleRowBandSize w:val="1"/>
       <w:tblStyleColBandSize w:val="1"/>
+      <w:tblInd w:w="0" w:type="dxa"/>
       <w:tblBorders>
         <w:top w:val="single" w:sz="24" w:space="0" w:color="C0504D" w:themeColor="accent2"/>
         <w:left w:val="single" w:sz="4" w:space="0" w:color="4F81BD" w:themeColor="accent1"/>
@@ -12500,6 +13048,12 @@
         <w:insideH w:val="single" w:sz="4" w:space="0" w:color="FFFFFF" w:themeColor="background1"/>
         <w:insideV w:val="single" w:sz="4" w:space="0" w:color="FFFFFF" w:themeColor="background1"/>
       </w:tblBorders>
+      <w:tblCellMar>
+        <w:top w:w="0" w:type="dxa"/>
+        <w:left w:w="108" w:type="dxa"/>
+        <w:bottom w:w="0" w:type="dxa"/>
+        <w:right w:w="108" w:type="dxa"/>
+      </w:tblCellMar>
     </w:tblPr>
     <w:tcPr>
       <w:shd w:val="clear" w:color="auto" w:fill="EDF2F8" w:themeFill="accent1" w:themeFillTint="19"/>
@@ -12607,6 +13161,7 @@
     <w:tblPr>
       <w:tblStyleRowBandSize w:val="1"/>
       <w:tblStyleColBandSize w:val="1"/>
+      <w:tblInd w:w="0" w:type="dxa"/>
       <w:tblBorders>
         <w:top w:val="single" w:sz="24" w:space="0" w:color="C0504D" w:themeColor="accent2"/>
         <w:left w:val="single" w:sz="4" w:space="0" w:color="C0504D" w:themeColor="accent2"/>
@@ -12615,6 +13170,12 @@
         <w:insideH w:val="single" w:sz="4" w:space="0" w:color="FFFFFF" w:themeColor="background1"/>
         <w:insideV w:val="single" w:sz="4" w:space="0" w:color="FFFFFF" w:themeColor="background1"/>
       </w:tblBorders>
+      <w:tblCellMar>
+        <w:top w:w="0" w:type="dxa"/>
+        <w:left w:w="108" w:type="dxa"/>
+        <w:bottom w:w="0" w:type="dxa"/>
+        <w:right w:w="108" w:type="dxa"/>
+      </w:tblCellMar>
     </w:tblPr>
     <w:tcPr>
       <w:shd w:val="clear" w:color="auto" w:fill="F8EDED" w:themeFill="accent2" w:themeFillTint="19"/>
@@ -12722,6 +13283,7 @@
     <w:tblPr>
       <w:tblStyleRowBandSize w:val="1"/>
       <w:tblStyleColBandSize w:val="1"/>
+      <w:tblInd w:w="0" w:type="dxa"/>
       <w:tblBorders>
         <w:top w:val="single" w:sz="24" w:space="0" w:color="8064A2" w:themeColor="accent4"/>
         <w:left w:val="single" w:sz="4" w:space="0" w:color="9BBB59" w:themeColor="accent3"/>
@@ -12730,6 +13292,12 @@
         <w:insideH w:val="single" w:sz="4" w:space="0" w:color="FFFFFF" w:themeColor="background1"/>
         <w:insideV w:val="single" w:sz="4" w:space="0" w:color="FFFFFF" w:themeColor="background1"/>
       </w:tblBorders>
+      <w:tblCellMar>
+        <w:top w:w="0" w:type="dxa"/>
+        <w:left w:w="108" w:type="dxa"/>
+        <w:bottom w:w="0" w:type="dxa"/>
+        <w:right w:w="108" w:type="dxa"/>
+      </w:tblCellMar>
     </w:tblPr>
     <w:tcPr>
       <w:shd w:val="clear" w:color="auto" w:fill="F5F8EE" w:themeFill="accent3" w:themeFillTint="19"/>
@@ -12827,6 +13395,7 @@
     <w:tblPr>
       <w:tblStyleRowBandSize w:val="1"/>
       <w:tblStyleColBandSize w:val="1"/>
+      <w:tblInd w:w="0" w:type="dxa"/>
       <w:tblBorders>
         <w:top w:val="single" w:sz="24" w:space="0" w:color="9BBB59" w:themeColor="accent3"/>
         <w:left w:val="single" w:sz="4" w:space="0" w:color="8064A2" w:themeColor="accent4"/>
@@ -12835,6 +13404,12 @@
         <w:insideH w:val="single" w:sz="4" w:space="0" w:color="FFFFFF" w:themeColor="background1"/>
         <w:insideV w:val="single" w:sz="4" w:space="0" w:color="FFFFFF" w:themeColor="background1"/>
       </w:tblBorders>
+      <w:tblCellMar>
+        <w:top w:w="0" w:type="dxa"/>
+        <w:left w:w="108" w:type="dxa"/>
+        <w:bottom w:w="0" w:type="dxa"/>
+        <w:right w:w="108" w:type="dxa"/>
+      </w:tblCellMar>
     </w:tblPr>
     <w:tcPr>
       <w:shd w:val="clear" w:color="auto" w:fill="F2EFF6" w:themeFill="accent4" w:themeFillTint="19"/>
@@ -12942,6 +13517,7 @@
     <w:tblPr>
       <w:tblStyleRowBandSize w:val="1"/>
       <w:tblStyleColBandSize w:val="1"/>
+      <w:tblInd w:w="0" w:type="dxa"/>
       <w:tblBorders>
         <w:top w:val="single" w:sz="24" w:space="0" w:color="F79646" w:themeColor="accent6"/>
         <w:left w:val="single" w:sz="4" w:space="0" w:color="4BACC6" w:themeColor="accent5"/>
@@ -12950,6 +13526,12 @@
         <w:insideH w:val="single" w:sz="4" w:space="0" w:color="FFFFFF" w:themeColor="background1"/>
         <w:insideV w:val="single" w:sz="4" w:space="0" w:color="FFFFFF" w:themeColor="background1"/>
       </w:tblBorders>
+      <w:tblCellMar>
+        <w:top w:w="0" w:type="dxa"/>
+        <w:left w:w="108" w:type="dxa"/>
+        <w:bottom w:w="0" w:type="dxa"/>
+        <w:right w:w="108" w:type="dxa"/>
+      </w:tblCellMar>
     </w:tblPr>
     <w:tcPr>
       <w:shd w:val="clear" w:color="auto" w:fill="EDF6F9" w:themeFill="accent5" w:themeFillTint="19"/>
@@ -13057,6 +13639,7 @@
     <w:tblPr>
       <w:tblStyleRowBandSize w:val="1"/>
       <w:tblStyleColBandSize w:val="1"/>
+      <w:tblInd w:w="0" w:type="dxa"/>
       <w:tblBorders>
         <w:top w:val="single" w:sz="24" w:space="0" w:color="4BACC6" w:themeColor="accent5"/>
         <w:left w:val="single" w:sz="4" w:space="0" w:color="F79646" w:themeColor="accent6"/>
@@ -13065,6 +13648,12 @@
         <w:insideH w:val="single" w:sz="4" w:space="0" w:color="FFFFFF" w:themeColor="background1"/>
         <w:insideV w:val="single" w:sz="4" w:space="0" w:color="FFFFFF" w:themeColor="background1"/>
       </w:tblBorders>
+      <w:tblCellMar>
+        <w:top w:w="0" w:type="dxa"/>
+        <w:left w:w="108" w:type="dxa"/>
+        <w:bottom w:w="0" w:type="dxa"/>
+        <w:right w:w="108" w:type="dxa"/>
+      </w:tblCellMar>
     </w:tblPr>
     <w:tcPr>
       <w:shd w:val="clear" w:color="auto" w:fill="FEF4EC" w:themeFill="accent6" w:themeFillTint="19"/>
@@ -13172,6 +13761,13 @@
     <w:tblPr>
       <w:tblStyleRowBandSize w:val="1"/>
       <w:tblStyleColBandSize w:val="1"/>
+      <w:tblInd w:w="0" w:type="dxa"/>
+      <w:tblCellMar>
+        <w:top w:w="0" w:type="dxa"/>
+        <w:left w:w="108" w:type="dxa"/>
+        <w:bottom w:w="0" w:type="dxa"/>
+        <w:right w:w="108" w:type="dxa"/>
+      </w:tblCellMar>
     </w:tblPr>
     <w:tcPr>
       <w:shd w:val="clear" w:color="auto" w:fill="E6E6E6" w:themeFill="text1" w:themeFillTint="19"/>
@@ -13251,6 +13847,13 @@
     <w:tblPr>
       <w:tblStyleRowBandSize w:val="1"/>
       <w:tblStyleColBandSize w:val="1"/>
+      <w:tblInd w:w="0" w:type="dxa"/>
+      <w:tblCellMar>
+        <w:top w:w="0" w:type="dxa"/>
+        <w:left w:w="108" w:type="dxa"/>
+        <w:bottom w:w="0" w:type="dxa"/>
+        <w:right w:w="108" w:type="dxa"/>
+      </w:tblCellMar>
     </w:tblPr>
     <w:tcPr>
       <w:shd w:val="clear" w:color="auto" w:fill="EDF2F8" w:themeFill="accent1" w:themeFillTint="19"/>
@@ -13330,6 +13933,13 @@
     <w:tblPr>
       <w:tblStyleRowBandSize w:val="1"/>
       <w:tblStyleColBandSize w:val="1"/>
+      <w:tblInd w:w="0" w:type="dxa"/>
+      <w:tblCellMar>
+        <w:top w:w="0" w:type="dxa"/>
+        <w:left w:w="108" w:type="dxa"/>
+        <w:bottom w:w="0" w:type="dxa"/>
+        <w:right w:w="108" w:type="dxa"/>
+      </w:tblCellMar>
     </w:tblPr>
     <w:tcPr>
       <w:shd w:val="clear" w:color="auto" w:fill="F8EDED" w:themeFill="accent2" w:themeFillTint="19"/>
@@ -13409,6 +14019,13 @@
     <w:tblPr>
       <w:tblStyleRowBandSize w:val="1"/>
       <w:tblStyleColBandSize w:val="1"/>
+      <w:tblInd w:w="0" w:type="dxa"/>
+      <w:tblCellMar>
+        <w:top w:w="0" w:type="dxa"/>
+        <w:left w:w="108" w:type="dxa"/>
+        <w:bottom w:w="0" w:type="dxa"/>
+        <w:right w:w="108" w:type="dxa"/>
+      </w:tblCellMar>
     </w:tblPr>
     <w:tcPr>
       <w:shd w:val="clear" w:color="auto" w:fill="F5F8EE" w:themeFill="accent3" w:themeFillTint="19"/>
@@ -13488,6 +14105,13 @@
     <w:tblPr>
       <w:tblStyleRowBandSize w:val="1"/>
       <w:tblStyleColBandSize w:val="1"/>
+      <w:tblInd w:w="0" w:type="dxa"/>
+      <w:tblCellMar>
+        <w:top w:w="0" w:type="dxa"/>
+        <w:left w:w="108" w:type="dxa"/>
+        <w:bottom w:w="0" w:type="dxa"/>
+        <w:right w:w="108" w:type="dxa"/>
+      </w:tblCellMar>
     </w:tblPr>
     <w:tcPr>
       <w:shd w:val="clear" w:color="auto" w:fill="F2EFF6" w:themeFill="accent4" w:themeFillTint="19"/>
@@ -13567,6 +14191,13 @@
     <w:tblPr>
       <w:tblStyleRowBandSize w:val="1"/>
       <w:tblStyleColBandSize w:val="1"/>
+      <w:tblInd w:w="0" w:type="dxa"/>
+      <w:tblCellMar>
+        <w:top w:w="0" w:type="dxa"/>
+        <w:left w:w="108" w:type="dxa"/>
+        <w:bottom w:w="0" w:type="dxa"/>
+        <w:right w:w="108" w:type="dxa"/>
+      </w:tblCellMar>
     </w:tblPr>
     <w:tcPr>
       <w:shd w:val="clear" w:color="auto" w:fill="EDF6F9" w:themeFill="accent5" w:themeFillTint="19"/>
@@ -13646,6 +14277,13 @@
     <w:tblPr>
       <w:tblStyleRowBandSize w:val="1"/>
       <w:tblStyleColBandSize w:val="1"/>
+      <w:tblInd w:w="0" w:type="dxa"/>
+      <w:tblCellMar>
+        <w:top w:w="0" w:type="dxa"/>
+        <w:left w:w="108" w:type="dxa"/>
+        <w:bottom w:w="0" w:type="dxa"/>
+        <w:right w:w="108" w:type="dxa"/>
+      </w:tblCellMar>
     </w:tblPr>
     <w:tcPr>
       <w:shd w:val="clear" w:color="auto" w:fill="FEF4EC" w:themeFill="accent6" w:themeFillTint="19"/>
@@ -13725,9 +14363,16 @@
     <w:tblPr>
       <w:tblStyleRowBandSize w:val="1"/>
       <w:tblStyleColBandSize w:val="1"/>
+      <w:tblInd w:w="0" w:type="dxa"/>
       <w:tblBorders>
         <w:insideH w:val="single" w:sz="4" w:space="0" w:color="FFFFFF" w:themeColor="background1"/>
       </w:tblBorders>
+      <w:tblCellMar>
+        <w:top w:w="0" w:type="dxa"/>
+        <w:left w:w="108" w:type="dxa"/>
+        <w:bottom w:w="0" w:type="dxa"/>
+        <w:right w:w="108" w:type="dxa"/>
+      </w:tblCellMar>
     </w:tblPr>
     <w:tcPr>
       <w:shd w:val="clear" w:color="auto" w:fill="CCCCCC" w:themeFill="text1" w:themeFillTint="33"/>
@@ -13798,9 +14443,16 @@
     <w:tblPr>
       <w:tblStyleRowBandSize w:val="1"/>
       <w:tblStyleColBandSize w:val="1"/>
+      <w:tblInd w:w="0" w:type="dxa"/>
       <w:tblBorders>
         <w:insideH w:val="single" w:sz="4" w:space="0" w:color="FFFFFF" w:themeColor="background1"/>
       </w:tblBorders>
+      <w:tblCellMar>
+        <w:top w:w="0" w:type="dxa"/>
+        <w:left w:w="108" w:type="dxa"/>
+        <w:bottom w:w="0" w:type="dxa"/>
+        <w:right w:w="108" w:type="dxa"/>
+      </w:tblCellMar>
     </w:tblPr>
     <w:tcPr>
       <w:shd w:val="clear" w:color="auto" w:fill="DBE5F1" w:themeFill="accent1" w:themeFillTint="33"/>
@@ -13871,9 +14523,16 @@
     <w:tblPr>
       <w:tblStyleRowBandSize w:val="1"/>
       <w:tblStyleColBandSize w:val="1"/>
+      <w:tblInd w:w="0" w:type="dxa"/>
       <w:tblBorders>
         <w:insideH w:val="single" w:sz="4" w:space="0" w:color="FFFFFF" w:themeColor="background1"/>
       </w:tblBorders>
+      <w:tblCellMar>
+        <w:top w:w="0" w:type="dxa"/>
+        <w:left w:w="108" w:type="dxa"/>
+        <w:bottom w:w="0" w:type="dxa"/>
+        <w:right w:w="108" w:type="dxa"/>
+      </w:tblCellMar>
     </w:tblPr>
     <w:tcPr>
       <w:shd w:val="clear" w:color="auto" w:fill="F2DBDB" w:themeFill="accent2" w:themeFillTint="33"/>
@@ -13944,9 +14603,16 @@
     <w:tblPr>
       <w:tblStyleRowBandSize w:val="1"/>
       <w:tblStyleColBandSize w:val="1"/>
+      <w:tblInd w:w="0" w:type="dxa"/>
       <w:tblBorders>
         <w:insideH w:val="single" w:sz="4" w:space="0" w:color="FFFFFF" w:themeColor="background1"/>
       </w:tblBorders>
+      <w:tblCellMar>
+        <w:top w:w="0" w:type="dxa"/>
+        <w:left w:w="108" w:type="dxa"/>
+        <w:bottom w:w="0" w:type="dxa"/>
+        <w:right w:w="108" w:type="dxa"/>
+      </w:tblCellMar>
     </w:tblPr>
     <w:tcPr>
       <w:shd w:val="clear" w:color="auto" w:fill="EAF1DD" w:themeFill="accent3" w:themeFillTint="33"/>
@@ -14017,9 +14683,16 @@
     <w:tblPr>
       <w:tblStyleRowBandSize w:val="1"/>
       <w:tblStyleColBandSize w:val="1"/>
+      <w:tblInd w:w="0" w:type="dxa"/>
       <w:tblBorders>
         <w:insideH w:val="single" w:sz="4" w:space="0" w:color="FFFFFF" w:themeColor="background1"/>
       </w:tblBorders>
+      <w:tblCellMar>
+        <w:top w:w="0" w:type="dxa"/>
+        <w:left w:w="108" w:type="dxa"/>
+        <w:bottom w:w="0" w:type="dxa"/>
+        <w:right w:w="108" w:type="dxa"/>
+      </w:tblCellMar>
     </w:tblPr>
     <w:tcPr>
       <w:shd w:val="clear" w:color="auto" w:fill="E5DFEC" w:themeFill="accent4" w:themeFillTint="33"/>
@@ -14090,9 +14763,16 @@
     <w:tblPr>
       <w:tblStyleRowBandSize w:val="1"/>
       <w:tblStyleColBandSize w:val="1"/>
+      <w:tblInd w:w="0" w:type="dxa"/>
       <w:tblBorders>
         <w:insideH w:val="single" w:sz="4" w:space="0" w:color="FFFFFF" w:themeColor="background1"/>
       </w:tblBorders>
+      <w:tblCellMar>
+        <w:top w:w="0" w:type="dxa"/>
+        <w:left w:w="108" w:type="dxa"/>
+        <w:bottom w:w="0" w:type="dxa"/>
+        <w:right w:w="108" w:type="dxa"/>
+      </w:tblCellMar>
     </w:tblPr>
     <w:tcPr>
       <w:shd w:val="clear" w:color="auto" w:fill="DAEEF3" w:themeFill="accent5" w:themeFillTint="33"/>
@@ -14163,9 +14843,16 @@
     <w:tblPr>
       <w:tblStyleRowBandSize w:val="1"/>
       <w:tblStyleColBandSize w:val="1"/>
+      <w:tblInd w:w="0" w:type="dxa"/>
       <w:tblBorders>
         <w:insideH w:val="single" w:sz="4" w:space="0" w:color="FFFFFF" w:themeColor="background1"/>
       </w:tblBorders>
+      <w:tblCellMar>
+        <w:top w:w="0" w:type="dxa"/>
+        <w:left w:w="108" w:type="dxa"/>
+        <w:bottom w:w="0" w:type="dxa"/>
+        <w:right w:w="108" w:type="dxa"/>
+      </w:tblCellMar>
     </w:tblPr>
     <w:tcPr>
       <w:shd w:val="clear" w:color="auto" w:fill="FDE9D9" w:themeFill="accent6" w:themeFillTint="33"/>
@@ -15363,6 +16050,7 @@
       <w:spacing w:after="0" w:line="240" w:lineRule="auto"/>
     </w:pPr>
     <w:tblPr>
+      <w:tblInd w:w="0" w:type="dxa"/>
       <w:tblBorders>
         <w:top w:val="single" w:sz="4" w:space="0" w:color="auto"/>
         <w:left w:val="single" w:sz="4" w:space="0" w:color="auto"/>
@@ -15371,6 +16059,12 @@
         <w:insideH w:val="single" w:sz="4" w:space="0" w:color="auto"/>
         <w:insideV w:val="single" w:sz="4" w:space="0" w:color="auto"/>
       </w:tblBorders>
+      <w:tblCellMar>
+        <w:top w:w="0" w:type="dxa"/>
+        <w:left w:w="108" w:type="dxa"/>
+        <w:bottom w:w="0" w:type="dxa"/>
+        <w:right w:w="108" w:type="dxa"/>
+      </w:tblCellMar>
     </w:tblPr>
   </w:style>
   <w:style w:type="table" w:styleId="aff1">
@@ -15387,10 +16081,17 @@
     <w:tblPr>
       <w:tblStyleRowBandSize w:val="1"/>
       <w:tblStyleColBandSize w:val="1"/>
+      <w:tblInd w:w="0" w:type="dxa"/>
       <w:tblBorders>
         <w:top w:val="single" w:sz="8" w:space="0" w:color="000000" w:themeColor="text1"/>
         <w:bottom w:val="single" w:sz="8" w:space="0" w:color="000000" w:themeColor="text1"/>
       </w:tblBorders>
+      <w:tblCellMar>
+        <w:top w:w="0" w:type="dxa"/>
+        <w:left w:w="108" w:type="dxa"/>
+        <w:bottom w:w="0" w:type="dxa"/>
+        <w:right w:w="108" w:type="dxa"/>
+      </w:tblCellMar>
     </w:tblPr>
     <w:tblStylePr w:type="firstRow">
       <w:pPr>
@@ -15483,10 +16184,17 @@
     <w:tblPr>
       <w:tblStyleRowBandSize w:val="1"/>
       <w:tblStyleColBandSize w:val="1"/>
+      <w:tblInd w:w="0" w:type="dxa"/>
       <w:tblBorders>
         <w:top w:val="single" w:sz="8" w:space="0" w:color="4F81BD" w:themeColor="accent1"/>
         <w:bottom w:val="single" w:sz="8" w:space="0" w:color="4F81BD" w:themeColor="accent1"/>
       </w:tblBorders>
+      <w:tblCellMar>
+        <w:top w:w="0" w:type="dxa"/>
+        <w:left w:w="108" w:type="dxa"/>
+        <w:bottom w:w="0" w:type="dxa"/>
+        <w:right w:w="108" w:type="dxa"/>
+      </w:tblCellMar>
     </w:tblPr>
     <w:tblStylePr w:type="firstRow">
       <w:pPr>
@@ -15579,10 +16287,17 @@
     <w:tblPr>
       <w:tblStyleRowBandSize w:val="1"/>
       <w:tblStyleColBandSize w:val="1"/>
+      <w:tblInd w:w="0" w:type="dxa"/>
       <w:tblBorders>
         <w:top w:val="single" w:sz="8" w:space="0" w:color="C0504D" w:themeColor="accent2"/>
         <w:bottom w:val="single" w:sz="8" w:space="0" w:color="C0504D" w:themeColor="accent2"/>
       </w:tblBorders>
+      <w:tblCellMar>
+        <w:top w:w="0" w:type="dxa"/>
+        <w:left w:w="108" w:type="dxa"/>
+        <w:bottom w:w="0" w:type="dxa"/>
+        <w:right w:w="108" w:type="dxa"/>
+      </w:tblCellMar>
     </w:tblPr>
     <w:tblStylePr w:type="firstRow">
       <w:pPr>
@@ -15675,10 +16390,17 @@
     <w:tblPr>
       <w:tblStyleRowBandSize w:val="1"/>
       <w:tblStyleColBandSize w:val="1"/>
+      <w:tblInd w:w="0" w:type="dxa"/>
       <w:tblBorders>
         <w:top w:val="single" w:sz="8" w:space="0" w:color="9BBB59" w:themeColor="accent3"/>
         <w:bottom w:val="single" w:sz="8" w:space="0" w:color="9BBB59" w:themeColor="accent3"/>
       </w:tblBorders>
+      <w:tblCellMar>
+        <w:top w:w="0" w:type="dxa"/>
+        <w:left w:w="108" w:type="dxa"/>
+        <w:bottom w:w="0" w:type="dxa"/>
+        <w:right w:w="108" w:type="dxa"/>
+      </w:tblCellMar>
     </w:tblPr>
     <w:tblStylePr w:type="firstRow">
       <w:pPr>
@@ -15771,10 +16493,17 @@
     <w:tblPr>
       <w:tblStyleRowBandSize w:val="1"/>
       <w:tblStyleColBandSize w:val="1"/>
+      <w:tblInd w:w="0" w:type="dxa"/>
       <w:tblBorders>
         <w:top w:val="single" w:sz="8" w:space="0" w:color="8064A2" w:themeColor="accent4"/>
         <w:bottom w:val="single" w:sz="8" w:space="0" w:color="8064A2" w:themeColor="accent4"/>
       </w:tblBorders>
+      <w:tblCellMar>
+        <w:top w:w="0" w:type="dxa"/>
+        <w:left w:w="108" w:type="dxa"/>
+        <w:bottom w:w="0" w:type="dxa"/>
+        <w:right w:w="108" w:type="dxa"/>
+      </w:tblCellMar>
     </w:tblPr>
     <w:tblStylePr w:type="firstRow">
       <w:pPr>
@@ -15867,10 +16596,17 @@
     <w:tblPr>
       <w:tblStyleRowBandSize w:val="1"/>
       <w:tblStyleColBandSize w:val="1"/>
+      <w:tblInd w:w="0" w:type="dxa"/>
       <w:tblBorders>
         <w:top w:val="single" w:sz="8" w:space="0" w:color="4BACC6" w:themeColor="accent5"/>
         <w:bottom w:val="single" w:sz="8" w:space="0" w:color="4BACC6" w:themeColor="accent5"/>
       </w:tblBorders>
+      <w:tblCellMar>
+        <w:top w:w="0" w:type="dxa"/>
+        <w:left w:w="108" w:type="dxa"/>
+        <w:bottom w:w="0" w:type="dxa"/>
+        <w:right w:w="108" w:type="dxa"/>
+      </w:tblCellMar>
     </w:tblPr>
     <w:tblStylePr w:type="firstRow">
       <w:pPr>
@@ -15963,10 +16699,17 @@
     <w:tblPr>
       <w:tblStyleRowBandSize w:val="1"/>
       <w:tblStyleColBandSize w:val="1"/>
+      <w:tblInd w:w="0" w:type="dxa"/>
       <w:tblBorders>
         <w:top w:val="single" w:sz="8" w:space="0" w:color="F79646" w:themeColor="accent6"/>
         <w:bottom w:val="single" w:sz="8" w:space="0" w:color="F79646" w:themeColor="accent6"/>
       </w:tblBorders>
+      <w:tblCellMar>
+        <w:top w:w="0" w:type="dxa"/>
+        <w:left w:w="108" w:type="dxa"/>
+        <w:bottom w:w="0" w:type="dxa"/>
+        <w:right w:w="108" w:type="dxa"/>
+      </w:tblCellMar>
     </w:tblPr>
     <w:tblStylePr w:type="firstRow">
       <w:pPr>
@@ -16056,12 +16799,19 @@
     <w:tblPr>
       <w:tblStyleRowBandSize w:val="1"/>
       <w:tblStyleColBandSize w:val="1"/>
+      <w:tblInd w:w="0" w:type="dxa"/>
       <w:tblBorders>
         <w:top w:val="single" w:sz="8" w:space="0" w:color="000000" w:themeColor="text1"/>
         <w:left w:val="single" w:sz="8" w:space="0" w:color="000000" w:themeColor="text1"/>
         <w:bottom w:val="single" w:sz="8" w:space="0" w:color="000000" w:themeColor="text1"/>
         <w:right w:val="single" w:sz="8" w:space="0" w:color="000000" w:themeColor="text1"/>
       </w:tblBorders>
+      <w:tblCellMar>
+        <w:top w:w="0" w:type="dxa"/>
+        <w:left w:w="108" w:type="dxa"/>
+        <w:bottom w:w="0" w:type="dxa"/>
+        <w:right w:w="108" w:type="dxa"/>
+      </w:tblCellMar>
     </w:tblPr>
     <w:tblStylePr w:type="firstRow">
       <w:pPr>
@@ -16141,12 +16891,19 @@
     <w:tblPr>
       <w:tblStyleRowBandSize w:val="1"/>
       <w:tblStyleColBandSize w:val="1"/>
+      <w:tblInd w:w="0" w:type="dxa"/>
       <w:tblBorders>
         <w:top w:val="single" w:sz="8" w:space="0" w:color="4F81BD" w:themeColor="accent1"/>
         <w:left w:val="single" w:sz="8" w:space="0" w:color="4F81BD" w:themeColor="accent1"/>
         <w:bottom w:val="single" w:sz="8" w:space="0" w:color="4F81BD" w:themeColor="accent1"/>
         <w:right w:val="single" w:sz="8" w:space="0" w:color="4F81BD" w:themeColor="accent1"/>
       </w:tblBorders>
+      <w:tblCellMar>
+        <w:top w:w="0" w:type="dxa"/>
+        <w:left w:w="108" w:type="dxa"/>
+        <w:bottom w:w="0" w:type="dxa"/>
+        <w:right w:w="108" w:type="dxa"/>
+      </w:tblCellMar>
     </w:tblPr>
     <w:tblStylePr w:type="firstRow">
       <w:pPr>
@@ -16226,12 +16983,19 @@
     <w:tblPr>
       <w:tblStyleRowBandSize w:val="1"/>
       <w:tblStyleColBandSize w:val="1"/>
+      <w:tblInd w:w="0" w:type="dxa"/>
       <w:tblBorders>
         <w:top w:val="single" w:sz="8" w:space="0" w:color="C0504D" w:themeColor="accent2"/>
         <w:left w:val="single" w:sz="8" w:space="0" w:color="C0504D" w:themeColor="accent2"/>
         <w:bottom w:val="single" w:sz="8" w:space="0" w:color="C0504D" w:themeColor="accent2"/>
         <w:right w:val="single" w:sz="8" w:space="0" w:color="C0504D" w:themeColor="accent2"/>
       </w:tblBorders>
+      <w:tblCellMar>
+        <w:top w:w="0" w:type="dxa"/>
+        <w:left w:w="108" w:type="dxa"/>
+        <w:bottom w:w="0" w:type="dxa"/>
+        <w:right w:w="108" w:type="dxa"/>
+      </w:tblCellMar>
     </w:tblPr>
     <w:tblStylePr w:type="firstRow">
       <w:pPr>
@@ -16311,12 +17075,19 @@
     <w:tblPr>
       <w:tblStyleRowBandSize w:val="1"/>
       <w:tblStyleColBandSize w:val="1"/>
+      <w:tblInd w:w="0" w:type="dxa"/>
       <w:tblBorders>
         <w:top w:val="single" w:sz="8" w:space="0" w:color="9BBB59" w:themeColor="accent3"/>
         <w:left w:val="single" w:sz="8" w:space="0" w:color="9BBB59" w:themeColor="accent3"/>
         <w:bottom w:val="single" w:sz="8" w:space="0" w:color="9BBB59" w:themeColor="accent3"/>
         <w:right w:val="single" w:sz="8" w:space="0" w:color="9BBB59" w:themeColor="accent3"/>
       </w:tblBorders>
+      <w:tblCellMar>
+        <w:top w:w="0" w:type="dxa"/>
+        <w:left w:w="108" w:type="dxa"/>
+        <w:bottom w:w="0" w:type="dxa"/>
+        <w:right w:w="108" w:type="dxa"/>
+      </w:tblCellMar>
     </w:tblPr>
     <w:tblStylePr w:type="firstRow">
       <w:pPr>
@@ -16396,12 +17167,19 @@
     <w:tblPr>
       <w:tblStyleRowBandSize w:val="1"/>
       <w:tblStyleColBandSize w:val="1"/>
+      <w:tblInd w:w="0" w:type="dxa"/>
       <w:tblBorders>
         <w:top w:val="single" w:sz="8" w:space="0" w:color="8064A2" w:themeColor="accent4"/>
         <w:left w:val="single" w:sz="8" w:space="0" w:color="8064A2" w:themeColor="accent4"/>
         <w:bottom w:val="single" w:sz="8" w:space="0" w:color="8064A2" w:themeColor="accent4"/>
         <w:right w:val="single" w:sz="8" w:space="0" w:color="8064A2" w:themeColor="accent4"/>
       </w:tblBorders>
+      <w:tblCellMar>
+        <w:top w:w="0" w:type="dxa"/>
+        <w:left w:w="108" w:type="dxa"/>
+        <w:bottom w:w="0" w:type="dxa"/>
+        <w:right w:w="108" w:type="dxa"/>
+      </w:tblCellMar>
     </w:tblPr>
     <w:tblStylePr w:type="firstRow">
       <w:pPr>
@@ -16481,12 +17259,19 @@
     <w:tblPr>
       <w:tblStyleRowBandSize w:val="1"/>
       <w:tblStyleColBandSize w:val="1"/>
+      <w:tblInd w:w="0" w:type="dxa"/>
       <w:tblBorders>
         <w:top w:val="single" w:sz="8" w:space="0" w:color="4BACC6" w:themeColor="accent5"/>
         <w:left w:val="single" w:sz="8" w:space="0" w:color="4BACC6" w:themeColor="accent5"/>
         <w:bottom w:val="single" w:sz="8" w:space="0" w:color="4BACC6" w:themeColor="accent5"/>
         <w:right w:val="single" w:sz="8" w:space="0" w:color="4BACC6" w:themeColor="accent5"/>
       </w:tblBorders>
+      <w:tblCellMar>
+        <w:top w:w="0" w:type="dxa"/>
+        <w:left w:w="108" w:type="dxa"/>
+        <w:bottom w:w="0" w:type="dxa"/>
+        <w:right w:w="108" w:type="dxa"/>
+      </w:tblCellMar>
     </w:tblPr>
     <w:tblStylePr w:type="firstRow">
       <w:pPr>
@@ -16566,12 +17351,19 @@
     <w:tblPr>
       <w:tblStyleRowBandSize w:val="1"/>
       <w:tblStyleColBandSize w:val="1"/>
+      <w:tblInd w:w="0" w:type="dxa"/>
       <w:tblBorders>
         <w:top w:val="single" w:sz="8" w:space="0" w:color="F79646" w:themeColor="accent6"/>
         <w:left w:val="single" w:sz="8" w:space="0" w:color="F79646" w:themeColor="accent6"/>
         <w:bottom w:val="single" w:sz="8" w:space="0" w:color="F79646" w:themeColor="accent6"/>
         <w:right w:val="single" w:sz="8" w:space="0" w:color="F79646" w:themeColor="accent6"/>
       </w:tblBorders>
+      <w:tblCellMar>
+        <w:top w:w="0" w:type="dxa"/>
+        <w:left w:w="108" w:type="dxa"/>
+        <w:bottom w:w="0" w:type="dxa"/>
+        <w:right w:w="108" w:type="dxa"/>
+      </w:tblCellMar>
     </w:tblPr>
     <w:tblStylePr w:type="firstRow">
       <w:pPr>
@@ -16651,6 +17443,7 @@
     <w:tblPr>
       <w:tblStyleRowBandSize w:val="1"/>
       <w:tblStyleColBandSize w:val="1"/>
+      <w:tblInd w:w="0" w:type="dxa"/>
       <w:tblBorders>
         <w:top w:val="single" w:sz="8" w:space="0" w:color="000000" w:themeColor="text1"/>
         <w:left w:val="single" w:sz="8" w:space="0" w:color="000000" w:themeColor="text1"/>
@@ -16659,6 +17452,12 @@
         <w:insideH w:val="single" w:sz="8" w:space="0" w:color="000000" w:themeColor="text1"/>
         <w:insideV w:val="single" w:sz="8" w:space="0" w:color="000000" w:themeColor="text1"/>
       </w:tblBorders>
+      <w:tblCellMar>
+        <w:top w:w="0" w:type="dxa"/>
+        <w:left w:w="108" w:type="dxa"/>
+        <w:bottom w:w="0" w:type="dxa"/>
+        <w:right w:w="108" w:type="dxa"/>
+      </w:tblCellMar>
     </w:tblPr>
     <w:tblStylePr w:type="firstRow">
       <w:pPr>
@@ -16774,6 +17573,7 @@
     <w:tblPr>
       <w:tblStyleRowBandSize w:val="1"/>
       <w:tblStyleColBandSize w:val="1"/>
+      <w:tblInd w:w="0" w:type="dxa"/>
       <w:tblBorders>
         <w:top w:val="single" w:sz="8" w:space="0" w:color="4F81BD" w:themeColor="accent1"/>
         <w:left w:val="single" w:sz="8" w:space="0" w:color="4F81BD" w:themeColor="accent1"/>
@@ -16782,6 +17582,12 @@
         <w:insideH w:val="single" w:sz="8" w:space="0" w:color="4F81BD" w:themeColor="accent1"/>
         <w:insideV w:val="single" w:sz="8" w:space="0" w:color="4F81BD" w:themeColor="accent1"/>
       </w:tblBorders>
+      <w:tblCellMar>
+        <w:top w:w="0" w:type="dxa"/>
+        <w:left w:w="108" w:type="dxa"/>
+        <w:bottom w:w="0" w:type="dxa"/>
+        <w:right w:w="108" w:type="dxa"/>
+      </w:tblCellMar>
     </w:tblPr>
     <w:tblStylePr w:type="firstRow">
       <w:pPr>
@@ -16897,6 +17703,7 @@
     <w:tblPr>
       <w:tblStyleRowBandSize w:val="1"/>
       <w:tblStyleColBandSize w:val="1"/>
+      <w:tblInd w:w="0" w:type="dxa"/>
       <w:tblBorders>
         <w:top w:val="single" w:sz="8" w:space="0" w:color="C0504D" w:themeColor="accent2"/>
         <w:left w:val="single" w:sz="8" w:space="0" w:color="C0504D" w:themeColor="accent2"/>
@@ -16905,6 +17712,12 @@
         <w:insideH w:val="single" w:sz="8" w:space="0" w:color="C0504D" w:themeColor="accent2"/>
         <w:insideV w:val="single" w:sz="8" w:space="0" w:color="C0504D" w:themeColor="accent2"/>
       </w:tblBorders>
+      <w:tblCellMar>
+        <w:top w:w="0" w:type="dxa"/>
+        <w:left w:w="108" w:type="dxa"/>
+        <w:bottom w:w="0" w:type="dxa"/>
+        <w:right w:w="108" w:type="dxa"/>
+      </w:tblCellMar>
     </w:tblPr>
     <w:tblStylePr w:type="firstRow">
       <w:pPr>
@@ -17020,6 +17833,7 @@
     <w:tblPr>
       <w:tblStyleRowBandSize w:val="1"/>
       <w:tblStyleColBandSize w:val="1"/>
+      <w:tblInd w:w="0" w:type="dxa"/>
       <w:tblBorders>
         <w:top w:val="single" w:sz="8" w:space="0" w:color="9BBB59" w:themeColor="accent3"/>
         <w:left w:val="single" w:sz="8" w:space="0" w:color="9BBB59" w:themeColor="accent3"/>
@@ -17028,6 +17842,12 @@
         <w:insideH w:val="single" w:sz="8" w:space="0" w:color="9BBB59" w:themeColor="accent3"/>
         <w:insideV w:val="single" w:sz="8" w:space="0" w:color="9BBB59" w:themeColor="accent3"/>
       </w:tblBorders>
+      <w:tblCellMar>
+        <w:top w:w="0" w:type="dxa"/>
+        <w:left w:w="108" w:type="dxa"/>
+        <w:bottom w:w="0" w:type="dxa"/>
+        <w:right w:w="108" w:type="dxa"/>
+      </w:tblCellMar>
     </w:tblPr>
     <w:tblStylePr w:type="firstRow">
       <w:pPr>
@@ -17143,6 +17963,7 @@
     <w:tblPr>
       <w:tblStyleRowBandSize w:val="1"/>
       <w:tblStyleColBandSize w:val="1"/>
+      <w:tblInd w:w="0" w:type="dxa"/>
       <w:tblBorders>
         <w:top w:val="single" w:sz="8" w:space="0" w:color="8064A2" w:themeColor="accent4"/>
         <w:left w:val="single" w:sz="8" w:space="0" w:color="8064A2" w:themeColor="accent4"/>
@@ -17151,6 +17972,12 @@
         <w:insideH w:val="single" w:sz="8" w:space="0" w:color="8064A2" w:themeColor="accent4"/>
         <w:insideV w:val="single" w:sz="8" w:space="0" w:color="8064A2" w:themeColor="accent4"/>
       </w:tblBorders>
+      <w:tblCellMar>
+        <w:top w:w="0" w:type="dxa"/>
+        <w:left w:w="108" w:type="dxa"/>
+        <w:bottom w:w="0" w:type="dxa"/>
+        <w:right w:w="108" w:type="dxa"/>
+      </w:tblCellMar>
     </w:tblPr>
     <w:tblStylePr w:type="firstRow">
       <w:pPr>
@@ -17266,6 +18093,7 @@
     <w:tblPr>
       <w:tblStyleRowBandSize w:val="1"/>
       <w:tblStyleColBandSize w:val="1"/>
+      <w:tblInd w:w="0" w:type="dxa"/>
       <w:tblBorders>
         <w:top w:val="single" w:sz="8" w:space="0" w:color="4BACC6" w:themeColor="accent5"/>
         <w:left w:val="single" w:sz="8" w:space="0" w:color="4BACC6" w:themeColor="accent5"/>
@@ -17274,6 +18102,12 @@
         <w:insideH w:val="single" w:sz="8" w:space="0" w:color="4BACC6" w:themeColor="accent5"/>
         <w:insideV w:val="single" w:sz="8" w:space="0" w:color="4BACC6" w:themeColor="accent5"/>
       </w:tblBorders>
+      <w:tblCellMar>
+        <w:top w:w="0" w:type="dxa"/>
+        <w:left w:w="108" w:type="dxa"/>
+        <w:bottom w:w="0" w:type="dxa"/>
+        <w:right w:w="108" w:type="dxa"/>
+      </w:tblCellMar>
     </w:tblPr>
     <w:tblStylePr w:type="firstRow">
       <w:pPr>
@@ -17389,6 +18223,7 @@
     <w:tblPr>
       <w:tblStyleRowBandSize w:val="1"/>
       <w:tblStyleColBandSize w:val="1"/>
+      <w:tblInd w:w="0" w:type="dxa"/>
       <w:tblBorders>
         <w:top w:val="single" w:sz="8" w:space="0" w:color="F79646" w:themeColor="accent6"/>
         <w:left w:val="single" w:sz="8" w:space="0" w:color="F79646" w:themeColor="accent6"/>
@@ -17397,6 +18232,12 @@
         <w:insideH w:val="single" w:sz="8" w:space="0" w:color="F79646" w:themeColor="accent6"/>
         <w:insideV w:val="single" w:sz="8" w:space="0" w:color="F79646" w:themeColor="accent6"/>
       </w:tblBorders>
+      <w:tblCellMar>
+        <w:top w:w="0" w:type="dxa"/>
+        <w:left w:w="108" w:type="dxa"/>
+        <w:bottom w:w="0" w:type="dxa"/>
+        <w:right w:w="108" w:type="dxa"/>
+      </w:tblCellMar>
     </w:tblPr>
     <w:tblStylePr w:type="firstRow">
       <w:pPr>
@@ -17512,6 +18353,7 @@
     <w:tblPr>
       <w:tblStyleRowBandSize w:val="1"/>
       <w:tblStyleColBandSize w:val="1"/>
+      <w:tblInd w:w="0" w:type="dxa"/>
       <w:tblBorders>
         <w:top w:val="single" w:sz="8" w:space="0" w:color="404040" w:themeColor="text1" w:themeTint="BF"/>
         <w:left w:val="single" w:sz="8" w:space="0" w:color="404040" w:themeColor="text1" w:themeTint="BF"/>
@@ -17519,6 +18361,12 @@
         <w:right w:val="single" w:sz="8" w:space="0" w:color="404040" w:themeColor="text1" w:themeTint="BF"/>
         <w:insideH w:val="single" w:sz="8" w:space="0" w:color="404040" w:themeColor="text1" w:themeTint="BF"/>
       </w:tblBorders>
+      <w:tblCellMar>
+        <w:top w:w="0" w:type="dxa"/>
+        <w:left w:w="108" w:type="dxa"/>
+        <w:bottom w:w="0" w:type="dxa"/>
+        <w:right w:w="108" w:type="dxa"/>
+      </w:tblCellMar>
     </w:tblPr>
     <w:tblStylePr w:type="firstRow">
       <w:pPr>
@@ -17611,6 +18459,7 @@
     <w:tblPr>
       <w:tblStyleRowBandSize w:val="1"/>
       <w:tblStyleColBandSize w:val="1"/>
+      <w:tblInd w:w="0" w:type="dxa"/>
       <w:tblBorders>
         <w:top w:val="single" w:sz="8" w:space="0" w:color="7BA0CD" w:themeColor="accent1" w:themeTint="BF"/>
         <w:left w:val="single" w:sz="8" w:space="0" w:color="7BA0CD" w:themeColor="accent1" w:themeTint="BF"/>
@@ -17618,6 +18467,12 @@
         <w:right w:val="single" w:sz="8" w:space="0" w:color="7BA0CD" w:themeColor="accent1" w:themeTint="BF"/>
         <w:insideH w:val="single" w:sz="8" w:space="0" w:color="7BA0CD" w:themeColor="accent1" w:themeTint="BF"/>
       </w:tblBorders>
+      <w:tblCellMar>
+        <w:top w:w="0" w:type="dxa"/>
+        <w:left w:w="108" w:type="dxa"/>
+        <w:bottom w:w="0" w:type="dxa"/>
+        <w:right w:w="108" w:type="dxa"/>
+      </w:tblCellMar>
     </w:tblPr>
     <w:tblStylePr w:type="firstRow">
       <w:pPr>
@@ -17710,6 +18565,7 @@
     <w:tblPr>
       <w:tblStyleRowBandSize w:val="1"/>
       <w:tblStyleColBandSize w:val="1"/>
+      <w:tblInd w:w="0" w:type="dxa"/>
       <w:tblBorders>
         <w:top w:val="single" w:sz="8" w:space="0" w:color="CF7B79" w:themeColor="accent2" w:themeTint="BF"/>
         <w:left w:val="single" w:sz="8" w:space="0" w:color="CF7B79" w:themeColor="accent2" w:themeTint="BF"/>
@@ -17717,6 +18573,12 @@
         <w:right w:val="single" w:sz="8" w:space="0" w:color="CF7B79" w:themeColor="accent2" w:themeTint="BF"/>
         <w:insideH w:val="single" w:sz="8" w:space="0" w:color="CF7B79" w:themeColor="accent2" w:themeTint="BF"/>
       </w:tblBorders>
+      <w:tblCellMar>
+        <w:top w:w="0" w:type="dxa"/>
+        <w:left w:w="108" w:type="dxa"/>
+        <w:bottom w:w="0" w:type="dxa"/>
+        <w:right w:w="108" w:type="dxa"/>
+      </w:tblCellMar>
     </w:tblPr>
     <w:tblStylePr w:type="firstRow">
       <w:pPr>
@@ -17809,6 +18671,7 @@
     <w:tblPr>
       <w:tblStyleRowBandSize w:val="1"/>
       <w:tblStyleColBandSize w:val="1"/>
+      <w:tblInd w:w="0" w:type="dxa"/>
       <w:tblBorders>
         <w:top w:val="single" w:sz="8" w:space="0" w:color="B3CC82" w:themeColor="accent3" w:themeTint="BF"/>
         <w:left w:val="single" w:sz="8" w:space="0" w:color="B3CC82" w:themeColor="accent3" w:themeTint="BF"/>
@@ -17816,6 +18679,12 @@
         <w:right w:val="single" w:sz="8" w:space="0" w:color="B3CC82" w:themeColor="accent3" w:themeTint="BF"/>
         <w:insideH w:val="single" w:sz="8" w:space="0" w:color="B3CC82" w:themeColor="accent3" w:themeTint="BF"/>
       </w:tblBorders>
+      <w:tblCellMar>
+        <w:top w:w="0" w:type="dxa"/>
+        <w:left w:w="108" w:type="dxa"/>
+        <w:bottom w:w="0" w:type="dxa"/>
+        <w:right w:w="108" w:type="dxa"/>
+      </w:tblCellMar>
     </w:tblPr>
     <w:tblStylePr w:type="firstRow">
       <w:pPr>
@@ -17908,6 +18777,7 @@
     <w:tblPr>
       <w:tblStyleRowBandSize w:val="1"/>
       <w:tblStyleColBandSize w:val="1"/>
+      <w:tblInd w:w="0" w:type="dxa"/>
       <w:tblBorders>
         <w:top w:val="single" w:sz="8" w:space="0" w:color="9F8AB9" w:themeColor="accent4" w:themeTint="BF"/>
         <w:left w:val="single" w:sz="8" w:space="0" w:color="9F8AB9" w:themeColor="accent4" w:themeTint="BF"/>
@@ -17915,6 +18785,12 @@
         <w:right w:val="single" w:sz="8" w:space="0" w:color="9F8AB9" w:themeColor="accent4" w:themeTint="BF"/>
         <w:insideH w:val="single" w:sz="8" w:space="0" w:color="9F8AB9" w:themeColor="accent4" w:themeTint="BF"/>
       </w:tblBorders>
+      <w:tblCellMar>
+        <w:top w:w="0" w:type="dxa"/>
+        <w:left w:w="108" w:type="dxa"/>
+        <w:bottom w:w="0" w:type="dxa"/>
+        <w:right w:w="108" w:type="dxa"/>
+      </w:tblCellMar>
     </w:tblPr>
     <w:tblStylePr w:type="firstRow">
       <w:pPr>
@@ -18007,6 +18883,7 @@
     <w:tblPr>
       <w:tblStyleRowBandSize w:val="1"/>
       <w:tblStyleColBandSize w:val="1"/>
+      <w:tblInd w:w="0" w:type="dxa"/>
       <w:tblBorders>
         <w:top w:val="single" w:sz="8" w:space="0" w:color="78C0D4" w:themeColor="accent5" w:themeTint="BF"/>
         <w:left w:val="single" w:sz="8" w:space="0" w:color="78C0D4" w:themeColor="accent5" w:themeTint="BF"/>
@@ -18014,6 +18891,12 @@
         <w:right w:val="single" w:sz="8" w:space="0" w:color="78C0D4" w:themeColor="accent5" w:themeTint="BF"/>
         <w:insideH w:val="single" w:sz="8" w:space="0" w:color="78C0D4" w:themeColor="accent5" w:themeTint="BF"/>
       </w:tblBorders>
+      <w:tblCellMar>
+        <w:top w:w="0" w:type="dxa"/>
+        <w:left w:w="108" w:type="dxa"/>
+        <w:bottom w:w="0" w:type="dxa"/>
+        <w:right w:w="108" w:type="dxa"/>
+      </w:tblCellMar>
     </w:tblPr>
     <w:tblStylePr w:type="firstRow">
       <w:pPr>
@@ -18106,6 +18989,7 @@
     <w:tblPr>
       <w:tblStyleRowBandSize w:val="1"/>
       <w:tblStyleColBandSize w:val="1"/>
+      <w:tblInd w:w="0" w:type="dxa"/>
       <w:tblBorders>
         <w:top w:val="single" w:sz="8" w:space="0" w:color="F9B074" w:themeColor="accent6" w:themeTint="BF"/>
         <w:left w:val="single" w:sz="8" w:space="0" w:color="F9B074" w:themeColor="accent6" w:themeTint="BF"/>
@@ -18113,6 +18997,12 @@
         <w:right w:val="single" w:sz="8" w:space="0" w:color="F9B074" w:themeColor="accent6" w:themeTint="BF"/>
         <w:insideH w:val="single" w:sz="8" w:space="0" w:color="F9B074" w:themeColor="accent6" w:themeTint="BF"/>
       </w:tblBorders>
+      <w:tblCellMar>
+        <w:top w:w="0" w:type="dxa"/>
+        <w:left w:w="108" w:type="dxa"/>
+        <w:bottom w:w="0" w:type="dxa"/>
+        <w:right w:w="108" w:type="dxa"/>
+      </w:tblCellMar>
     </w:tblPr>
     <w:tblStylePr w:type="firstRow">
       <w:pPr>
@@ -18205,10 +19095,17 @@
     <w:tblPr>
       <w:tblStyleRowBandSize w:val="1"/>
       <w:tblStyleColBandSize w:val="1"/>
+      <w:tblInd w:w="0" w:type="dxa"/>
       <w:tblBorders>
         <w:top w:val="single" w:sz="18" w:space="0" w:color="auto"/>
         <w:bottom w:val="single" w:sz="18" w:space="0" w:color="auto"/>
       </w:tblBorders>
+      <w:tblCellMar>
+        <w:top w:w="0" w:type="dxa"/>
+        <w:left w:w="108" w:type="dxa"/>
+        <w:bottom w:w="0" w:type="dxa"/>
+        <w:right w:w="108" w:type="dxa"/>
+      </w:tblCellMar>
     </w:tblPr>
     <w:tblStylePr w:type="firstRow">
       <w:pPr>
@@ -18347,10 +19244,17 @@
     <w:tblPr>
       <w:tblStyleRowBandSize w:val="1"/>
       <w:tblStyleColBandSize w:val="1"/>
+      <w:tblInd w:w="0" w:type="dxa"/>
       <w:tblBorders>
         <w:top w:val="single" w:sz="18" w:space="0" w:color="auto"/>
         <w:bottom w:val="single" w:sz="18" w:space="0" w:color="auto"/>
       </w:tblBorders>
+      <w:tblCellMar>
+        <w:top w:w="0" w:type="dxa"/>
+        <w:left w:w="108" w:type="dxa"/>
+        <w:bottom w:w="0" w:type="dxa"/>
+        <w:right w:w="108" w:type="dxa"/>
+      </w:tblCellMar>
     </w:tblPr>
     <w:tblStylePr w:type="firstRow">
       <w:pPr>
@@ -18489,10 +19393,17 @@
     <w:tblPr>
       <w:tblStyleRowBandSize w:val="1"/>
       <w:tblStyleColBandSize w:val="1"/>
+      <w:tblInd w:w="0" w:type="dxa"/>
       <w:tblBorders>
         <w:top w:val="single" w:sz="18" w:space="0" w:color="auto"/>
         <w:bottom w:val="single" w:sz="18" w:space="0" w:color="auto"/>
       </w:tblBorders>
+      <w:tblCellMar>
+        <w:top w:w="0" w:type="dxa"/>
+        <w:left w:w="108" w:type="dxa"/>
+        <w:bottom w:w="0" w:type="dxa"/>
+        <w:right w:w="108" w:type="dxa"/>
+      </w:tblCellMar>
     </w:tblPr>
     <w:tblStylePr w:type="firstRow">
       <w:pPr>
@@ -18631,10 +19542,17 @@
     <w:tblPr>
       <w:tblStyleRowBandSize w:val="1"/>
       <w:tblStyleColBandSize w:val="1"/>
+      <w:tblInd w:w="0" w:type="dxa"/>
       <w:tblBorders>
         <w:top w:val="single" w:sz="18" w:space="0" w:color="auto"/>
         <w:bottom w:val="single" w:sz="18" w:space="0" w:color="auto"/>
       </w:tblBorders>
+      <w:tblCellMar>
+        <w:top w:w="0" w:type="dxa"/>
+        <w:left w:w="108" w:type="dxa"/>
+        <w:bottom w:w="0" w:type="dxa"/>
+        <w:right w:w="108" w:type="dxa"/>
+      </w:tblCellMar>
     </w:tblPr>
     <w:tblStylePr w:type="firstRow">
       <w:pPr>
@@ -18773,10 +19691,17 @@
     <w:tblPr>
       <w:tblStyleRowBandSize w:val="1"/>
       <w:tblStyleColBandSize w:val="1"/>
+      <w:tblInd w:w="0" w:type="dxa"/>
       <w:tblBorders>
         <w:top w:val="single" w:sz="18" w:space="0" w:color="auto"/>
         <w:bottom w:val="single" w:sz="18" w:space="0" w:color="auto"/>
       </w:tblBorders>
+      <w:tblCellMar>
+        <w:top w:w="0" w:type="dxa"/>
+        <w:left w:w="108" w:type="dxa"/>
+        <w:bottom w:w="0" w:type="dxa"/>
+        <w:right w:w="108" w:type="dxa"/>
+      </w:tblCellMar>
     </w:tblPr>
     <w:tblStylePr w:type="firstRow">
       <w:pPr>
@@ -18915,10 +19840,17 @@
     <w:tblPr>
       <w:tblStyleRowBandSize w:val="1"/>
       <w:tblStyleColBandSize w:val="1"/>
+      <w:tblInd w:w="0" w:type="dxa"/>
       <w:tblBorders>
         <w:top w:val="single" w:sz="18" w:space="0" w:color="auto"/>
         <w:bottom w:val="single" w:sz="18" w:space="0" w:color="auto"/>
       </w:tblBorders>
+      <w:tblCellMar>
+        <w:top w:w="0" w:type="dxa"/>
+        <w:left w:w="108" w:type="dxa"/>
+        <w:bottom w:w="0" w:type="dxa"/>
+        <w:right w:w="108" w:type="dxa"/>
+      </w:tblCellMar>
     </w:tblPr>
     <w:tblStylePr w:type="firstRow">
       <w:pPr>
@@ -19057,10 +19989,17 @@
     <w:tblPr>
       <w:tblStyleRowBandSize w:val="1"/>
       <w:tblStyleColBandSize w:val="1"/>
+      <w:tblInd w:w="0" w:type="dxa"/>
       <w:tblBorders>
         <w:top w:val="single" w:sz="18" w:space="0" w:color="auto"/>
         <w:bottom w:val="single" w:sz="18" w:space="0" w:color="auto"/>
       </w:tblBorders>
+      <w:tblCellMar>
+        <w:top w:w="0" w:type="dxa"/>
+        <w:left w:w="108" w:type="dxa"/>
+        <w:bottom w:w="0" w:type="dxa"/>
+        <w:right w:w="108" w:type="dxa"/>
+      </w:tblCellMar>
     </w:tblPr>
     <w:tblStylePr w:type="firstRow">
       <w:pPr>
@@ -19202,10 +20141,17 @@
     <w:tblPr>
       <w:tblStyleRowBandSize w:val="1"/>
       <w:tblStyleColBandSize w:val="1"/>
+      <w:tblInd w:w="0" w:type="dxa"/>
       <w:tblBorders>
         <w:top w:val="single" w:sz="8" w:space="0" w:color="000000" w:themeColor="text1"/>
         <w:bottom w:val="single" w:sz="8" w:space="0" w:color="000000" w:themeColor="text1"/>
       </w:tblBorders>
+      <w:tblCellMar>
+        <w:top w:w="0" w:type="dxa"/>
+        <w:left w:w="108" w:type="dxa"/>
+        <w:bottom w:w="0" w:type="dxa"/>
+        <w:right w:w="108" w:type="dxa"/>
+      </w:tblCellMar>
     </w:tblPr>
     <w:tblStylePr w:type="firstRow">
       <w:rPr>
@@ -19279,10 +20225,17 @@
     <w:tblPr>
       <w:tblStyleRowBandSize w:val="1"/>
       <w:tblStyleColBandSize w:val="1"/>
+      <w:tblInd w:w="0" w:type="dxa"/>
       <w:tblBorders>
         <w:top w:val="single" w:sz="8" w:space="0" w:color="4F81BD" w:themeColor="accent1"/>
         <w:bottom w:val="single" w:sz="8" w:space="0" w:color="4F81BD" w:themeColor="accent1"/>
       </w:tblBorders>
+      <w:tblCellMar>
+        <w:top w:w="0" w:type="dxa"/>
+        <w:left w:w="108" w:type="dxa"/>
+        <w:bottom w:w="0" w:type="dxa"/>
+        <w:right w:w="108" w:type="dxa"/>
+      </w:tblCellMar>
     </w:tblPr>
     <w:tblStylePr w:type="firstRow">
       <w:rPr>
@@ -19356,10 +20309,17 @@
     <w:tblPr>
       <w:tblStyleRowBandSize w:val="1"/>
       <w:tblStyleColBandSize w:val="1"/>
+      <w:tblInd w:w="0" w:type="dxa"/>
       <w:tblBorders>
         <w:top w:val="single" w:sz="8" w:space="0" w:color="C0504D" w:themeColor="accent2"/>
         <w:bottom w:val="single" w:sz="8" w:space="0" w:color="C0504D" w:themeColor="accent2"/>
       </w:tblBorders>
+      <w:tblCellMar>
+        <w:top w:w="0" w:type="dxa"/>
+        <w:left w:w="108" w:type="dxa"/>
+        <w:bottom w:w="0" w:type="dxa"/>
+        <w:right w:w="108" w:type="dxa"/>
+      </w:tblCellMar>
     </w:tblPr>
     <w:tblStylePr w:type="firstRow">
       <w:rPr>
@@ -19433,10 +20393,17 @@
     <w:tblPr>
       <w:tblStyleRowBandSize w:val="1"/>
       <w:tblStyleColBandSize w:val="1"/>
+      <w:tblInd w:w="0" w:type="dxa"/>
       <w:tblBorders>
         <w:top w:val="single" w:sz="8" w:space="0" w:color="9BBB59" w:themeColor="accent3"/>
         <w:bottom w:val="single" w:sz="8" w:space="0" w:color="9BBB59" w:themeColor="accent3"/>
       </w:tblBorders>
+      <w:tblCellMar>
+        <w:top w:w="0" w:type="dxa"/>
+        <w:left w:w="108" w:type="dxa"/>
+        <w:bottom w:w="0" w:type="dxa"/>
+        <w:right w:w="108" w:type="dxa"/>
+      </w:tblCellMar>
     </w:tblPr>
     <w:tblStylePr w:type="firstRow">
       <w:rPr>
@@ -19510,10 +20477,17 @@
     <w:tblPr>
       <w:tblStyleRowBandSize w:val="1"/>
       <w:tblStyleColBandSize w:val="1"/>
+      <w:tblInd w:w="0" w:type="dxa"/>
       <w:tblBorders>
         <w:top w:val="single" w:sz="8" w:space="0" w:color="8064A2" w:themeColor="accent4"/>
         <w:bottom w:val="single" w:sz="8" w:space="0" w:color="8064A2" w:themeColor="accent4"/>
       </w:tblBorders>
+      <w:tblCellMar>
+        <w:top w:w="0" w:type="dxa"/>
+        <w:left w:w="108" w:type="dxa"/>
+        <w:bottom w:w="0" w:type="dxa"/>
+        <w:right w:w="108" w:type="dxa"/>
+      </w:tblCellMar>
     </w:tblPr>
     <w:tblStylePr w:type="firstRow">
       <w:rPr>
@@ -19587,10 +20561,17 @@
     <w:tblPr>
       <w:tblStyleRowBandSize w:val="1"/>
       <w:tblStyleColBandSize w:val="1"/>
+      <w:tblInd w:w="0" w:type="dxa"/>
       <w:tblBorders>
         <w:top w:val="single" w:sz="8" w:space="0" w:color="4BACC6" w:themeColor="accent5"/>
         <w:bottom w:val="single" w:sz="8" w:space="0" w:color="4BACC6" w:themeColor="accent5"/>
       </w:tblBorders>
+      <w:tblCellMar>
+        <w:top w:w="0" w:type="dxa"/>
+        <w:left w:w="108" w:type="dxa"/>
+        <w:bottom w:w="0" w:type="dxa"/>
+        <w:right w:w="108" w:type="dxa"/>
+      </w:tblCellMar>
     </w:tblPr>
     <w:tblStylePr w:type="firstRow">
       <w:rPr>
@@ -19664,10 +20645,17 @@
     <w:tblPr>
       <w:tblStyleRowBandSize w:val="1"/>
       <w:tblStyleColBandSize w:val="1"/>
+      <w:tblInd w:w="0" w:type="dxa"/>
       <w:tblBorders>
         <w:top w:val="single" w:sz="8" w:space="0" w:color="F79646" w:themeColor="accent6"/>
         <w:bottom w:val="single" w:sz="8" w:space="0" w:color="F79646" w:themeColor="accent6"/>
       </w:tblBorders>
+      <w:tblCellMar>
+        <w:top w:w="0" w:type="dxa"/>
+        <w:left w:w="108" w:type="dxa"/>
+        <w:bottom w:w="0" w:type="dxa"/>
+        <w:right w:w="108" w:type="dxa"/>
+      </w:tblCellMar>
     </w:tblPr>
     <w:tblStylePr w:type="firstRow">
       <w:rPr>
@@ -19742,12 +20730,19 @@
     <w:tblPr>
       <w:tblStyleRowBandSize w:val="1"/>
       <w:tblStyleColBandSize w:val="1"/>
+      <w:tblInd w:w="0" w:type="dxa"/>
       <w:tblBorders>
         <w:top w:val="single" w:sz="8" w:space="0" w:color="000000" w:themeColor="text1"/>
         <w:left w:val="single" w:sz="8" w:space="0" w:color="000000" w:themeColor="text1"/>
         <w:bottom w:val="single" w:sz="8" w:space="0" w:color="000000" w:themeColor="text1"/>
         <w:right w:val="single" w:sz="8" w:space="0" w:color="000000" w:themeColor="text1"/>
       </w:tblBorders>
+      <w:tblCellMar>
+        <w:top w:w="0" w:type="dxa"/>
+        <w:left w:w="108" w:type="dxa"/>
+        <w:bottom w:w="0" w:type="dxa"/>
+        <w:right w:w="108" w:type="dxa"/>
+      </w:tblCellMar>
     </w:tblPr>
     <w:tblStylePr w:type="firstRow">
       <w:rPr>
@@ -19863,12 +20858,19 @@
     <w:tblPr>
       <w:tblStyleRowBandSize w:val="1"/>
       <w:tblStyleColBandSize w:val="1"/>
+      <w:tblInd w:w="0" w:type="dxa"/>
       <w:tblBorders>
         <w:top w:val="single" w:sz="8" w:space="0" w:color="4F81BD" w:themeColor="accent1"/>
         <w:left w:val="single" w:sz="8" w:space="0" w:color="4F81BD" w:themeColor="accent1"/>
         <w:bottom w:val="single" w:sz="8" w:space="0" w:color="4F81BD" w:themeColor="accent1"/>
         <w:right w:val="single" w:sz="8" w:space="0" w:color="4F81BD" w:themeColor="accent1"/>
       </w:tblBorders>
+      <w:tblCellMar>
+        <w:top w:w="0" w:type="dxa"/>
+        <w:left w:w="108" w:type="dxa"/>
+        <w:bottom w:w="0" w:type="dxa"/>
+        <w:right w:w="108" w:type="dxa"/>
+      </w:tblCellMar>
     </w:tblPr>
     <w:tblStylePr w:type="firstRow">
       <w:rPr>
@@ -19984,12 +20986,19 @@
     <w:tblPr>
       <w:tblStyleRowBandSize w:val="1"/>
       <w:tblStyleColBandSize w:val="1"/>
+      <w:tblInd w:w="0" w:type="dxa"/>
       <w:tblBorders>
         <w:top w:val="single" w:sz="8" w:space="0" w:color="C0504D" w:themeColor="accent2"/>
         <w:left w:val="single" w:sz="8" w:space="0" w:color="C0504D" w:themeColor="accent2"/>
         <w:bottom w:val="single" w:sz="8" w:space="0" w:color="C0504D" w:themeColor="accent2"/>
         <w:right w:val="single" w:sz="8" w:space="0" w:color="C0504D" w:themeColor="accent2"/>
       </w:tblBorders>
+      <w:tblCellMar>
+        <w:top w:w="0" w:type="dxa"/>
+        <w:left w:w="108" w:type="dxa"/>
+        <w:bottom w:w="0" w:type="dxa"/>
+        <w:right w:w="108" w:type="dxa"/>
+      </w:tblCellMar>
     </w:tblPr>
     <w:tblStylePr w:type="firstRow">
       <w:rPr>
@@ -20105,12 +21114,19 @@
     <w:tblPr>
       <w:tblStyleRowBandSize w:val="1"/>
       <w:tblStyleColBandSize w:val="1"/>
+      <w:tblInd w:w="0" w:type="dxa"/>
       <w:tblBorders>
         <w:top w:val="single" w:sz="8" w:space="0" w:color="9BBB59" w:themeColor="accent3"/>
         <w:left w:val="single" w:sz="8" w:space="0" w:color="9BBB59" w:themeColor="accent3"/>
         <w:bottom w:val="single" w:sz="8" w:space="0" w:color="9BBB59" w:themeColor="accent3"/>
         <w:right w:val="single" w:sz="8" w:space="0" w:color="9BBB59" w:themeColor="accent3"/>
       </w:tblBorders>
+      <w:tblCellMar>
+        <w:top w:w="0" w:type="dxa"/>
+        <w:left w:w="108" w:type="dxa"/>
+        <w:bottom w:w="0" w:type="dxa"/>
+        <w:right w:w="108" w:type="dxa"/>
+      </w:tblCellMar>
     </w:tblPr>
     <w:tblStylePr w:type="firstRow">
       <w:rPr>
@@ -20226,12 +21242,19 @@
     <w:tblPr>
       <w:tblStyleRowBandSize w:val="1"/>
       <w:tblStyleColBandSize w:val="1"/>
+      <w:tblInd w:w="0" w:type="dxa"/>
       <w:tblBorders>
         <w:top w:val="single" w:sz="8" w:space="0" w:color="8064A2" w:themeColor="accent4"/>
         <w:left w:val="single" w:sz="8" w:space="0" w:color="8064A2" w:themeColor="accent4"/>
         <w:bottom w:val="single" w:sz="8" w:space="0" w:color="8064A2" w:themeColor="accent4"/>
         <w:right w:val="single" w:sz="8" w:space="0" w:color="8064A2" w:themeColor="accent4"/>
       </w:tblBorders>
+      <w:tblCellMar>
+        <w:top w:w="0" w:type="dxa"/>
+        <w:left w:w="108" w:type="dxa"/>
+        <w:bottom w:w="0" w:type="dxa"/>
+        <w:right w:w="108" w:type="dxa"/>
+      </w:tblCellMar>
     </w:tblPr>
     <w:tblStylePr w:type="firstRow">
       <w:rPr>
@@ -20347,12 +21370,19 @@
     <w:tblPr>
       <w:tblStyleRowBandSize w:val="1"/>
       <w:tblStyleColBandSize w:val="1"/>
+      <w:tblInd w:w="0" w:type="dxa"/>
       <w:tblBorders>
         <w:top w:val="single" w:sz="8" w:space="0" w:color="4BACC6" w:themeColor="accent5"/>
         <w:left w:val="single" w:sz="8" w:space="0" w:color="4BACC6" w:themeColor="accent5"/>
         <w:bottom w:val="single" w:sz="8" w:space="0" w:color="4BACC6" w:themeColor="accent5"/>
         <w:right w:val="single" w:sz="8" w:space="0" w:color="4BACC6" w:themeColor="accent5"/>
       </w:tblBorders>
+      <w:tblCellMar>
+        <w:top w:w="0" w:type="dxa"/>
+        <w:left w:w="108" w:type="dxa"/>
+        <w:bottom w:w="0" w:type="dxa"/>
+        <w:right w:w="108" w:type="dxa"/>
+      </w:tblCellMar>
     </w:tblPr>
     <w:tblStylePr w:type="firstRow">
       <w:rPr>
@@ -20468,12 +21498,19 @@
     <w:tblPr>
       <w:tblStyleRowBandSize w:val="1"/>
       <w:tblStyleColBandSize w:val="1"/>
+      <w:tblInd w:w="0" w:type="dxa"/>
       <w:tblBorders>
         <w:top w:val="single" w:sz="8" w:space="0" w:color="F79646" w:themeColor="accent6"/>
         <w:left w:val="single" w:sz="8" w:space="0" w:color="F79646" w:themeColor="accent6"/>
         <w:bottom w:val="single" w:sz="8" w:space="0" w:color="F79646" w:themeColor="accent6"/>
         <w:right w:val="single" w:sz="8" w:space="0" w:color="F79646" w:themeColor="accent6"/>
       </w:tblBorders>
+      <w:tblCellMar>
+        <w:top w:w="0" w:type="dxa"/>
+        <w:left w:w="108" w:type="dxa"/>
+        <w:bottom w:w="0" w:type="dxa"/>
+        <w:right w:w="108" w:type="dxa"/>
+      </w:tblCellMar>
     </w:tblPr>
     <w:tblStylePr w:type="firstRow">
       <w:rPr>
@@ -20585,6 +21622,7 @@
     <w:tblPr>
       <w:tblStyleRowBandSize w:val="1"/>
       <w:tblStyleColBandSize w:val="1"/>
+      <w:tblInd w:w="0" w:type="dxa"/>
       <w:tblBorders>
         <w:top w:val="single" w:sz="8" w:space="0" w:color="404040" w:themeColor="text1" w:themeTint="BF"/>
         <w:left w:val="single" w:sz="8" w:space="0" w:color="404040" w:themeColor="text1" w:themeTint="BF"/>
@@ -20593,6 +21631,12 @@
         <w:insideH w:val="single" w:sz="8" w:space="0" w:color="404040" w:themeColor="text1" w:themeTint="BF"/>
         <w:insideV w:val="single" w:sz="8" w:space="0" w:color="404040" w:themeColor="text1" w:themeTint="BF"/>
       </w:tblBorders>
+      <w:tblCellMar>
+        <w:top w:w="0" w:type="dxa"/>
+        <w:left w:w="108" w:type="dxa"/>
+        <w:bottom w:w="0" w:type="dxa"/>
+        <w:right w:w="108" w:type="dxa"/>
+      </w:tblCellMar>
     </w:tblPr>
     <w:tcPr>
       <w:shd w:val="clear" w:color="auto" w:fill="C0C0C0" w:themeFill="text1" w:themeFillTint="3F"/>
@@ -20651,6 +21695,7 @@
     <w:tblPr>
       <w:tblStyleRowBandSize w:val="1"/>
       <w:tblStyleColBandSize w:val="1"/>
+      <w:tblInd w:w="0" w:type="dxa"/>
       <w:tblBorders>
         <w:top w:val="single" w:sz="8" w:space="0" w:color="7BA0CD" w:themeColor="accent1" w:themeTint="BF"/>
         <w:left w:val="single" w:sz="8" w:space="0" w:color="7BA0CD" w:themeColor="accent1" w:themeTint="BF"/>
@@ -20659,6 +21704,12 @@
         <w:insideH w:val="single" w:sz="8" w:space="0" w:color="7BA0CD" w:themeColor="accent1" w:themeTint="BF"/>
         <w:insideV w:val="single" w:sz="8" w:space="0" w:color="7BA0CD" w:themeColor="accent1" w:themeTint="BF"/>
       </w:tblBorders>
+      <w:tblCellMar>
+        <w:top w:w="0" w:type="dxa"/>
+        <w:left w:w="108" w:type="dxa"/>
+        <w:bottom w:w="0" w:type="dxa"/>
+        <w:right w:w="108" w:type="dxa"/>
+      </w:tblCellMar>
     </w:tblPr>
     <w:tcPr>
       <w:shd w:val="clear" w:color="auto" w:fill="D3DFEE" w:themeFill="accent1" w:themeFillTint="3F"/>
@@ -20717,6 +21768,7 @@
     <w:tblPr>
       <w:tblStyleRowBandSize w:val="1"/>
       <w:tblStyleColBandSize w:val="1"/>
+      <w:tblInd w:w="0" w:type="dxa"/>
       <w:tblBorders>
         <w:top w:val="single" w:sz="8" w:space="0" w:color="CF7B79" w:themeColor="accent2" w:themeTint="BF"/>
         <w:left w:val="single" w:sz="8" w:space="0" w:color="CF7B79" w:themeColor="accent2" w:themeTint="BF"/>
@@ -20725,6 +21777,12 @@
         <w:insideH w:val="single" w:sz="8" w:space="0" w:color="CF7B79" w:themeColor="accent2" w:themeTint="BF"/>
         <w:insideV w:val="single" w:sz="8" w:space="0" w:color="CF7B79" w:themeColor="accent2" w:themeTint="BF"/>
       </w:tblBorders>
+      <w:tblCellMar>
+        <w:top w:w="0" w:type="dxa"/>
+        <w:left w:w="108" w:type="dxa"/>
+        <w:bottom w:w="0" w:type="dxa"/>
+        <w:right w:w="108" w:type="dxa"/>
+      </w:tblCellMar>
     </w:tblPr>
     <w:tcPr>
       <w:shd w:val="clear" w:color="auto" w:fill="EFD3D2" w:themeFill="accent2" w:themeFillTint="3F"/>
@@ -20783,6 +21841,7 @@
     <w:tblPr>
       <w:tblStyleRowBandSize w:val="1"/>
       <w:tblStyleColBandSize w:val="1"/>
+      <w:tblInd w:w="0" w:type="dxa"/>
       <w:tblBorders>
         <w:top w:val="single" w:sz="8" w:space="0" w:color="B3CC82" w:themeColor="accent3" w:themeTint="BF"/>
         <w:left w:val="single" w:sz="8" w:space="0" w:color="B3CC82" w:themeColor="accent3" w:themeTint="BF"/>
@@ -20791,6 +21850,12 @@
         <w:insideH w:val="single" w:sz="8" w:space="0" w:color="B3CC82" w:themeColor="accent3" w:themeTint="BF"/>
         <w:insideV w:val="single" w:sz="8" w:space="0" w:color="B3CC82" w:themeColor="accent3" w:themeTint="BF"/>
       </w:tblBorders>
+      <w:tblCellMar>
+        <w:top w:w="0" w:type="dxa"/>
+        <w:left w:w="108" w:type="dxa"/>
+        <w:bottom w:w="0" w:type="dxa"/>
+        <w:right w:w="108" w:type="dxa"/>
+      </w:tblCellMar>
     </w:tblPr>
     <w:tcPr>
       <w:shd w:val="clear" w:color="auto" w:fill="E6EED5" w:themeFill="accent3" w:themeFillTint="3F"/>
@@ -20849,6 +21914,7 @@
     <w:tblPr>
       <w:tblStyleRowBandSize w:val="1"/>
       <w:tblStyleColBandSize w:val="1"/>
+      <w:tblInd w:w="0" w:type="dxa"/>
       <w:tblBorders>
         <w:top w:val="single" w:sz="8" w:space="0" w:color="9F8AB9" w:themeColor="accent4" w:themeTint="BF"/>
         <w:left w:val="single" w:sz="8" w:space="0" w:color="9F8AB9" w:themeColor="accent4" w:themeTint="BF"/>
@@ -20857,6 +21923,12 @@
         <w:insideH w:val="single" w:sz="8" w:space="0" w:color="9F8AB9" w:themeColor="accent4" w:themeTint="BF"/>
         <w:insideV w:val="single" w:sz="8" w:space="0" w:color="9F8AB9" w:themeColor="accent4" w:themeTint="BF"/>
       </w:tblBorders>
+      <w:tblCellMar>
+        <w:top w:w="0" w:type="dxa"/>
+        <w:left w:w="108" w:type="dxa"/>
+        <w:bottom w:w="0" w:type="dxa"/>
+        <w:right w:w="108" w:type="dxa"/>
+      </w:tblCellMar>
     </w:tblPr>
     <w:tcPr>
       <w:shd w:val="clear" w:color="auto" w:fill="DFD8E8" w:themeFill="accent4" w:themeFillTint="3F"/>
@@ -20915,6 +21987,7 @@
     <w:tblPr>
       <w:tblStyleRowBandSize w:val="1"/>
       <w:tblStyleColBandSize w:val="1"/>
+      <w:tblInd w:w="0" w:type="dxa"/>
       <w:tblBorders>
         <w:top w:val="single" w:sz="8" w:space="0" w:color="78C0D4" w:themeColor="accent5" w:themeTint="BF"/>
         <w:left w:val="single" w:sz="8" w:space="0" w:color="78C0D4" w:themeColor="accent5" w:themeTint="BF"/>
@@ -20923,6 +21996,12 @@
         <w:insideH w:val="single" w:sz="8" w:space="0" w:color="78C0D4" w:themeColor="accent5" w:themeTint="BF"/>
         <w:insideV w:val="single" w:sz="8" w:space="0" w:color="78C0D4" w:themeColor="accent5" w:themeTint="BF"/>
       </w:tblBorders>
+      <w:tblCellMar>
+        <w:top w:w="0" w:type="dxa"/>
+        <w:left w:w="108" w:type="dxa"/>
+        <w:bottom w:w="0" w:type="dxa"/>
+        <w:right w:w="108" w:type="dxa"/>
+      </w:tblCellMar>
     </w:tblPr>
     <w:tcPr>
       <w:shd w:val="clear" w:color="auto" w:fill="D2EAF1" w:themeFill="accent5" w:themeFillTint="3F"/>
@@ -20981,6 +22060,7 @@
     <w:tblPr>
       <w:tblStyleRowBandSize w:val="1"/>
       <w:tblStyleColBandSize w:val="1"/>
+      <w:tblInd w:w="0" w:type="dxa"/>
       <w:tblBorders>
         <w:top w:val="single" w:sz="8" w:space="0" w:color="F9B074" w:themeColor="accent6" w:themeTint="BF"/>
         <w:left w:val="single" w:sz="8" w:space="0" w:color="F9B074" w:themeColor="accent6" w:themeTint="BF"/>
@@ -20989,6 +22069,12 @@
         <w:insideH w:val="single" w:sz="8" w:space="0" w:color="F9B074" w:themeColor="accent6" w:themeTint="BF"/>
         <w:insideV w:val="single" w:sz="8" w:space="0" w:color="F9B074" w:themeColor="accent6" w:themeTint="BF"/>
       </w:tblBorders>
+      <w:tblCellMar>
+        <w:top w:w="0" w:type="dxa"/>
+        <w:left w:w="108" w:type="dxa"/>
+        <w:bottom w:w="0" w:type="dxa"/>
+        <w:right w:w="108" w:type="dxa"/>
+      </w:tblCellMar>
     </w:tblPr>
     <w:tcPr>
       <w:shd w:val="clear" w:color="auto" w:fill="FDE4D0" w:themeFill="accent6" w:themeFillTint="3F"/>
@@ -21051,6 +22137,7 @@
     <w:tblPr>
       <w:tblStyleRowBandSize w:val="1"/>
       <w:tblStyleColBandSize w:val="1"/>
+      <w:tblInd w:w="0" w:type="dxa"/>
       <w:tblBorders>
         <w:top w:val="single" w:sz="8" w:space="0" w:color="000000" w:themeColor="text1"/>
         <w:left w:val="single" w:sz="8" w:space="0" w:color="000000" w:themeColor="text1"/>
@@ -21059,6 +22146,12 @@
         <w:insideH w:val="single" w:sz="8" w:space="0" w:color="000000" w:themeColor="text1"/>
         <w:insideV w:val="single" w:sz="8" w:space="0" w:color="000000" w:themeColor="text1"/>
       </w:tblBorders>
+      <w:tblCellMar>
+        <w:top w:w="0" w:type="dxa"/>
+        <w:left w:w="108" w:type="dxa"/>
+        <w:bottom w:w="0" w:type="dxa"/>
+        <w:right w:w="108" w:type="dxa"/>
+      </w:tblCellMar>
     </w:tblPr>
     <w:tcPr>
       <w:shd w:val="clear" w:color="auto" w:fill="C0C0C0" w:themeFill="text1" w:themeFillTint="3F"/>
@@ -21169,6 +22262,7 @@
     <w:tblPr>
       <w:tblStyleRowBandSize w:val="1"/>
       <w:tblStyleColBandSize w:val="1"/>
+      <w:tblInd w:w="0" w:type="dxa"/>
       <w:tblBorders>
         <w:top w:val="single" w:sz="8" w:space="0" w:color="4F81BD" w:themeColor="accent1"/>
         <w:left w:val="single" w:sz="8" w:space="0" w:color="4F81BD" w:themeColor="accent1"/>
@@ -21177,6 +22271,12 @@
         <w:insideH w:val="single" w:sz="8" w:space="0" w:color="4F81BD" w:themeColor="accent1"/>
         <w:insideV w:val="single" w:sz="8" w:space="0" w:color="4F81BD" w:themeColor="accent1"/>
       </w:tblBorders>
+      <w:tblCellMar>
+        <w:top w:w="0" w:type="dxa"/>
+        <w:left w:w="108" w:type="dxa"/>
+        <w:bottom w:w="0" w:type="dxa"/>
+        <w:right w:w="108" w:type="dxa"/>
+      </w:tblCellMar>
     </w:tblPr>
     <w:tcPr>
       <w:shd w:val="clear" w:color="auto" w:fill="D3DFEE" w:themeFill="accent1" w:themeFillTint="3F"/>
@@ -21287,6 +22387,7 @@
     <w:tblPr>
       <w:tblStyleRowBandSize w:val="1"/>
       <w:tblStyleColBandSize w:val="1"/>
+      <w:tblInd w:w="0" w:type="dxa"/>
       <w:tblBorders>
         <w:top w:val="single" w:sz="8" w:space="0" w:color="C0504D" w:themeColor="accent2"/>
         <w:left w:val="single" w:sz="8" w:space="0" w:color="C0504D" w:themeColor="accent2"/>
@@ -21295,6 +22396,12 @@
         <w:insideH w:val="single" w:sz="8" w:space="0" w:color="C0504D" w:themeColor="accent2"/>
         <w:insideV w:val="single" w:sz="8" w:space="0" w:color="C0504D" w:themeColor="accent2"/>
       </w:tblBorders>
+      <w:tblCellMar>
+        <w:top w:w="0" w:type="dxa"/>
+        <w:left w:w="108" w:type="dxa"/>
+        <w:bottom w:w="0" w:type="dxa"/>
+        <w:right w:w="108" w:type="dxa"/>
+      </w:tblCellMar>
     </w:tblPr>
     <w:tcPr>
       <w:shd w:val="clear" w:color="auto" w:fill="EFD3D2" w:themeFill="accent2" w:themeFillTint="3F"/>
@@ -21405,6 +22512,7 @@
     <w:tblPr>
       <w:tblStyleRowBandSize w:val="1"/>
       <w:tblStyleColBandSize w:val="1"/>
+      <w:tblInd w:w="0" w:type="dxa"/>
       <w:tblBorders>
         <w:top w:val="single" w:sz="8" w:space="0" w:color="9BBB59" w:themeColor="accent3"/>
         <w:left w:val="single" w:sz="8" w:space="0" w:color="9BBB59" w:themeColor="accent3"/>
@@ -21413,6 +22521,12 @@
         <w:insideH w:val="single" w:sz="8" w:space="0" w:color="9BBB59" w:themeColor="accent3"/>
         <w:insideV w:val="single" w:sz="8" w:space="0" w:color="9BBB59" w:themeColor="accent3"/>
       </w:tblBorders>
+      <w:tblCellMar>
+        <w:top w:w="0" w:type="dxa"/>
+        <w:left w:w="108" w:type="dxa"/>
+        <w:bottom w:w="0" w:type="dxa"/>
+        <w:right w:w="108" w:type="dxa"/>
+      </w:tblCellMar>
     </w:tblPr>
     <w:tcPr>
       <w:shd w:val="clear" w:color="auto" w:fill="E6EED5" w:themeFill="accent3" w:themeFillTint="3F"/>
@@ -21523,6 +22637,7 @@
     <w:tblPr>
       <w:tblStyleRowBandSize w:val="1"/>
       <w:tblStyleColBandSize w:val="1"/>
+      <w:tblInd w:w="0" w:type="dxa"/>
       <w:tblBorders>
         <w:top w:val="single" w:sz="8" w:space="0" w:color="8064A2" w:themeColor="accent4"/>
         <w:left w:val="single" w:sz="8" w:space="0" w:color="8064A2" w:themeColor="accent4"/>
@@ -21531,6 +22646,12 @@
         <w:insideH w:val="single" w:sz="8" w:space="0" w:color="8064A2" w:themeColor="accent4"/>
         <w:insideV w:val="single" w:sz="8" w:space="0" w:color="8064A2" w:themeColor="accent4"/>
       </w:tblBorders>
+      <w:tblCellMar>
+        <w:top w:w="0" w:type="dxa"/>
+        <w:left w:w="108" w:type="dxa"/>
+        <w:bottom w:w="0" w:type="dxa"/>
+        <w:right w:w="108" w:type="dxa"/>
+      </w:tblCellMar>
     </w:tblPr>
     <w:tcPr>
       <w:shd w:val="clear" w:color="auto" w:fill="DFD8E8" w:themeFill="accent4" w:themeFillTint="3F"/>
@@ -21641,6 +22762,7 @@
     <w:tblPr>
       <w:tblStyleRowBandSize w:val="1"/>
       <w:tblStyleColBandSize w:val="1"/>
+      <w:tblInd w:w="0" w:type="dxa"/>
       <w:tblBorders>
         <w:top w:val="single" w:sz="8" w:space="0" w:color="4BACC6" w:themeColor="accent5"/>
         <w:left w:val="single" w:sz="8" w:space="0" w:color="4BACC6" w:themeColor="accent5"/>
@@ -21649,6 +22771,12 @@
         <w:insideH w:val="single" w:sz="8" w:space="0" w:color="4BACC6" w:themeColor="accent5"/>
         <w:insideV w:val="single" w:sz="8" w:space="0" w:color="4BACC6" w:themeColor="accent5"/>
       </w:tblBorders>
+      <w:tblCellMar>
+        <w:top w:w="0" w:type="dxa"/>
+        <w:left w:w="108" w:type="dxa"/>
+        <w:bottom w:w="0" w:type="dxa"/>
+        <w:right w:w="108" w:type="dxa"/>
+      </w:tblCellMar>
     </w:tblPr>
     <w:tcPr>
       <w:shd w:val="clear" w:color="auto" w:fill="D2EAF1" w:themeFill="accent5" w:themeFillTint="3F"/>
@@ -21759,6 +22887,7 @@
     <w:tblPr>
       <w:tblStyleRowBandSize w:val="1"/>
       <w:tblStyleColBandSize w:val="1"/>
+      <w:tblInd w:w="0" w:type="dxa"/>
       <w:tblBorders>
         <w:top w:val="single" w:sz="8" w:space="0" w:color="F79646" w:themeColor="accent6"/>
         <w:left w:val="single" w:sz="8" w:space="0" w:color="F79646" w:themeColor="accent6"/>
@@ -21767,6 +22896,12 @@
         <w:insideH w:val="single" w:sz="8" w:space="0" w:color="F79646" w:themeColor="accent6"/>
         <w:insideV w:val="single" w:sz="8" w:space="0" w:color="F79646" w:themeColor="accent6"/>
       </w:tblBorders>
+      <w:tblCellMar>
+        <w:top w:w="0" w:type="dxa"/>
+        <w:left w:w="108" w:type="dxa"/>
+        <w:bottom w:w="0" w:type="dxa"/>
+        <w:right w:w="108" w:type="dxa"/>
+      </w:tblCellMar>
     </w:tblPr>
     <w:tcPr>
       <w:shd w:val="clear" w:color="auto" w:fill="FDE4D0" w:themeFill="accent6" w:themeFillTint="3F"/>
@@ -21873,6 +23008,7 @@
     <w:tblPr>
       <w:tblStyleRowBandSize w:val="1"/>
       <w:tblStyleColBandSize w:val="1"/>
+      <w:tblInd w:w="0" w:type="dxa"/>
       <w:tblBorders>
         <w:top w:val="single" w:sz="8" w:space="0" w:color="FFFFFF" w:themeColor="background1"/>
         <w:left w:val="single" w:sz="8" w:space="0" w:color="FFFFFF" w:themeColor="background1"/>
@@ -21881,6 +23017,12 @@
         <w:insideH w:val="single" w:sz="6" w:space="0" w:color="FFFFFF" w:themeColor="background1"/>
         <w:insideV w:val="single" w:sz="6" w:space="0" w:color="FFFFFF" w:themeColor="background1"/>
       </w:tblBorders>
+      <w:tblCellMar>
+        <w:top w:w="0" w:type="dxa"/>
+        <w:left w:w="108" w:type="dxa"/>
+        <w:bottom w:w="0" w:type="dxa"/>
+        <w:right w:w="108" w:type="dxa"/>
+      </w:tblCellMar>
     </w:tblPr>
     <w:tcPr>
       <w:shd w:val="clear" w:color="auto" w:fill="C0C0C0" w:themeFill="text1" w:themeFillTint="3F"/>
@@ -22007,6 +23149,7 @@
     <w:tblPr>
       <w:tblStyleRowBandSize w:val="1"/>
       <w:tblStyleColBandSize w:val="1"/>
+      <w:tblInd w:w="0" w:type="dxa"/>
       <w:tblBorders>
         <w:top w:val="single" w:sz="8" w:space="0" w:color="FFFFFF" w:themeColor="background1"/>
         <w:left w:val="single" w:sz="8" w:space="0" w:color="FFFFFF" w:themeColor="background1"/>
@@ -22015,6 +23158,12 @@
         <w:insideH w:val="single" w:sz="6" w:space="0" w:color="FFFFFF" w:themeColor="background1"/>
         <w:insideV w:val="single" w:sz="6" w:space="0" w:color="FFFFFF" w:themeColor="background1"/>
       </w:tblBorders>
+      <w:tblCellMar>
+        <w:top w:w="0" w:type="dxa"/>
+        <w:left w:w="108" w:type="dxa"/>
+        <w:bottom w:w="0" w:type="dxa"/>
+        <w:right w:w="108" w:type="dxa"/>
+      </w:tblCellMar>
     </w:tblPr>
     <w:tcPr>
       <w:shd w:val="clear" w:color="auto" w:fill="D3DFEE" w:themeFill="accent1" w:themeFillTint="3F"/>
@@ -22141,6 +23290,7 @@
     <w:tblPr>
       <w:tblStyleRowBandSize w:val="1"/>
       <w:tblStyleColBandSize w:val="1"/>
+      <w:tblInd w:w="0" w:type="dxa"/>
       <w:tblBorders>
         <w:top w:val="single" w:sz="8" w:space="0" w:color="FFFFFF" w:themeColor="background1"/>
         <w:left w:val="single" w:sz="8" w:space="0" w:color="FFFFFF" w:themeColor="background1"/>
@@ -22149,6 +23299,12 @@
         <w:insideH w:val="single" w:sz="6" w:space="0" w:color="FFFFFF" w:themeColor="background1"/>
         <w:insideV w:val="single" w:sz="6" w:space="0" w:color="FFFFFF" w:themeColor="background1"/>
       </w:tblBorders>
+      <w:tblCellMar>
+        <w:top w:w="0" w:type="dxa"/>
+        <w:left w:w="108" w:type="dxa"/>
+        <w:bottom w:w="0" w:type="dxa"/>
+        <w:right w:w="108" w:type="dxa"/>
+      </w:tblCellMar>
     </w:tblPr>
     <w:tcPr>
       <w:shd w:val="clear" w:color="auto" w:fill="EFD3D2" w:themeFill="accent2" w:themeFillTint="3F"/>
@@ -22275,6 +23431,7 @@
     <w:tblPr>
       <w:tblStyleRowBandSize w:val="1"/>
       <w:tblStyleColBandSize w:val="1"/>
+      <w:tblInd w:w="0" w:type="dxa"/>
       <w:tblBorders>
         <w:top w:val="single" w:sz="8" w:space="0" w:color="FFFFFF" w:themeColor="background1"/>
         <w:left w:val="single" w:sz="8" w:space="0" w:color="FFFFFF" w:themeColor="background1"/>
@@ -22283,6 +23440,12 @@
         <w:insideH w:val="single" w:sz="6" w:space="0" w:color="FFFFFF" w:themeColor="background1"/>
         <w:insideV w:val="single" w:sz="6" w:space="0" w:color="FFFFFF" w:themeColor="background1"/>
       </w:tblBorders>
+      <w:tblCellMar>
+        <w:top w:w="0" w:type="dxa"/>
+        <w:left w:w="108" w:type="dxa"/>
+        <w:bottom w:w="0" w:type="dxa"/>
+        <w:right w:w="108" w:type="dxa"/>
+      </w:tblCellMar>
     </w:tblPr>
     <w:tcPr>
       <w:shd w:val="clear" w:color="auto" w:fill="E6EED5" w:themeFill="accent3" w:themeFillTint="3F"/>
@@ -22409,6 +23572,7 @@
     <w:tblPr>
       <w:tblStyleRowBandSize w:val="1"/>
       <w:tblStyleColBandSize w:val="1"/>
+      <w:tblInd w:w="0" w:type="dxa"/>
       <w:tblBorders>
         <w:top w:val="single" w:sz="8" w:space="0" w:color="FFFFFF" w:themeColor="background1"/>
         <w:left w:val="single" w:sz="8" w:space="0" w:color="FFFFFF" w:themeColor="background1"/>
@@ -22417,6 +23581,12 @@
         <w:insideH w:val="single" w:sz="6" w:space="0" w:color="FFFFFF" w:themeColor="background1"/>
         <w:insideV w:val="single" w:sz="6" w:space="0" w:color="FFFFFF" w:themeColor="background1"/>
       </w:tblBorders>
+      <w:tblCellMar>
+        <w:top w:w="0" w:type="dxa"/>
+        <w:left w:w="108" w:type="dxa"/>
+        <w:bottom w:w="0" w:type="dxa"/>
+        <w:right w:w="108" w:type="dxa"/>
+      </w:tblCellMar>
     </w:tblPr>
     <w:tcPr>
       <w:shd w:val="clear" w:color="auto" w:fill="DFD8E8" w:themeFill="accent4" w:themeFillTint="3F"/>
@@ -22543,6 +23713,7 @@
     <w:tblPr>
       <w:tblStyleRowBandSize w:val="1"/>
       <w:tblStyleColBandSize w:val="1"/>
+      <w:tblInd w:w="0" w:type="dxa"/>
       <w:tblBorders>
         <w:top w:val="single" w:sz="8" w:space="0" w:color="FFFFFF" w:themeColor="background1"/>
         <w:left w:val="single" w:sz="8" w:space="0" w:color="FFFFFF" w:themeColor="background1"/>
@@ -22551,6 +23722,12 @@
         <w:insideH w:val="single" w:sz="6" w:space="0" w:color="FFFFFF" w:themeColor="background1"/>
         <w:insideV w:val="single" w:sz="6" w:space="0" w:color="FFFFFF" w:themeColor="background1"/>
       </w:tblBorders>
+      <w:tblCellMar>
+        <w:top w:w="0" w:type="dxa"/>
+        <w:left w:w="108" w:type="dxa"/>
+        <w:bottom w:w="0" w:type="dxa"/>
+        <w:right w:w="108" w:type="dxa"/>
+      </w:tblCellMar>
     </w:tblPr>
     <w:tcPr>
       <w:shd w:val="clear" w:color="auto" w:fill="D2EAF1" w:themeFill="accent5" w:themeFillTint="3F"/>
@@ -22677,6 +23854,7 @@
     <w:tblPr>
       <w:tblStyleRowBandSize w:val="1"/>
       <w:tblStyleColBandSize w:val="1"/>
+      <w:tblInd w:w="0" w:type="dxa"/>
       <w:tblBorders>
         <w:top w:val="single" w:sz="8" w:space="0" w:color="FFFFFF" w:themeColor="background1"/>
         <w:left w:val="single" w:sz="8" w:space="0" w:color="FFFFFF" w:themeColor="background1"/>
@@ -22685,6 +23863,12 @@
         <w:insideH w:val="single" w:sz="6" w:space="0" w:color="FFFFFF" w:themeColor="background1"/>
         <w:insideV w:val="single" w:sz="6" w:space="0" w:color="FFFFFF" w:themeColor="background1"/>
       </w:tblBorders>
+      <w:tblCellMar>
+        <w:top w:w="0" w:type="dxa"/>
+        <w:left w:w="108" w:type="dxa"/>
+        <w:bottom w:w="0" w:type="dxa"/>
+        <w:right w:w="108" w:type="dxa"/>
+      </w:tblCellMar>
     </w:tblPr>
     <w:tcPr>
       <w:shd w:val="clear" w:color="auto" w:fill="FDE4D0" w:themeFill="accent6" w:themeFillTint="3F"/>
@@ -22814,6 +23998,13 @@
     <w:tblPr>
       <w:tblStyleRowBandSize w:val="1"/>
       <w:tblStyleColBandSize w:val="1"/>
+      <w:tblInd w:w="0" w:type="dxa"/>
+      <w:tblCellMar>
+        <w:top w:w="0" w:type="dxa"/>
+        <w:left w:w="108" w:type="dxa"/>
+        <w:bottom w:w="0" w:type="dxa"/>
+        <w:right w:w="108" w:type="dxa"/>
+      </w:tblCellMar>
     </w:tblPr>
     <w:tcPr>
       <w:shd w:val="clear" w:color="auto" w:fill="000000" w:themeFill="text1"/>
@@ -22921,6 +24112,13 @@
     <w:tblPr>
       <w:tblStyleRowBandSize w:val="1"/>
       <w:tblStyleColBandSize w:val="1"/>
+      <w:tblInd w:w="0" w:type="dxa"/>
+      <w:tblCellMar>
+        <w:top w:w="0" w:type="dxa"/>
+        <w:left w:w="108" w:type="dxa"/>
+        <w:bottom w:w="0" w:type="dxa"/>
+        <w:right w:w="108" w:type="dxa"/>
+      </w:tblCellMar>
     </w:tblPr>
     <w:tcPr>
       <w:shd w:val="clear" w:color="auto" w:fill="4F81BD" w:themeFill="accent1"/>
@@ -23028,6 +24226,13 @@
     <w:tblPr>
       <w:tblStyleRowBandSize w:val="1"/>
       <w:tblStyleColBandSize w:val="1"/>
+      <w:tblInd w:w="0" w:type="dxa"/>
+      <w:tblCellMar>
+        <w:top w:w="0" w:type="dxa"/>
+        <w:left w:w="108" w:type="dxa"/>
+        <w:bottom w:w="0" w:type="dxa"/>
+        <w:right w:w="108" w:type="dxa"/>
+      </w:tblCellMar>
     </w:tblPr>
     <w:tcPr>
       <w:shd w:val="clear" w:color="auto" w:fill="C0504D" w:themeFill="accent2"/>
@@ -23135,6 +24340,13 @@
     <w:tblPr>
       <w:tblStyleRowBandSize w:val="1"/>
       <w:tblStyleColBandSize w:val="1"/>
+      <w:tblInd w:w="0" w:type="dxa"/>
+      <w:tblCellMar>
+        <w:top w:w="0" w:type="dxa"/>
+        <w:left w:w="108" w:type="dxa"/>
+        <w:bottom w:w="0" w:type="dxa"/>
+        <w:right w:w="108" w:type="dxa"/>
+      </w:tblCellMar>
     </w:tblPr>
     <w:tcPr>
       <w:shd w:val="clear" w:color="auto" w:fill="9BBB59" w:themeFill="accent3"/>
@@ -23242,6 +24454,13 @@
     <w:tblPr>
       <w:tblStyleRowBandSize w:val="1"/>
       <w:tblStyleColBandSize w:val="1"/>
+      <w:tblInd w:w="0" w:type="dxa"/>
+      <w:tblCellMar>
+        <w:top w:w="0" w:type="dxa"/>
+        <w:left w:w="108" w:type="dxa"/>
+        <w:bottom w:w="0" w:type="dxa"/>
+        <w:right w:w="108" w:type="dxa"/>
+      </w:tblCellMar>
     </w:tblPr>
     <w:tcPr>
       <w:shd w:val="clear" w:color="auto" w:fill="8064A2" w:themeFill="accent4"/>
@@ -23349,6 +24568,13 @@
     <w:tblPr>
       <w:tblStyleRowBandSize w:val="1"/>
       <w:tblStyleColBandSize w:val="1"/>
+      <w:tblInd w:w="0" w:type="dxa"/>
+      <w:tblCellMar>
+        <w:top w:w="0" w:type="dxa"/>
+        <w:left w:w="108" w:type="dxa"/>
+        <w:bottom w:w="0" w:type="dxa"/>
+        <w:right w:w="108" w:type="dxa"/>
+      </w:tblCellMar>
     </w:tblPr>
     <w:tcPr>
       <w:shd w:val="clear" w:color="auto" w:fill="4BACC6" w:themeFill="accent5"/>
@@ -23456,6 +24682,13 @@
     <w:tblPr>
       <w:tblStyleRowBandSize w:val="1"/>
       <w:tblStyleColBandSize w:val="1"/>
+      <w:tblInd w:w="0" w:type="dxa"/>
+      <w:tblCellMar>
+        <w:top w:w="0" w:type="dxa"/>
+        <w:left w:w="108" w:type="dxa"/>
+        <w:bottom w:w="0" w:type="dxa"/>
+        <w:right w:w="108" w:type="dxa"/>
+      </w:tblCellMar>
     </w:tblPr>
     <w:tcPr>
       <w:shd w:val="clear" w:color="auto" w:fill="F79646" w:themeFill="accent6"/>
@@ -23563,6 +24796,7 @@
     <w:tblPr>
       <w:tblStyleRowBandSize w:val="1"/>
       <w:tblStyleColBandSize w:val="1"/>
+      <w:tblInd w:w="0" w:type="dxa"/>
       <w:tblBorders>
         <w:top w:val="single" w:sz="24" w:space="0" w:color="C0504D" w:themeColor="accent2"/>
         <w:left w:val="single" w:sz="4" w:space="0" w:color="000000" w:themeColor="text1"/>
@@ -23571,6 +24805,12 @@
         <w:insideH w:val="single" w:sz="4" w:space="0" w:color="FFFFFF" w:themeColor="background1"/>
         <w:insideV w:val="single" w:sz="4" w:space="0" w:color="FFFFFF" w:themeColor="background1"/>
       </w:tblBorders>
+      <w:tblCellMar>
+        <w:top w:w="0" w:type="dxa"/>
+        <w:left w:w="108" w:type="dxa"/>
+        <w:bottom w:w="0" w:type="dxa"/>
+        <w:right w:w="108" w:type="dxa"/>
+      </w:tblCellMar>
     </w:tblPr>
     <w:tcPr>
       <w:shd w:val="clear" w:color="auto" w:fill="E6E6E6" w:themeFill="text1" w:themeFillTint="19"/>
@@ -23678,6 +24918,7 @@
     <w:tblPr>
       <w:tblStyleRowBandSize w:val="1"/>
       <w:tblStyleColBandSize w:val="1"/>
+      <w:tblInd w:w="0" w:type="dxa"/>
       <w:tblBorders>
         <w:top w:val="single" w:sz="24" w:space="0" w:color="C0504D" w:themeColor="accent2"/>
         <w:left w:val="single" w:sz="4" w:space="0" w:color="4F81BD" w:themeColor="accent1"/>
@@ -23686,6 +24927,12 @@
         <w:insideH w:val="single" w:sz="4" w:space="0" w:color="FFFFFF" w:themeColor="background1"/>
         <w:insideV w:val="single" w:sz="4" w:space="0" w:color="FFFFFF" w:themeColor="background1"/>
       </w:tblBorders>
+      <w:tblCellMar>
+        <w:top w:w="0" w:type="dxa"/>
+        <w:left w:w="108" w:type="dxa"/>
+        <w:bottom w:w="0" w:type="dxa"/>
+        <w:right w:w="108" w:type="dxa"/>
+      </w:tblCellMar>
     </w:tblPr>
     <w:tcPr>
       <w:shd w:val="clear" w:color="auto" w:fill="EDF2F8" w:themeFill="accent1" w:themeFillTint="19"/>
@@ -23793,6 +25040,7 @@
     <w:tblPr>
       <w:tblStyleRowBandSize w:val="1"/>
       <w:tblStyleColBandSize w:val="1"/>
+      <w:tblInd w:w="0" w:type="dxa"/>
       <w:tblBorders>
         <w:top w:val="single" w:sz="24" w:space="0" w:color="C0504D" w:themeColor="accent2"/>
         <w:left w:val="single" w:sz="4" w:space="0" w:color="C0504D" w:themeColor="accent2"/>
@@ -23801,6 +25049,12 @@
         <w:insideH w:val="single" w:sz="4" w:space="0" w:color="FFFFFF" w:themeColor="background1"/>
         <w:insideV w:val="single" w:sz="4" w:space="0" w:color="FFFFFF" w:themeColor="background1"/>
       </w:tblBorders>
+      <w:tblCellMar>
+        <w:top w:w="0" w:type="dxa"/>
+        <w:left w:w="108" w:type="dxa"/>
+        <w:bottom w:w="0" w:type="dxa"/>
+        <w:right w:w="108" w:type="dxa"/>
+      </w:tblCellMar>
     </w:tblPr>
     <w:tcPr>
       <w:shd w:val="clear" w:color="auto" w:fill="F8EDED" w:themeFill="accent2" w:themeFillTint="19"/>
@@ -23908,6 +25162,7 @@
     <w:tblPr>
       <w:tblStyleRowBandSize w:val="1"/>
       <w:tblStyleColBandSize w:val="1"/>
+      <w:tblInd w:w="0" w:type="dxa"/>
       <w:tblBorders>
         <w:top w:val="single" w:sz="24" w:space="0" w:color="8064A2" w:themeColor="accent4"/>
         <w:left w:val="single" w:sz="4" w:space="0" w:color="9BBB59" w:themeColor="accent3"/>
@@ -23916,6 +25171,12 @@
         <w:insideH w:val="single" w:sz="4" w:space="0" w:color="FFFFFF" w:themeColor="background1"/>
         <w:insideV w:val="single" w:sz="4" w:space="0" w:color="FFFFFF" w:themeColor="background1"/>
       </w:tblBorders>
+      <w:tblCellMar>
+        <w:top w:w="0" w:type="dxa"/>
+        <w:left w:w="108" w:type="dxa"/>
+        <w:bottom w:w="0" w:type="dxa"/>
+        <w:right w:w="108" w:type="dxa"/>
+      </w:tblCellMar>
     </w:tblPr>
     <w:tcPr>
       <w:shd w:val="clear" w:color="auto" w:fill="F5F8EE" w:themeFill="accent3" w:themeFillTint="19"/>
@@ -24013,6 +25274,7 @@
     <w:tblPr>
       <w:tblStyleRowBandSize w:val="1"/>
       <w:tblStyleColBandSize w:val="1"/>
+      <w:tblInd w:w="0" w:type="dxa"/>
       <w:tblBorders>
         <w:top w:val="single" w:sz="24" w:space="0" w:color="9BBB59" w:themeColor="accent3"/>
         <w:left w:val="single" w:sz="4" w:space="0" w:color="8064A2" w:themeColor="accent4"/>
@@ -24021,6 +25283,12 @@
         <w:insideH w:val="single" w:sz="4" w:space="0" w:color="FFFFFF" w:themeColor="background1"/>
         <w:insideV w:val="single" w:sz="4" w:space="0" w:color="FFFFFF" w:themeColor="background1"/>
       </w:tblBorders>
+      <w:tblCellMar>
+        <w:top w:w="0" w:type="dxa"/>
+        <w:left w:w="108" w:type="dxa"/>
+        <w:bottom w:w="0" w:type="dxa"/>
+        <w:right w:w="108" w:type="dxa"/>
+      </w:tblCellMar>
     </w:tblPr>
     <w:tcPr>
       <w:shd w:val="clear" w:color="auto" w:fill="F2EFF6" w:themeFill="accent4" w:themeFillTint="19"/>
@@ -24128,6 +25396,7 @@
     <w:tblPr>
       <w:tblStyleRowBandSize w:val="1"/>
       <w:tblStyleColBandSize w:val="1"/>
+      <w:tblInd w:w="0" w:type="dxa"/>
       <w:tblBorders>
         <w:top w:val="single" w:sz="24" w:space="0" w:color="F79646" w:themeColor="accent6"/>
         <w:left w:val="single" w:sz="4" w:space="0" w:color="4BACC6" w:themeColor="accent5"/>
@@ -24136,6 +25405,12 @@
         <w:insideH w:val="single" w:sz="4" w:space="0" w:color="FFFFFF" w:themeColor="background1"/>
         <w:insideV w:val="single" w:sz="4" w:space="0" w:color="FFFFFF" w:themeColor="background1"/>
       </w:tblBorders>
+      <w:tblCellMar>
+        <w:top w:w="0" w:type="dxa"/>
+        <w:left w:w="108" w:type="dxa"/>
+        <w:bottom w:w="0" w:type="dxa"/>
+        <w:right w:w="108" w:type="dxa"/>
+      </w:tblCellMar>
     </w:tblPr>
     <w:tcPr>
       <w:shd w:val="clear" w:color="auto" w:fill="EDF6F9" w:themeFill="accent5" w:themeFillTint="19"/>
@@ -24243,6 +25518,7 @@
     <w:tblPr>
       <w:tblStyleRowBandSize w:val="1"/>
       <w:tblStyleColBandSize w:val="1"/>
+      <w:tblInd w:w="0" w:type="dxa"/>
       <w:tblBorders>
         <w:top w:val="single" w:sz="24" w:space="0" w:color="4BACC6" w:themeColor="accent5"/>
         <w:left w:val="single" w:sz="4" w:space="0" w:color="F79646" w:themeColor="accent6"/>
@@ -24251,6 +25527,12 @@
         <w:insideH w:val="single" w:sz="4" w:space="0" w:color="FFFFFF" w:themeColor="background1"/>
         <w:insideV w:val="single" w:sz="4" w:space="0" w:color="FFFFFF" w:themeColor="background1"/>
       </w:tblBorders>
+      <w:tblCellMar>
+        <w:top w:w="0" w:type="dxa"/>
+        <w:left w:w="108" w:type="dxa"/>
+        <w:bottom w:w="0" w:type="dxa"/>
+        <w:right w:w="108" w:type="dxa"/>
+      </w:tblCellMar>
     </w:tblPr>
     <w:tcPr>
       <w:shd w:val="clear" w:color="auto" w:fill="FEF4EC" w:themeFill="accent6" w:themeFillTint="19"/>
@@ -24358,6 +25640,13 @@
     <w:tblPr>
       <w:tblStyleRowBandSize w:val="1"/>
       <w:tblStyleColBandSize w:val="1"/>
+      <w:tblInd w:w="0" w:type="dxa"/>
+      <w:tblCellMar>
+        <w:top w:w="0" w:type="dxa"/>
+        <w:left w:w="108" w:type="dxa"/>
+        <w:bottom w:w="0" w:type="dxa"/>
+        <w:right w:w="108" w:type="dxa"/>
+      </w:tblCellMar>
     </w:tblPr>
     <w:tcPr>
       <w:shd w:val="clear" w:color="auto" w:fill="E6E6E6" w:themeFill="text1" w:themeFillTint="19"/>
@@ -24437,6 +25726,13 @@
     <w:tblPr>
       <w:tblStyleRowBandSize w:val="1"/>
       <w:tblStyleColBandSize w:val="1"/>
+      <w:tblInd w:w="0" w:type="dxa"/>
+      <w:tblCellMar>
+        <w:top w:w="0" w:type="dxa"/>
+        <w:left w:w="108" w:type="dxa"/>
+        <w:bottom w:w="0" w:type="dxa"/>
+        <w:right w:w="108" w:type="dxa"/>
+      </w:tblCellMar>
     </w:tblPr>
     <w:tcPr>
       <w:shd w:val="clear" w:color="auto" w:fill="EDF2F8" w:themeFill="accent1" w:themeFillTint="19"/>
@@ -24516,6 +25812,13 @@
     <w:tblPr>
       <w:tblStyleRowBandSize w:val="1"/>
       <w:tblStyleColBandSize w:val="1"/>
+      <w:tblInd w:w="0" w:type="dxa"/>
+      <w:tblCellMar>
+        <w:top w:w="0" w:type="dxa"/>
+        <w:left w:w="108" w:type="dxa"/>
+        <w:bottom w:w="0" w:type="dxa"/>
+        <w:right w:w="108" w:type="dxa"/>
+      </w:tblCellMar>
     </w:tblPr>
     <w:tcPr>
       <w:shd w:val="clear" w:color="auto" w:fill="F8EDED" w:themeFill="accent2" w:themeFillTint="19"/>
@@ -24595,6 +25898,13 @@
     <w:tblPr>
       <w:tblStyleRowBandSize w:val="1"/>
       <w:tblStyleColBandSize w:val="1"/>
+      <w:tblInd w:w="0" w:type="dxa"/>
+      <w:tblCellMar>
+        <w:top w:w="0" w:type="dxa"/>
+        <w:left w:w="108" w:type="dxa"/>
+        <w:bottom w:w="0" w:type="dxa"/>
+        <w:right w:w="108" w:type="dxa"/>
+      </w:tblCellMar>
     </w:tblPr>
     <w:tcPr>
       <w:shd w:val="clear" w:color="auto" w:fill="F5F8EE" w:themeFill="accent3" w:themeFillTint="19"/>
@@ -24674,6 +25984,13 @@
     <w:tblPr>
       <w:tblStyleRowBandSize w:val="1"/>
       <w:tblStyleColBandSize w:val="1"/>
+      <w:tblInd w:w="0" w:type="dxa"/>
+      <w:tblCellMar>
+        <w:top w:w="0" w:type="dxa"/>
+        <w:left w:w="108" w:type="dxa"/>
+        <w:bottom w:w="0" w:type="dxa"/>
+        <w:right w:w="108" w:type="dxa"/>
+      </w:tblCellMar>
     </w:tblPr>
     <w:tcPr>
       <w:shd w:val="clear" w:color="auto" w:fill="F2EFF6" w:themeFill="accent4" w:themeFillTint="19"/>
@@ -24753,6 +26070,13 @@
     <w:tblPr>
       <w:tblStyleRowBandSize w:val="1"/>
       <w:tblStyleColBandSize w:val="1"/>
+      <w:tblInd w:w="0" w:type="dxa"/>
+      <w:tblCellMar>
+        <w:top w:w="0" w:type="dxa"/>
+        <w:left w:w="108" w:type="dxa"/>
+        <w:bottom w:w="0" w:type="dxa"/>
+        <w:right w:w="108" w:type="dxa"/>
+      </w:tblCellMar>
     </w:tblPr>
     <w:tcPr>
       <w:shd w:val="clear" w:color="auto" w:fill="EDF6F9" w:themeFill="accent5" w:themeFillTint="19"/>
@@ -24832,6 +26156,13 @@
     <w:tblPr>
       <w:tblStyleRowBandSize w:val="1"/>
       <w:tblStyleColBandSize w:val="1"/>
+      <w:tblInd w:w="0" w:type="dxa"/>
+      <w:tblCellMar>
+        <w:top w:w="0" w:type="dxa"/>
+        <w:left w:w="108" w:type="dxa"/>
+        <w:bottom w:w="0" w:type="dxa"/>
+        <w:right w:w="108" w:type="dxa"/>
+      </w:tblCellMar>
     </w:tblPr>
     <w:tcPr>
       <w:shd w:val="clear" w:color="auto" w:fill="FEF4EC" w:themeFill="accent6" w:themeFillTint="19"/>
@@ -24911,9 +26242,16 @@
     <w:tblPr>
       <w:tblStyleRowBandSize w:val="1"/>
       <w:tblStyleColBandSize w:val="1"/>
+      <w:tblInd w:w="0" w:type="dxa"/>
       <w:tblBorders>
         <w:insideH w:val="single" w:sz="4" w:space="0" w:color="FFFFFF" w:themeColor="background1"/>
       </w:tblBorders>
+      <w:tblCellMar>
+        <w:top w:w="0" w:type="dxa"/>
+        <w:left w:w="108" w:type="dxa"/>
+        <w:bottom w:w="0" w:type="dxa"/>
+        <w:right w:w="108" w:type="dxa"/>
+      </w:tblCellMar>
     </w:tblPr>
     <w:tcPr>
       <w:shd w:val="clear" w:color="auto" w:fill="CCCCCC" w:themeFill="text1" w:themeFillTint="33"/>
@@ -24984,9 +26322,16 @@
     <w:tblPr>
       <w:tblStyleRowBandSize w:val="1"/>
       <w:tblStyleColBandSize w:val="1"/>
+      <w:tblInd w:w="0" w:type="dxa"/>
       <w:tblBorders>
         <w:insideH w:val="single" w:sz="4" w:space="0" w:color="FFFFFF" w:themeColor="background1"/>
       </w:tblBorders>
+      <w:tblCellMar>
+        <w:top w:w="0" w:type="dxa"/>
+        <w:left w:w="108" w:type="dxa"/>
+        <w:bottom w:w="0" w:type="dxa"/>
+        <w:right w:w="108" w:type="dxa"/>
+      </w:tblCellMar>
     </w:tblPr>
     <w:tcPr>
       <w:shd w:val="clear" w:color="auto" w:fill="DBE5F1" w:themeFill="accent1" w:themeFillTint="33"/>
@@ -25057,9 +26402,16 @@
     <w:tblPr>
       <w:tblStyleRowBandSize w:val="1"/>
       <w:tblStyleColBandSize w:val="1"/>
+      <w:tblInd w:w="0" w:type="dxa"/>
       <w:tblBorders>
         <w:insideH w:val="single" w:sz="4" w:space="0" w:color="FFFFFF" w:themeColor="background1"/>
       </w:tblBorders>
+      <w:tblCellMar>
+        <w:top w:w="0" w:type="dxa"/>
+        <w:left w:w="108" w:type="dxa"/>
+        <w:bottom w:w="0" w:type="dxa"/>
+        <w:right w:w="108" w:type="dxa"/>
+      </w:tblCellMar>
     </w:tblPr>
     <w:tcPr>
       <w:shd w:val="clear" w:color="auto" w:fill="F2DBDB" w:themeFill="accent2" w:themeFillTint="33"/>
@@ -25130,9 +26482,16 @@
     <w:tblPr>
       <w:tblStyleRowBandSize w:val="1"/>
       <w:tblStyleColBandSize w:val="1"/>
+      <w:tblInd w:w="0" w:type="dxa"/>
       <w:tblBorders>
         <w:insideH w:val="single" w:sz="4" w:space="0" w:color="FFFFFF" w:themeColor="background1"/>
       </w:tblBorders>
+      <w:tblCellMar>
+        <w:top w:w="0" w:type="dxa"/>
+        <w:left w:w="108" w:type="dxa"/>
+        <w:bottom w:w="0" w:type="dxa"/>
+        <w:right w:w="108" w:type="dxa"/>
+      </w:tblCellMar>
     </w:tblPr>
     <w:tcPr>
       <w:shd w:val="clear" w:color="auto" w:fill="EAF1DD" w:themeFill="accent3" w:themeFillTint="33"/>
@@ -25203,9 +26562,16 @@
     <w:tblPr>
       <w:tblStyleRowBandSize w:val="1"/>
       <w:tblStyleColBandSize w:val="1"/>
+      <w:tblInd w:w="0" w:type="dxa"/>
       <w:tblBorders>
         <w:insideH w:val="single" w:sz="4" w:space="0" w:color="FFFFFF" w:themeColor="background1"/>
       </w:tblBorders>
+      <w:tblCellMar>
+        <w:top w:w="0" w:type="dxa"/>
+        <w:left w:w="108" w:type="dxa"/>
+        <w:bottom w:w="0" w:type="dxa"/>
+        <w:right w:w="108" w:type="dxa"/>
+      </w:tblCellMar>
     </w:tblPr>
     <w:tcPr>
       <w:shd w:val="clear" w:color="auto" w:fill="E5DFEC" w:themeFill="accent4" w:themeFillTint="33"/>
@@ -25276,9 +26642,16 @@
     <w:tblPr>
       <w:tblStyleRowBandSize w:val="1"/>
       <w:tblStyleColBandSize w:val="1"/>
+      <w:tblInd w:w="0" w:type="dxa"/>
       <w:tblBorders>
         <w:insideH w:val="single" w:sz="4" w:space="0" w:color="FFFFFF" w:themeColor="background1"/>
       </w:tblBorders>
+      <w:tblCellMar>
+        <w:top w:w="0" w:type="dxa"/>
+        <w:left w:w="108" w:type="dxa"/>
+        <w:bottom w:w="0" w:type="dxa"/>
+        <w:right w:w="108" w:type="dxa"/>
+      </w:tblCellMar>
     </w:tblPr>
     <w:tcPr>
       <w:shd w:val="clear" w:color="auto" w:fill="DAEEF3" w:themeFill="accent5" w:themeFillTint="33"/>
@@ -25349,9 +26722,16 @@
     <w:tblPr>
       <w:tblStyleRowBandSize w:val="1"/>
       <w:tblStyleColBandSize w:val="1"/>
+      <w:tblInd w:w="0" w:type="dxa"/>
       <w:tblBorders>
         <w:insideH w:val="single" w:sz="4" w:space="0" w:color="FFFFFF" w:themeColor="background1"/>
       </w:tblBorders>
+      <w:tblCellMar>
+        <w:top w:w="0" w:type="dxa"/>
+        <w:left w:w="108" w:type="dxa"/>
+        <w:bottom w:w="0" w:type="dxa"/>
+        <w:right w:w="108" w:type="dxa"/>
+      </w:tblCellMar>
     </w:tblPr>
     <w:tcPr>
       <w:shd w:val="clear" w:color="auto" w:fill="FDE9D9" w:themeFill="accent6" w:themeFillTint="33"/>
@@ -25766,7 +27146,7 @@
 </file>
 
 <file path=customXml/itemProps1.xml><?xml version="1.0" encoding="utf-8"?>
-<ds:datastoreItem xmlns:ds="http://schemas.openxmlformats.org/officeDocument/2006/customXml" ds:itemID="{B5695737-2BAF-4BE5-BEC6-BAA6A81A4DBB}">
+<ds:datastoreItem xmlns:ds="http://schemas.openxmlformats.org/officeDocument/2006/customXml" ds:itemID="{1711EF13-53F0-4444-9723-A3AF12B65E74}">
   <ds:schemaRefs>
     <ds:schemaRef ds:uri="http://schemas.openxmlformats.org/officeDocument/2006/bibliography"/>
   </ds:schemaRefs>

</xml_diff>

<commit_message>
add verifier in cert
</commit_message>
<xml_diff>
--- a/storage/app/templates/cert_template.docx
+++ b/storage/app/templates/cert_template.docx
@@ -1042,17 +1042,7 @@
           <w:sz w:val="20"/>
           <w:lang w:val="ru-RU"/>
         </w:rPr>
-        <w:t>, Государственна</w:t>
-      </w:r>
-      <w:bookmarkStart w:id="0" w:name="_GoBack"/>
-      <w:bookmarkEnd w:id="0"/>
-      <w:r>
-        <w:rPr>
-          <w:b/>
-          <w:sz w:val="20"/>
-          <w:lang w:val="ru-RU"/>
-        </w:rPr>
-        <w:t>я система обеспечения единства измерений Республики Казахстан.</w:t>
+        <w:t>, Государственная система обеспечения единства измерений Республики Казахстан.</w:t>
       </w:r>
       <w:r>
         <w:rPr>
@@ -2434,29 +2424,21 @@
                 <w:lang w:val="ru-RU"/>
               </w:rPr>
             </w:pPr>
-            <w:proofErr w:type="spellStart"/>
             <w:r>
               <w:rPr>
                 <w:b/>
                 <w:sz w:val="20"/>
               </w:rPr>
-              <w:t>Карабаев</w:t>
+              <w:t>${verifier</w:t>
             </w:r>
-            <w:proofErr w:type="spellEnd"/>
+            <w:bookmarkStart w:id="0" w:name="_GoBack"/>
+            <w:bookmarkEnd w:id="0"/>
             <w:r>
               <w:rPr>
                 <w:b/>
                 <w:sz w:val="20"/>
               </w:rPr>
-              <w:t xml:space="preserve"> А.</w:t>
-            </w:r>
-            <w:r>
-              <w:rPr>
-                <w:b/>
-                <w:sz w:val="20"/>
-                <w:lang w:val="ru-RU"/>
-              </w:rPr>
-              <w:t xml:space="preserve"> </w:t>
+              <w:t>}</w:t>
             </w:r>
           </w:p>
           <w:p>
@@ -27147,7 +27129,7 @@
 </file>
 
 <file path=customXml/itemProps1.xml><?xml version="1.0" encoding="utf-8"?>
-<ds:datastoreItem xmlns:ds="http://schemas.openxmlformats.org/officeDocument/2006/customXml" ds:itemID="{6976ABCA-916D-4B4F-A91A-D62B8EBCB7E1}">
+<ds:datastoreItem xmlns:ds="http://schemas.openxmlformats.org/officeDocument/2006/customXml" ds:itemID="{BFA5820A-9C6C-4712-BB11-75E1F3B8DC00}">
   <ds:schemaRefs>
     <ds:schemaRef ds:uri="http://schemas.openxmlformats.org/officeDocument/2006/bibliography"/>
   </ds:schemaRefs>

</xml_diff>